<commit_message>
feat: :sparkles: Changes Testing Report
</commit_message>
<xml_diff>
--- a/reports/Student #3/Testing report Student#3.docx
+++ b/reports/Student #3/Testing report Student#3.docx
@@ -4,6 +4,12 @@
   <w:body>
     <w:sdt>
       <w:sdtPr>
+        <w:rPr>
+          <w:rFonts w:eastAsiaTheme="minorHAnsi"/>
+          <w:kern w:val="2"/>
+          <w:lang w:eastAsia="en-US"/>
+          <w14:ligatures w14:val="standardContextual"/>
+        </w:rPr>
         <w:id w:val="208456338"/>
         <w:docPartObj>
           <w:docPartGallery w:val="Cover Pages"/>
@@ -170,7 +176,7 @@
                                           <w:sz w:val="28"/>
                                           <w:szCs w:val="28"/>
                                         </w:rPr>
-                                        <w:t>26-05-2025</w:t>
+                                        <w:t>26-5-2025</w:t>
                                       </w:r>
                                     </w:p>
                                   </w:sdtContent>
@@ -3482,7 +3488,7 @@
                                     <w:sz w:val="28"/>
                                     <w:szCs w:val="28"/>
                                   </w:rPr>
-                                  <w:t>26-05-2025</w:t>
+                                  <w:t>26-5-2025</w:t>
                                 </w:r>
                               </w:p>
                             </w:sdtContent>
@@ -4117,7 +4123,7 @@
       <w:pPr>
         <w:pStyle w:val="Ttulo1"/>
       </w:pPr>
-      <w:bookmarkStart w:id="0" w:name="_Toc199172524"/>
+      <w:bookmarkStart w:id="0" w:name="_Toc199173314"/>
       <w:r>
         <w:lastRenderedPageBreak/>
         <w:t>ÍNDICE</w:t>
@@ -4126,6 +4132,15 @@
     </w:p>
     <w:sdt>
       <w:sdtPr>
+        <w:rPr>
+          <w:rFonts w:asciiTheme="minorHAnsi" w:eastAsiaTheme="minorHAnsi" w:hAnsiTheme="minorHAnsi" w:cstheme="minorBidi"/>
+          <w:color w:val="auto"/>
+          <w:kern w:val="2"/>
+          <w:sz w:val="22"/>
+          <w:szCs w:val="22"/>
+          <w:lang w:eastAsia="en-US"/>
+          <w14:ligatures w14:val="standardContextual"/>
+        </w:rPr>
         <w:id w:val="-24407599"/>
         <w:docPartObj>
           <w:docPartGallery w:val="Table of Contents"/>
@@ -4134,15 +4149,8 @@
       </w:sdtPr>
       <w:sdtEndPr>
         <w:rPr>
-          <w:rFonts w:asciiTheme="minorHAnsi" w:eastAsiaTheme="minorHAnsi" w:hAnsiTheme="minorHAnsi" w:cstheme="minorBidi"/>
           <w:b/>
           <w:bCs/>
-          <w:color w:val="auto"/>
-          <w:kern w:val="2"/>
-          <w:sz w:val="22"/>
-          <w:szCs w:val="22"/>
-          <w:lang w:eastAsia="en-US"/>
-          <w14:ligatures w14:val="standardContextual"/>
         </w:rPr>
       </w:sdtEndPr>
       <w:sdtContent>
@@ -4177,7 +4185,7 @@
           <w:r>
             <w:fldChar w:fldCharType="separate"/>
           </w:r>
-          <w:hyperlink w:anchor="_Toc199172524" w:history="1">
+          <w:hyperlink w:anchor="_Toc199173314" w:history="1">
             <w:r>
               <w:rPr>
                 <w:rStyle w:val="Hipervnculo"/>
@@ -4204,7 +4212,7 @@
                 <w:noProof/>
                 <w:webHidden/>
               </w:rPr>
-              <w:instrText xml:space="preserve"> PAGEREF _Toc199172524 \h </w:instrText>
+              <w:instrText xml:space="preserve"> PAGEREF _Toc199173314 \h </w:instrText>
             </w:r>
             <w:r>
               <w:rPr>
@@ -4249,7 +4257,7 @@
               <w:lang w:eastAsia="es-ES"/>
             </w:rPr>
           </w:pPr>
-          <w:hyperlink w:anchor="_Toc199172525" w:history="1">
+          <w:hyperlink w:anchor="_Toc199173315" w:history="1">
             <w:r>
               <w:rPr>
                 <w:rStyle w:val="Hipervnculo"/>
@@ -4276,7 +4284,7 @@
                 <w:noProof/>
                 <w:webHidden/>
               </w:rPr>
-              <w:instrText xml:space="preserve"> PAGEREF _Toc199172525 \h </w:instrText>
+              <w:instrText xml:space="preserve"> PAGEREF _Toc199173315 \h </w:instrText>
             </w:r>
             <w:r>
               <w:rPr>
@@ -4321,7 +4329,7 @@
               <w:lang w:eastAsia="es-ES"/>
             </w:rPr>
           </w:pPr>
-          <w:hyperlink w:anchor="_Toc199172526" w:history="1">
+          <w:hyperlink w:anchor="_Toc199173316" w:history="1">
             <w:r>
               <w:rPr>
                 <w:rStyle w:val="Hipervnculo"/>
@@ -4348,7 +4356,7 @@
                 <w:noProof/>
                 <w:webHidden/>
               </w:rPr>
-              <w:instrText xml:space="preserve"> PAGEREF _Toc199172526 \h </w:instrText>
+              <w:instrText xml:space="preserve"> PAGEREF _Toc199173316 \h </w:instrText>
             </w:r>
             <w:r>
               <w:rPr>
@@ -4393,7 +4401,7 @@
               <w:lang w:eastAsia="es-ES"/>
             </w:rPr>
           </w:pPr>
-          <w:hyperlink w:anchor="_Toc199172527" w:history="1">
+          <w:hyperlink w:anchor="_Toc199173317" w:history="1">
             <w:r>
               <w:rPr>
                 <w:rStyle w:val="Hipervnculo"/>
@@ -4420,7 +4428,7 @@
                 <w:noProof/>
                 <w:webHidden/>
               </w:rPr>
-              <w:instrText xml:space="preserve"> PAGEREF _Toc199172527 \h </w:instrText>
+              <w:instrText xml:space="preserve"> PAGEREF _Toc199173317 \h </w:instrText>
             </w:r>
             <w:r>
               <w:rPr>
@@ -4465,7 +4473,7 @@
               <w:lang w:eastAsia="es-ES"/>
             </w:rPr>
           </w:pPr>
-          <w:hyperlink w:anchor="_Toc199172528" w:history="1">
+          <w:hyperlink w:anchor="_Toc199173318" w:history="1">
             <w:r>
               <w:rPr>
                 <w:rStyle w:val="Hipervnculo"/>
@@ -4492,7 +4500,7 @@
                 <w:noProof/>
                 <w:webHidden/>
               </w:rPr>
-              <w:instrText xml:space="preserve"> PAGEREF _Toc199172528 \h </w:instrText>
+              <w:instrText xml:space="preserve"> PAGEREF _Toc199173318 \h </w:instrText>
             </w:r>
             <w:r>
               <w:rPr>
@@ -4537,7 +4545,7 @@
               <w:lang w:eastAsia="es-ES"/>
             </w:rPr>
           </w:pPr>
-          <w:hyperlink w:anchor="_Toc199172529" w:history="1">
+          <w:hyperlink w:anchor="_Toc199173319" w:history="1">
             <w:r>
               <w:rPr>
                 <w:rStyle w:val="Hipervnculo"/>
@@ -4564,7 +4572,7 @@
                 <w:noProof/>
                 <w:webHidden/>
               </w:rPr>
-              <w:instrText xml:space="preserve"> PAGEREF _Toc199172529 \h </w:instrText>
+              <w:instrText xml:space="preserve"> PAGEREF _Toc199173319 \h </w:instrText>
             </w:r>
             <w:r>
               <w:rPr>
@@ -4584,7 +4592,7 @@
                 <w:noProof/>
                 <w:webHidden/>
               </w:rPr>
-              <w:t>5</w:t>
+              <w:t>4</w:t>
             </w:r>
             <w:r>
               <w:rPr>
@@ -4609,7 +4617,7 @@
               <w:lang w:eastAsia="es-ES"/>
             </w:rPr>
           </w:pPr>
-          <w:hyperlink w:anchor="_Toc199172530" w:history="1">
+          <w:hyperlink w:anchor="_Toc199173320" w:history="1">
             <w:r>
               <w:rPr>
                 <w:rStyle w:val="Hipervnculo"/>
@@ -4636,7 +4644,7 @@
                 <w:noProof/>
                 <w:webHidden/>
               </w:rPr>
-              <w:instrText xml:space="preserve"> PAGEREF _Toc199172530 \h </w:instrText>
+              <w:instrText xml:space="preserve"> PAGEREF _Toc199173320 \h </w:instrText>
             </w:r>
             <w:r>
               <w:rPr>
@@ -4656,7 +4664,7 @@
                 <w:noProof/>
                 <w:webHidden/>
               </w:rPr>
-              <w:t>5</w:t>
+              <w:t>4</w:t>
             </w:r>
             <w:r>
               <w:rPr>
@@ -4681,7 +4689,7 @@
               <w:lang w:eastAsia="es-ES"/>
             </w:rPr>
           </w:pPr>
-          <w:hyperlink w:anchor="_Toc199172531" w:history="1">
+          <w:hyperlink w:anchor="_Toc199173321" w:history="1">
             <w:r>
               <w:rPr>
                 <w:rStyle w:val="Hipervnculo"/>
@@ -4708,7 +4716,7 @@
                 <w:noProof/>
                 <w:webHidden/>
               </w:rPr>
-              <w:instrText xml:space="preserve"> PAGEREF _Toc199172531 \h </w:instrText>
+              <w:instrText xml:space="preserve"> PAGEREF _Toc199173321 \h </w:instrText>
             </w:r>
             <w:r>
               <w:rPr>
@@ -4753,7 +4761,7 @@
               <w:lang w:eastAsia="es-ES"/>
             </w:rPr>
           </w:pPr>
-          <w:hyperlink w:anchor="_Toc199172532" w:history="1">
+          <w:hyperlink w:anchor="_Toc199173322" w:history="1">
             <w:r>
               <w:rPr>
                 <w:rStyle w:val="Hipervnculo"/>
@@ -4780,7 +4788,7 @@
                 <w:noProof/>
                 <w:webHidden/>
               </w:rPr>
-              <w:instrText xml:space="preserve"> PAGEREF _Toc199172532 \h </w:instrText>
+              <w:instrText xml:space="preserve"> PAGEREF _Toc199173322 \h </w:instrText>
             </w:r>
             <w:r>
               <w:rPr>
@@ -4825,7 +4833,7 @@
               <w:lang w:eastAsia="es-ES"/>
             </w:rPr>
           </w:pPr>
-          <w:hyperlink w:anchor="_Toc199172533" w:history="1">
+          <w:hyperlink w:anchor="_Toc199173323" w:history="1">
             <w:r>
               <w:rPr>
                 <w:rStyle w:val="Hipervnculo"/>
@@ -4852,7 +4860,7 @@
                 <w:noProof/>
                 <w:webHidden/>
               </w:rPr>
-              <w:instrText xml:space="preserve"> PAGEREF _Toc199172533 \h </w:instrText>
+              <w:instrText xml:space="preserve"> PAGEREF _Toc199173323 \h </w:instrText>
             </w:r>
             <w:r>
               <w:rPr>
@@ -4872,7 +4880,7 @@
                 <w:noProof/>
                 <w:webHidden/>
               </w:rPr>
-              <w:t>12</w:t>
+              <w:t>11</w:t>
             </w:r>
             <w:r>
               <w:rPr>
@@ -4897,7 +4905,7 @@
               <w:lang w:eastAsia="es-ES"/>
             </w:rPr>
           </w:pPr>
-          <w:hyperlink w:anchor="_Toc199172534" w:history="1">
+          <w:hyperlink w:anchor="_Toc199173324" w:history="1">
             <w:r>
               <w:rPr>
                 <w:rStyle w:val="Hipervnculo"/>
@@ -4924,7 +4932,7 @@
                 <w:noProof/>
                 <w:webHidden/>
               </w:rPr>
-              <w:instrText xml:space="preserve"> PAGEREF _Toc199172534 \h </w:instrText>
+              <w:instrText xml:space="preserve"> PAGEREF _Toc199173324 \h </w:instrText>
             </w:r>
             <w:r>
               <w:rPr>
@@ -4944,7 +4952,7 @@
                 <w:noProof/>
                 <w:webHidden/>
               </w:rPr>
-              <w:t>12</w:t>
+              <w:t>11</w:t>
             </w:r>
             <w:r>
               <w:rPr>
@@ -4969,7 +4977,7 @@
               <w:lang w:eastAsia="es-ES"/>
             </w:rPr>
           </w:pPr>
-          <w:hyperlink w:anchor="_Toc199172535" w:history="1">
+          <w:hyperlink w:anchor="_Toc199173325" w:history="1">
             <w:r>
               <w:rPr>
                 <w:rStyle w:val="Hipervnculo"/>
@@ -4996,7 +5004,7 @@
                 <w:noProof/>
                 <w:webHidden/>
               </w:rPr>
-              <w:instrText xml:space="preserve"> PAGEREF _Toc199172535 \h </w:instrText>
+              <w:instrText xml:space="preserve"> PAGEREF _Toc199173325 \h </w:instrText>
             </w:r>
             <w:r>
               <w:rPr>
@@ -5041,7 +5049,7 @@
               <w:lang w:eastAsia="es-ES"/>
             </w:rPr>
           </w:pPr>
-          <w:hyperlink w:anchor="_Toc199172536" w:history="1">
+          <w:hyperlink w:anchor="_Toc199173326" w:history="1">
             <w:r>
               <w:rPr>
                 <w:rStyle w:val="Hipervnculo"/>
@@ -5068,7 +5076,7 @@
                 <w:noProof/>
                 <w:webHidden/>
               </w:rPr>
-              <w:instrText xml:space="preserve"> PAGEREF _Toc199172536 \h </w:instrText>
+              <w:instrText xml:space="preserve"> PAGEREF _Toc199173326 \h </w:instrText>
             </w:r>
             <w:r>
               <w:rPr>
@@ -5088,7 +5096,7 @@
                 <w:noProof/>
                 <w:webHidden/>
               </w:rPr>
-              <w:t>15</w:t>
+              <w:t>14</w:t>
             </w:r>
             <w:r>
               <w:rPr>
@@ -5113,7 +5121,7 @@
               <w:lang w:eastAsia="es-ES"/>
             </w:rPr>
           </w:pPr>
-          <w:hyperlink w:anchor="_Toc199172537" w:history="1">
+          <w:hyperlink w:anchor="_Toc199173327" w:history="1">
             <w:r>
               <w:rPr>
                 <w:rStyle w:val="Hipervnculo"/>
@@ -5140,7 +5148,7 @@
                 <w:noProof/>
                 <w:webHidden/>
               </w:rPr>
-              <w:instrText xml:space="preserve"> PAGEREF _Toc199172537 \h </w:instrText>
+              <w:instrText xml:space="preserve"> PAGEREF _Toc199173327 \h </w:instrText>
             </w:r>
             <w:r>
               <w:rPr>
@@ -5160,7 +5168,7 @@
                 <w:noProof/>
                 <w:webHidden/>
               </w:rPr>
-              <w:t>16</w:t>
+              <w:t>15</w:t>
             </w:r>
             <w:r>
               <w:rPr>
@@ -5185,7 +5193,7 @@
               <w:lang w:eastAsia="es-ES"/>
             </w:rPr>
           </w:pPr>
-          <w:hyperlink w:anchor="_Toc199172538" w:history="1">
+          <w:hyperlink w:anchor="_Toc199173328" w:history="1">
             <w:r>
               <w:rPr>
                 <w:rStyle w:val="Hipervnculo"/>
@@ -5212,7 +5220,7 @@
                 <w:noProof/>
                 <w:webHidden/>
               </w:rPr>
-              <w:instrText xml:space="preserve"> PAGEREF _Toc199172538 \h </w:instrText>
+              <w:instrText xml:space="preserve"> PAGEREF _Toc199173328 \h </w:instrText>
             </w:r>
             <w:r>
               <w:rPr>
@@ -5232,7 +5240,7 @@
                 <w:noProof/>
                 <w:webHidden/>
               </w:rPr>
-              <w:t>16</w:t>
+              <w:t>15</w:t>
             </w:r>
             <w:r>
               <w:rPr>
@@ -5257,7 +5265,7 @@
               <w:lang w:eastAsia="es-ES"/>
             </w:rPr>
           </w:pPr>
-          <w:hyperlink w:anchor="_Toc199172539" w:history="1">
+          <w:hyperlink w:anchor="_Toc199173329" w:history="1">
             <w:r>
               <w:rPr>
                 <w:rStyle w:val="Hipervnculo"/>
@@ -5284,7 +5292,7 @@
                 <w:noProof/>
                 <w:webHidden/>
               </w:rPr>
-              <w:instrText xml:space="preserve"> PAGEREF _Toc199172539 \h </w:instrText>
+              <w:instrText xml:space="preserve"> PAGEREF _Toc199173329 \h </w:instrText>
             </w:r>
             <w:r>
               <w:rPr>
@@ -5304,7 +5312,7 @@
                 <w:noProof/>
                 <w:webHidden/>
               </w:rPr>
-              <w:t>16</w:t>
+              <w:t>15</w:t>
             </w:r>
             <w:r>
               <w:rPr>
@@ -5329,7 +5337,7 @@
               <w:lang w:eastAsia="es-ES"/>
             </w:rPr>
           </w:pPr>
-          <w:hyperlink w:anchor="_Toc199172540" w:history="1">
+          <w:hyperlink w:anchor="_Toc199173330" w:history="1">
             <w:r>
               <w:rPr>
                 <w:rStyle w:val="Hipervnculo"/>
@@ -5356,7 +5364,7 @@
                 <w:noProof/>
                 <w:webHidden/>
               </w:rPr>
-              <w:instrText xml:space="preserve"> PAGEREF _Toc199172540 \h </w:instrText>
+              <w:instrText xml:space="preserve"> PAGEREF _Toc199173330 \h </w:instrText>
             </w:r>
             <w:r>
               <w:rPr>
@@ -5376,7 +5384,7 @@
                 <w:noProof/>
                 <w:webHidden/>
               </w:rPr>
-              <w:t>17</w:t>
+              <w:t>16</w:t>
             </w:r>
             <w:r>
               <w:rPr>
@@ -5401,7 +5409,7 @@
               <w:lang w:eastAsia="es-ES"/>
             </w:rPr>
           </w:pPr>
-          <w:hyperlink w:anchor="_Toc199172541" w:history="1">
+          <w:hyperlink w:anchor="_Toc199173331" w:history="1">
             <w:r>
               <w:rPr>
                 <w:rStyle w:val="Hipervnculo"/>
@@ -5428,7 +5436,7 @@
                 <w:noProof/>
                 <w:webHidden/>
               </w:rPr>
-              <w:instrText xml:space="preserve"> PAGEREF _Toc199172541 \h </w:instrText>
+              <w:instrText xml:space="preserve"> PAGEREF _Toc199173331 \h </w:instrText>
             </w:r>
             <w:r>
               <w:rPr>
@@ -5448,7 +5456,7 @@
                 <w:noProof/>
                 <w:webHidden/>
               </w:rPr>
-              <w:t>17</w:t>
+              <w:t>16</w:t>
             </w:r>
             <w:r>
               <w:rPr>
@@ -5473,7 +5481,7 @@
               <w:lang w:eastAsia="es-ES"/>
             </w:rPr>
           </w:pPr>
-          <w:hyperlink w:anchor="_Toc199172542" w:history="1">
+          <w:hyperlink w:anchor="_Toc199173332" w:history="1">
             <w:r>
               <w:rPr>
                 <w:rStyle w:val="Hipervnculo"/>
@@ -5500,7 +5508,7 @@
                 <w:noProof/>
                 <w:webHidden/>
               </w:rPr>
-              <w:instrText xml:space="preserve"> PAGEREF _Toc199172542 \h </w:instrText>
+              <w:instrText xml:space="preserve"> PAGEREF _Toc199173332 \h </w:instrText>
             </w:r>
             <w:r>
               <w:rPr>
@@ -5520,7 +5528,7 @@
                 <w:noProof/>
                 <w:webHidden/>
               </w:rPr>
-              <w:t>18</w:t>
+              <w:t>17</w:t>
             </w:r>
             <w:r>
               <w:rPr>
@@ -5545,7 +5553,7 @@
               <w:lang w:eastAsia="es-ES"/>
             </w:rPr>
           </w:pPr>
-          <w:hyperlink w:anchor="_Toc199172543" w:history="1">
+          <w:hyperlink w:anchor="_Toc199173333" w:history="1">
             <w:r>
               <w:rPr>
                 <w:rStyle w:val="Hipervnculo"/>
@@ -5572,7 +5580,7 @@
                 <w:noProof/>
                 <w:webHidden/>
               </w:rPr>
-              <w:instrText xml:space="preserve"> PAGEREF _Toc199172543 \h </w:instrText>
+              <w:instrText xml:space="preserve"> PAGEREF _Toc199173333 \h </w:instrText>
             </w:r>
             <w:r>
               <w:rPr>
@@ -5592,7 +5600,7 @@
                 <w:noProof/>
                 <w:webHidden/>
               </w:rPr>
-              <w:t>18</w:t>
+              <w:t>17</w:t>
             </w:r>
             <w:r>
               <w:rPr>
@@ -5617,7 +5625,7 @@
               <w:lang w:eastAsia="es-ES"/>
             </w:rPr>
           </w:pPr>
-          <w:hyperlink w:anchor="_Toc199172544" w:history="1">
+          <w:hyperlink w:anchor="_Toc199173334" w:history="1">
             <w:r>
               <w:rPr>
                 <w:rStyle w:val="Hipervnculo"/>
@@ -5644,7 +5652,7 @@
                 <w:noProof/>
                 <w:webHidden/>
               </w:rPr>
-              <w:instrText xml:space="preserve"> PAGEREF _Toc199172544 \h </w:instrText>
+              <w:instrText xml:space="preserve"> PAGEREF _Toc199173334 \h </w:instrText>
             </w:r>
             <w:r>
               <w:rPr>
@@ -5664,7 +5672,7 @@
                 <w:noProof/>
                 <w:webHidden/>
               </w:rPr>
-              <w:t>18</w:t>
+              <w:t>17</w:t>
             </w:r>
             <w:r>
               <w:rPr>
@@ -5689,7 +5697,7 @@
               <w:lang w:eastAsia="es-ES"/>
             </w:rPr>
           </w:pPr>
-          <w:hyperlink w:anchor="_Toc199172545" w:history="1">
+          <w:hyperlink w:anchor="_Toc199173335" w:history="1">
             <w:r>
               <w:rPr>
                 <w:rStyle w:val="Hipervnculo"/>
@@ -5716,7 +5724,7 @@
                 <w:noProof/>
                 <w:webHidden/>
               </w:rPr>
-              <w:instrText xml:space="preserve"> PAGEREF _Toc199172545 \h </w:instrText>
+              <w:instrText xml:space="preserve"> PAGEREF _Toc199173335 \h </w:instrText>
             </w:r>
             <w:r>
               <w:rPr>
@@ -5736,7 +5744,7 @@
                 <w:noProof/>
                 <w:webHidden/>
               </w:rPr>
-              <w:t>19</w:t>
+              <w:t>18</w:t>
             </w:r>
             <w:r>
               <w:rPr>
@@ -5761,7 +5769,7 @@
               <w:lang w:eastAsia="es-ES"/>
             </w:rPr>
           </w:pPr>
-          <w:hyperlink w:anchor="_Toc199172546" w:history="1">
+          <w:hyperlink w:anchor="_Toc199173336" w:history="1">
             <w:r>
               <w:rPr>
                 <w:rStyle w:val="Hipervnculo"/>
@@ -5788,7 +5796,7 @@
                 <w:noProof/>
                 <w:webHidden/>
               </w:rPr>
-              <w:instrText xml:space="preserve"> PAGEREF _Toc199172546 \h </w:instrText>
+              <w:instrText xml:space="preserve"> PAGEREF _Toc199173336 \h </w:instrText>
             </w:r>
             <w:r>
               <w:rPr>
@@ -5808,7 +5816,7 @@
                 <w:noProof/>
                 <w:webHidden/>
               </w:rPr>
-              <w:t>19</w:t>
+              <w:t>18</w:t>
             </w:r>
             <w:r>
               <w:rPr>
@@ -5833,7 +5841,7 @@
               <w:lang w:eastAsia="es-ES"/>
             </w:rPr>
           </w:pPr>
-          <w:hyperlink w:anchor="_Toc199172547" w:history="1">
+          <w:hyperlink w:anchor="_Toc199173337" w:history="1">
             <w:r>
               <w:rPr>
                 <w:rStyle w:val="Hipervnculo"/>
@@ -5860,7 +5868,7 @@
                 <w:noProof/>
                 <w:webHidden/>
               </w:rPr>
-              <w:instrText xml:space="preserve"> PAGEREF _Toc199172547 \h </w:instrText>
+              <w:instrText xml:space="preserve"> PAGEREF _Toc199173337 \h </w:instrText>
             </w:r>
             <w:r>
               <w:rPr>
@@ -5880,7 +5888,7 @@
                 <w:noProof/>
                 <w:webHidden/>
               </w:rPr>
-              <w:t>19</w:t>
+              <w:t>18</w:t>
             </w:r>
             <w:r>
               <w:rPr>
@@ -5905,7 +5913,7 @@
               <w:lang w:eastAsia="es-ES"/>
             </w:rPr>
           </w:pPr>
-          <w:hyperlink w:anchor="_Toc199172548" w:history="1">
+          <w:hyperlink w:anchor="_Toc199173338" w:history="1">
             <w:r>
               <w:rPr>
                 <w:rStyle w:val="Hipervnculo"/>
@@ -5932,7 +5940,7 @@
                 <w:noProof/>
                 <w:webHidden/>
               </w:rPr>
-              <w:instrText xml:space="preserve"> PAGEREF _Toc199172548 \h </w:instrText>
+              <w:instrText xml:space="preserve"> PAGEREF _Toc199173338 \h </w:instrText>
             </w:r>
             <w:r>
               <w:rPr>
@@ -5952,7 +5960,7 @@
                 <w:noProof/>
                 <w:webHidden/>
               </w:rPr>
-              <w:t>20</w:t>
+              <w:t>19</w:t>
             </w:r>
             <w:r>
               <w:rPr>
@@ -5977,7 +5985,7 @@
               <w:lang w:eastAsia="es-ES"/>
             </w:rPr>
           </w:pPr>
-          <w:hyperlink w:anchor="_Toc199172549" w:history="1">
+          <w:hyperlink w:anchor="_Toc199173339" w:history="1">
             <w:r>
               <w:rPr>
                 <w:rStyle w:val="Hipervnculo"/>
@@ -6004,7 +6012,7 @@
                 <w:noProof/>
                 <w:webHidden/>
               </w:rPr>
-              <w:instrText xml:space="preserve"> PAGEREF _Toc199172549 \h </w:instrText>
+              <w:instrText xml:space="preserve"> PAGEREF _Toc199173339 \h </w:instrText>
             </w:r>
             <w:r>
               <w:rPr>
@@ -6024,7 +6032,7 @@
                 <w:noProof/>
                 <w:webHidden/>
               </w:rPr>
-              <w:t>21</w:t>
+              <w:t>20</w:t>
             </w:r>
             <w:r>
               <w:rPr>
@@ -6246,23 +6254,7 @@
               </w:rPr>
             </w:pPr>
             <w:r>
-              <w:t>Realización del “</w:t>
-            </w:r>
-            <w:proofErr w:type="spellStart"/>
-            <w:r>
-              <w:t>Testing</w:t>
-            </w:r>
-            <w:proofErr w:type="spellEnd"/>
-            <w:r>
-              <w:t xml:space="preserve"> </w:t>
-            </w:r>
-            <w:proofErr w:type="spellStart"/>
-            <w:r>
-              <w:t>Report</w:t>
-            </w:r>
-            <w:proofErr w:type="spellEnd"/>
-            <w:r>
-              <w:t>”</w:t>
+              <w:t>Realización del “Testing Report”</w:t>
             </w:r>
           </w:p>
         </w:tc>
@@ -6293,7 +6285,7 @@
         <w:pStyle w:val="Ttulo1"/>
       </w:pPr>
       <w:bookmarkStart w:id="1" w:name="_INTRODUCCIÓN"/>
-      <w:bookmarkStart w:id="2" w:name="_Toc199172525"/>
+      <w:bookmarkStart w:id="2" w:name="_Toc199173315"/>
       <w:bookmarkEnd w:id="1"/>
       <w:r>
         <w:lastRenderedPageBreak/>
@@ -6303,30 +6295,14 @@
     </w:p>
     <w:p>
       <w:r>
-        <w:t xml:space="preserve">Este documento describe el proceso de pruebas llevado a cabo sobre el sistema, centrado en los módulos de Flight </w:t>
-      </w:r>
-      <w:proofErr w:type="spellStart"/>
-      <w:r>
-        <w:t>Assignments</w:t>
-      </w:r>
-      <w:proofErr w:type="spellEnd"/>
-      <w:r>
-        <w:t xml:space="preserve"> y </w:t>
-      </w:r>
-      <w:proofErr w:type="spellStart"/>
-      <w:r>
-        <w:t>Activity</w:t>
-      </w:r>
-      <w:proofErr w:type="spellEnd"/>
-      <w:r>
-        <w:t xml:space="preserve"> Logs, con el objetivo de asegurar que cumple con los requisitos funcionales y no funcionales definidos. Se realizaron principalmente dos tipos de pruebas: funcionales, para verificar el correcto funcionamiento de todas las características del sistema, y de rendimiento, para evaluar su capacidad de respuesta bajo distintas condiciones de carga y estrés.</w:t>
+        <w:t>Este documento describe el proceso de pruebas llevado a cabo sobre el sistema, centrado en los módulos de Flight Assignments y Activity Logs, con el objetivo de asegurar que cumple con los requisitos funcionales y no funcionales definidos. Se realizaron principalmente dos tipos de pruebas: funcionales, para verificar el correcto funcionamiento de todas las características del sistema, y de rendimiento, para evaluar su capacidad de respuesta bajo distintas condiciones de carga y estrés.</w:t>
       </w:r>
     </w:p>
     <w:p>
       <w:pPr>
         <w:pStyle w:val="Ttulo1"/>
       </w:pPr>
-      <w:bookmarkStart w:id="3" w:name="_Toc199172526"/>
+      <w:bookmarkStart w:id="3" w:name="_Toc199173316"/>
       <w:r>
         <w:t>INTRODUCCIÓN</w:t>
       </w:r>
@@ -6343,23 +6319,10 @@
         <w:t xml:space="preserve"> específicamente pruebas realizadas sobre </w:t>
       </w:r>
       <w:r>
-        <w:t xml:space="preserve">los Flight </w:t>
-      </w:r>
-      <w:proofErr w:type="spellStart"/>
-      <w:r>
-        <w:t>Assignments</w:t>
-      </w:r>
-      <w:proofErr w:type="spellEnd"/>
-      <w:r>
-        <w:t xml:space="preserve"> y </w:t>
-      </w:r>
-      <w:proofErr w:type="spellStart"/>
-      <w:r>
-        <w:t>Activity</w:t>
-      </w:r>
-      <w:proofErr w:type="spellEnd"/>
-      <w:r>
-        <w:t xml:space="preserve"> Logs, </w:t>
+        <w:t xml:space="preserve">los Flight Assignments y </w:t>
+      </w:r>
+      <w:r>
+        <w:t xml:space="preserve">Activity Logs, </w:t>
       </w:r>
       <w:r>
         <w:t>con el fin de garantizar que cumple con los requisitos funcionales y no funcionales especificados en la fase de análisis.</w:t>
@@ -6385,7 +6348,7 @@
       </w:pPr>
       <w:bookmarkStart w:id="4" w:name="_CHAPTER_OF_FUNCTIONAL"/>
       <w:bookmarkStart w:id="5" w:name="_CAPÍTULO_DE_PRUEBAS"/>
-      <w:bookmarkStart w:id="6" w:name="_Toc199172527"/>
+      <w:bookmarkStart w:id="6" w:name="_Toc199173317"/>
       <w:bookmarkEnd w:id="4"/>
       <w:bookmarkEnd w:id="5"/>
       <w:r>
@@ -6401,15 +6364,7 @@
         <w:t xml:space="preserve">Las pruebas se han llevado a cabo con el conjunto de datos </w:t>
       </w:r>
       <w:r>
-        <w:t>“</w:t>
-      </w:r>
-      <w:proofErr w:type="spellStart"/>
-      <w:r>
-        <w:t>Sample</w:t>
-      </w:r>
-      <w:proofErr w:type="spellEnd"/>
-      <w:r>
-        <w:t>-Data”,</w:t>
+        <w:t>“Sample-Data”,</w:t>
       </w:r>
       <w:r>
         <w:t xml:space="preserve"> </w:t>
@@ -6421,19 +6376,14 @@
         <w:t xml:space="preserve">apartados </w:t>
       </w:r>
       <w:r>
-        <w:t>“Text” [1] y “</w:t>
-      </w:r>
-      <w:proofErr w:type="spellStart"/>
-      <w:r>
-        <w:t>Numeric</w:t>
-      </w:r>
-      <w:proofErr w:type="spellEnd"/>
-      <w:r>
-        <w:t>” [2].</w:t>
-      </w:r>
-    </w:p>
-    <w:p>
-      <w:r>
+        <w:t>“Text” [1] y “Numeric” [2].</w:t>
+      </w:r>
+    </w:p>
+    <w:p>
+      <w:r>
+        <w:rPr>
+          <w:noProof/>
+        </w:rPr>
         <w:drawing>
           <wp:anchor distT="0" distB="0" distL="114300" distR="114300" simplePos="0" relativeHeight="251662336" behindDoc="0" locked="0" layoutInCell="1" allowOverlap="1" wp14:anchorId="54F03F5E" wp14:editId="6B7C51EB">
             <wp:simplePos x="0" y="0"/>
@@ -6505,6 +6455,9 @@
     </w:p>
     <w:p>
       <w:r>
+        <w:rPr>
+          <w:noProof/>
+        </w:rPr>
         <w:lastRenderedPageBreak/>
         <w:drawing>
           <wp:anchor distT="0" distB="0" distL="114300" distR="114300" simplePos="0" relativeHeight="251663360" behindDoc="0" locked="0" layoutInCell="1" allowOverlap="1" wp14:anchorId="771152AD" wp14:editId="6E5F4999">
@@ -6570,7 +6523,7 @@
         <w:pStyle w:val="Ttulo2"/>
       </w:pPr>
       <w:bookmarkStart w:id="7" w:name="_ASPECTOS_COMUNES"/>
-      <w:bookmarkStart w:id="8" w:name="_Toc199172528"/>
+      <w:bookmarkStart w:id="8" w:name="_Toc199173318"/>
       <w:bookmarkEnd w:id="7"/>
       <w:r>
         <w:t>ASPECTOS COMUNES</w:t>
@@ -6582,97 +6535,53 @@
         <w:jc w:val="both"/>
       </w:pPr>
       <w:r>
-        <w:t>Para cada acción se han generado dos tipos de archivos diferentes</w:t>
-      </w:r>
-      <w:proofErr w:type="gramStart"/>
-      <w:r>
-        <w:t>,</w:t>
+        <w:t>Para cada acción se han generado dos tipos de archivos diferentes,</w:t>
       </w:r>
       <w:r>
         <w:t xml:space="preserve"> </w:t>
       </w:r>
       <w:r>
+        <w:t>.safe y .hack, a partir de l</w:t>
+      </w:r>
+      <w:r>
+        <w:t xml:space="preserve">os launchers </w:t>
+      </w:r>
+      <w:r>
+        <w:t>(</w:t>
+      </w:r>
+      <w:r>
+        <w:t>Replay</w:t>
+      </w:r>
+      <w:r>
+        <w:t>, Record y Analyse</w:t>
+      </w:r>
+      <w:r>
+        <w:t>)</w:t>
+      </w:r>
+      <w:r>
+        <w:t xml:space="preserve"> </w:t>
+      </w:r>
+      <w:r>
+        <w:t>[3]</w:t>
+      </w:r>
+      <w:r>
+        <w:t xml:space="preserve"> </w:t>
+      </w:r>
+      <w:r>
+        <w:t>que otorga el framework</w:t>
+      </w:r>
+      <w:r>
         <w:t>.</w:t>
       </w:r>
-      <w:proofErr w:type="spellStart"/>
-      <w:r>
-        <w:t>safe</w:t>
-      </w:r>
-      <w:proofErr w:type="spellEnd"/>
-      <w:proofErr w:type="gramEnd"/>
-      <w:r>
-        <w:t xml:space="preserve"> </w:t>
-      </w:r>
-      <w:proofErr w:type="gramStart"/>
-      <w:r>
-        <w:t>y .</w:t>
-      </w:r>
-      <w:proofErr w:type="spellStart"/>
-      <w:r>
-        <w:t>hack</w:t>
-      </w:r>
-      <w:proofErr w:type="spellEnd"/>
-      <w:proofErr w:type="gramEnd"/>
-      <w:r>
-        <w:t>, a partir de l</w:t>
-      </w:r>
-      <w:r>
-        <w:t xml:space="preserve">os </w:t>
-      </w:r>
-      <w:proofErr w:type="spellStart"/>
-      <w:r>
-        <w:t>launchers</w:t>
-      </w:r>
-      <w:proofErr w:type="spellEnd"/>
-      <w:r>
-        <w:t xml:space="preserve"> </w:t>
-      </w:r>
-      <w:r>
-        <w:t>(</w:t>
-      </w:r>
-      <w:r>
-        <w:t>Replay</w:t>
-      </w:r>
-      <w:r>
-        <w:t xml:space="preserve">, </w:t>
-      </w:r>
-      <w:proofErr w:type="spellStart"/>
-      <w:r>
-        <w:t>Record</w:t>
-      </w:r>
-      <w:proofErr w:type="spellEnd"/>
-      <w:r>
-        <w:t xml:space="preserve"> y </w:t>
-      </w:r>
-      <w:proofErr w:type="spellStart"/>
-      <w:r>
-        <w:t>Analyse</w:t>
-      </w:r>
-      <w:proofErr w:type="spellEnd"/>
-      <w:r>
-        <w:t>)</w:t>
-      </w:r>
-      <w:r>
-        <w:t xml:space="preserve"> </w:t>
-      </w:r>
-      <w:r>
-        <w:t>[3]</w:t>
-      </w:r>
-      <w:r>
-        <w:t xml:space="preserve"> </w:t>
-      </w:r>
-      <w:r>
-        <w:t>que otorga el framework</w:t>
-      </w:r>
-      <w:r>
-        <w:t>.</w:t>
-      </w:r>
     </w:p>
     <w:p>
       <w:pPr>
         <w:jc w:val="both"/>
       </w:pPr>
       <w:r>
+        <w:rPr>
+          <w:noProof/>
+        </w:rPr>
         <w:drawing>
           <wp:anchor distT="0" distB="0" distL="114300" distR="114300" simplePos="0" relativeHeight="251664384" behindDoc="0" locked="0" layoutInCell="1" allowOverlap="1" wp14:anchorId="0F28800B" wp14:editId="5C326B9C">
             <wp:simplePos x="0" y="0"/>
@@ -6756,21 +6665,11 @@
         <w:t>ejecutado</w:t>
       </w:r>
       <w:r>
-        <w:t xml:space="preserve"> el </w:t>
-      </w:r>
-      <w:proofErr w:type="spellStart"/>
-      <w:r>
-        <w:t>launcher</w:t>
-      </w:r>
-      <w:proofErr w:type="spellEnd"/>
-      <w:r>
-        <w:t xml:space="preserve"> de </w:t>
-      </w:r>
-      <w:proofErr w:type="spellStart"/>
+        <w:t xml:space="preserve"> el launcher de </w:t>
+      </w:r>
       <w:r>
         <w:t>Record</w:t>
       </w:r>
-      <w:proofErr w:type="spellEnd"/>
       <w:r>
         <w:t xml:space="preserve"> para grabar las pruebas en el</w:t>
       </w:r>
@@ -6780,256 +6679,187 @@
       <w:r>
         <w:t xml:space="preserve"> </w:t>
       </w:r>
-      <w:proofErr w:type="spellStart"/>
-      <w:proofErr w:type="gramStart"/>
       <w:r>
         <w:t>tester.trace</w:t>
       </w:r>
-      <w:proofErr w:type="spellEnd"/>
-      <w:proofErr w:type="gramEnd"/>
-      <w:r>
-        <w:t xml:space="preserve">, y posteriormente el </w:t>
-      </w:r>
-      <w:proofErr w:type="spellStart"/>
-      <w:r>
-        <w:t>launcher</w:t>
-      </w:r>
-      <w:proofErr w:type="spellEnd"/>
+      <w:r>
+        <w:t xml:space="preserve">, y posteriormente el launcher </w:t>
+      </w:r>
+      <w:r>
+        <w:t>Replay</w:t>
+      </w:r>
+      <w:r>
+        <w:t>,</w:t>
+      </w:r>
       <w:r>
         <w:t xml:space="preserve"> </w:t>
       </w:r>
       <w:r>
-        <w:t>Replay</w:t>
-      </w:r>
-      <w:r>
-        <w:t>,</w:t>
+        <w:t xml:space="preserve">para replicar las pruebas </w:t>
+      </w:r>
+      <w:r>
+        <w:t>previamente grabadas</w:t>
+      </w:r>
+      <w:r>
+        <w:t xml:space="preserve"> en nuestra aplicación.</w:t>
+      </w:r>
+    </w:p>
+    <w:p>
+      <w:pPr>
+        <w:jc w:val="both"/>
+      </w:pPr>
+    </w:p>
+    <w:p>
+      <w:pPr>
+        <w:jc w:val="both"/>
+      </w:pPr>
+      <w:r>
+        <w:t xml:space="preserve">Para la creación de los archivos .safe correspondientes a cada acción de las entidades mencionadas, se ha </w:t>
+      </w:r>
+      <w:r>
+        <w:t>empleado</w:t>
+      </w:r>
+      <w:r>
+        <w:t xml:space="preserve"> un conjunto único de datos de prueba</w:t>
       </w:r>
       <w:r>
         <w:t xml:space="preserve"> </w:t>
       </w:r>
       <w:r>
-        <w:t xml:space="preserve">para replicar las pruebas </w:t>
-      </w:r>
-      <w:r>
-        <w:t>previamente grabadas</w:t>
-      </w:r>
-      <w:r>
-        <w:t xml:space="preserve"> en nuestra aplicación.</w:t>
+        <w:t>([1], [2])</w:t>
+      </w:r>
+      <w:r>
+        <w:t xml:space="preserve">. Este conjunto incluye tanto datos válidos como inválidos, con el </w:t>
+      </w:r>
+      <w:r>
+        <w:t>objetivo</w:t>
+      </w:r>
+      <w:r>
+        <w:t xml:space="preserve"> de verificar que los formularios puedan enviarse correctamente respetando las restricciones asociadas, especialmente en las acciones de </w:t>
+      </w:r>
+      <w:r>
+        <w:t>Update</w:t>
+      </w:r>
+      <w:r>
+        <w:t xml:space="preserve"> (</w:t>
+      </w:r>
+      <w:r>
+        <w:t>Actualizar</w:t>
+      </w:r>
+      <w:r>
+        <w:t xml:space="preserve">), </w:t>
+      </w:r>
+      <w:r>
+        <w:t xml:space="preserve">Publish </w:t>
+      </w:r>
+      <w:r>
+        <w:t>(</w:t>
+      </w:r>
+      <w:r>
+        <w:t>Publicar</w:t>
+      </w:r>
+      <w:r>
+        <w:t xml:space="preserve">) y </w:t>
+      </w:r>
+      <w:r>
+        <w:t xml:space="preserve">Create </w:t>
+      </w:r>
+      <w:r>
+        <w:t>(</w:t>
+      </w:r>
+      <w:r>
+        <w:t>Crear</w:t>
+      </w:r>
+      <w:r>
+        <w:t>).</w:t>
       </w:r>
     </w:p>
     <w:p>
       <w:pPr>
         <w:jc w:val="both"/>
       </w:pPr>
+      <w:r>
+        <w:t xml:space="preserve">En </w:t>
+      </w:r>
+      <w:r>
+        <w:t>aquellas</w:t>
+      </w:r>
+      <w:r>
+        <w:t xml:space="preserve"> acciones que no implican el envío de formularios</w:t>
+      </w:r>
+      <w:r>
+        <w:t>, como Show y List</w:t>
+      </w:r>
+      <w:r>
+        <w:t xml:space="preserve"> (Listar y Mostrar), la </w:t>
+      </w:r>
+      <w:r>
+        <w:t>verificación</w:t>
+      </w:r>
+      <w:r>
+        <w:t xml:space="preserve"> se limita a verificar que los </w:t>
+      </w:r>
+      <w:r>
+        <w:t xml:space="preserve">Flight Assignment y Activity </w:t>
+      </w:r>
+      <w:r>
+        <w:t>se listan correctamente y que sus formularios aparecen adecuadamente</w:t>
+      </w:r>
+      <w:r>
+        <w:t xml:space="preserve">. </w:t>
+      </w:r>
+      <w:r>
+        <w:t xml:space="preserve"> </w:t>
+      </w:r>
+      <w:r>
+        <w:t>Finalmente</w:t>
+      </w:r>
+      <w:r>
+        <w:t xml:space="preserve">, </w:t>
+      </w:r>
+      <w:r>
+        <w:t>en</w:t>
+      </w:r>
+      <w:r>
+        <w:t xml:space="preserve"> la acción </w:t>
+      </w:r>
+      <w:r>
+        <w:t xml:space="preserve">Delete </w:t>
+      </w:r>
+      <w:r>
+        <w:t>(</w:t>
+      </w:r>
+      <w:r>
+        <w:t>Eliminar</w:t>
+      </w:r>
+      <w:r>
+        <w:t>)</w:t>
+      </w:r>
+      <w:r>
+        <w:t>, se ha validado que los datos seleccionados por el usuario se borren con éxito.</w:t>
+      </w:r>
     </w:p>
     <w:p>
       <w:pPr>
         <w:jc w:val="both"/>
       </w:pPr>
-      <w:r>
-        <w:t xml:space="preserve">Para la creación de los </w:t>
-      </w:r>
-      <w:proofErr w:type="gramStart"/>
-      <w:r>
-        <w:t>archivos .</w:t>
-      </w:r>
-      <w:proofErr w:type="spellStart"/>
-      <w:r>
-        <w:t>safe</w:t>
-      </w:r>
-      <w:proofErr w:type="spellEnd"/>
-      <w:proofErr w:type="gramEnd"/>
-      <w:r>
-        <w:t xml:space="preserve"> correspondientes a cada acción de las entidades mencionadas, se ha </w:t>
-      </w:r>
-      <w:r>
-        <w:t>empleado</w:t>
-      </w:r>
-      <w:r>
-        <w:t xml:space="preserve"> un conjunto único de datos de prueba</w:t>
-      </w:r>
-      <w:r>
-        <w:t xml:space="preserve"> </w:t>
-      </w:r>
-      <w:r>
-        <w:t>([1], [2])</w:t>
-      </w:r>
-      <w:r>
-        <w:t xml:space="preserve">. Este conjunto incluye tanto datos válidos como inválidos, con el </w:t>
-      </w:r>
-      <w:r>
-        <w:t>objetivo</w:t>
-      </w:r>
-      <w:r>
-        <w:t xml:space="preserve"> de verificar que los formularios puedan enviarse correctamente respetando las restricciones asociadas, especialmente en las acciones de </w:t>
-      </w:r>
-      <w:r>
-        <w:t>Update</w:t>
-      </w:r>
-      <w:r>
-        <w:t xml:space="preserve"> (</w:t>
-      </w:r>
-      <w:r>
-        <w:t>Actualizar</w:t>
-      </w:r>
-      <w:r>
-        <w:t xml:space="preserve">), </w:t>
-      </w:r>
-      <w:proofErr w:type="spellStart"/>
-      <w:r>
-        <w:t>Publish</w:t>
-      </w:r>
-      <w:proofErr w:type="spellEnd"/>
-      <w:r>
-        <w:t xml:space="preserve"> </w:t>
-      </w:r>
-      <w:r>
-        <w:t>(</w:t>
-      </w:r>
-      <w:r>
-        <w:t>Publicar</w:t>
-      </w:r>
-      <w:r>
-        <w:t xml:space="preserve">) y </w:t>
-      </w:r>
-      <w:r>
-        <w:t xml:space="preserve">Create </w:t>
-      </w:r>
-      <w:r>
-        <w:t>(</w:t>
-      </w:r>
-      <w:r>
-        <w:t>Crear</w:t>
-      </w:r>
-      <w:r>
-        <w:t>).</w:t>
-      </w:r>
     </w:p>
     <w:p>
       <w:pPr>
         <w:jc w:val="both"/>
       </w:pPr>
       <w:r>
-        <w:t xml:space="preserve">En </w:t>
-      </w:r>
-      <w:r>
-        <w:t>aquellas</w:t>
-      </w:r>
-      <w:r>
-        <w:t xml:space="preserve"> acciones que no implican el envío de formularios</w:t>
-      </w:r>
-      <w:r>
-        <w:t xml:space="preserve">, como </w:t>
-      </w:r>
-      <w:proofErr w:type="gramStart"/>
-      <w:r>
-        <w:t>Show</w:t>
-      </w:r>
-      <w:proofErr w:type="gramEnd"/>
-      <w:r>
-        <w:t xml:space="preserve"> y </w:t>
-      </w:r>
-      <w:proofErr w:type="spellStart"/>
-      <w:r>
-        <w:t>List</w:t>
-      </w:r>
-      <w:proofErr w:type="spellEnd"/>
-      <w:r>
-        <w:t xml:space="preserve"> (Listar y Mostrar), la </w:t>
-      </w:r>
-      <w:r>
-        <w:t>verificación</w:t>
-      </w:r>
-      <w:r>
-        <w:t xml:space="preserve"> se limita a verificar que los </w:t>
-      </w:r>
-      <w:r>
-        <w:t xml:space="preserve">Flight </w:t>
-      </w:r>
-      <w:proofErr w:type="spellStart"/>
-      <w:r>
-        <w:t>Assignment</w:t>
-      </w:r>
-      <w:proofErr w:type="spellEnd"/>
-      <w:r>
-        <w:t xml:space="preserve"> y </w:t>
-      </w:r>
-      <w:proofErr w:type="spellStart"/>
-      <w:r>
-        <w:t>Activity</w:t>
-      </w:r>
-      <w:proofErr w:type="spellEnd"/>
-      <w:r>
-        <w:t xml:space="preserve"> </w:t>
-      </w:r>
-      <w:r>
-        <w:t>se listan correctamente y que sus formularios aparecen adecuadamente</w:t>
-      </w:r>
-      <w:r>
-        <w:t xml:space="preserve">. </w:t>
-      </w:r>
-      <w:r>
-        <w:t xml:space="preserve"> </w:t>
-      </w:r>
-      <w:r>
-        <w:t>Finalmente</w:t>
-      </w:r>
-      <w:r>
-        <w:t xml:space="preserve">, </w:t>
-      </w:r>
-      <w:r>
-        <w:t>en</w:t>
-      </w:r>
-      <w:r>
-        <w:t xml:space="preserve"> la acción </w:t>
-      </w:r>
-      <w:r>
-        <w:t xml:space="preserve">Delete </w:t>
-      </w:r>
-      <w:r>
-        <w:t>(</w:t>
-      </w:r>
-      <w:r>
-        <w:t>Eliminar</w:t>
-      </w:r>
-      <w:r>
-        <w:t>)</w:t>
-      </w:r>
-      <w:r>
-        <w:t>, se ha validado que los datos seleccionados por el usuario se borren con éxito.</w:t>
-      </w:r>
-    </w:p>
-    <w:p>
-      <w:pPr>
-        <w:jc w:val="both"/>
-      </w:pPr>
-    </w:p>
-    <w:p>
-      <w:pPr>
-        <w:jc w:val="both"/>
-      </w:pPr>
-      <w:r>
         <w:t>Respecto a</w:t>
       </w:r>
       <w:r>
-        <w:t xml:space="preserve"> los </w:t>
-      </w:r>
-      <w:proofErr w:type="gramStart"/>
-      <w:r>
-        <w:t xml:space="preserve">archivos </w:t>
-      </w:r>
-      <w:r>
-        <w:t>.</w:t>
-      </w:r>
-      <w:proofErr w:type="spellStart"/>
-      <w:r>
-        <w:t>ha</w:t>
+        <w:t xml:space="preserve"> los archivos </w:t>
+      </w:r>
+      <w:r>
+        <w:t>.ha</w:t>
       </w:r>
       <w:r>
         <w:t>ck</w:t>
       </w:r>
-      <w:proofErr w:type="spellEnd"/>
-      <w:proofErr w:type="gramEnd"/>
       <w:r>
         <w:rPr>
           <w:b/>
@@ -7041,36 +6871,23 @@
         <w:t xml:space="preserve">generados, se ha utilizado la herramienta de desarrollador de </w:t>
       </w:r>
       <w:r>
-        <w:t xml:space="preserve">Firefox </w:t>
-      </w:r>
-      <w:proofErr w:type="spellStart"/>
-      <w:r>
-        <w:t>Developer</w:t>
-      </w:r>
-      <w:proofErr w:type="spellEnd"/>
+        <w:t>Firefox Developer Edition</w:t>
+      </w:r>
+      <w:r>
+        <w:t xml:space="preserve"> [4], para </w:t>
+      </w:r>
+      <w:r>
+        <w:t>realizar</w:t>
+      </w:r>
+      <w:r>
+        <w:t xml:space="preserve"> un POST hacking</w:t>
+      </w:r>
+      <w:r>
+        <w:t>.</w:t>
+      </w:r>
       <w:r>
         <w:t xml:space="preserve"> </w:t>
       </w:r>
-      <w:proofErr w:type="spellStart"/>
-      <w:r>
-        <w:t>Edition</w:t>
-      </w:r>
-      <w:proofErr w:type="spellEnd"/>
-      <w:r>
-        <w:t xml:space="preserve"> [4], para </w:t>
-      </w:r>
-      <w:r>
-        <w:t>realizar</w:t>
-      </w:r>
-      <w:r>
-        <w:t xml:space="preserve"> un POST hacking</w:t>
-      </w:r>
-      <w:r>
-        <w:t>.</w:t>
-      </w:r>
-      <w:r>
-        <w:t xml:space="preserve"> </w:t>
-      </w:r>
       <w:r>
         <w:t xml:space="preserve">Es importante destacar </w:t>
       </w:r>
@@ -7090,10 +6907,7 @@
         <w:t>abrir dicha herramienta</w:t>
       </w:r>
       <w:r>
-        <w:t xml:space="preserve"> </w:t>
-      </w:r>
-      <w:r>
-        <w:t>ya que al abrirla con la aplicación corriendo en el navegador, esta genera una consulta fantasma tipo GET que afecta negativamente al proceso de replay de las pruebas realizadas.</w:t>
+        <w:t xml:space="preserve"> ya que al abrirla con la aplicación corriendo en el navegador, esta genera una consulta fantasma tipo GET que afecta negativamente al proceso de replay de las pruebas realizadas.</w:t>
       </w:r>
     </w:p>
     <w:p>
@@ -7107,58 +6921,16 @@
       </w:pPr>
       <w:r>
         <w:lastRenderedPageBreak/>
-        <w:t xml:space="preserve">Una vez obtenidos los archivos </w:t>
-      </w:r>
-      <w:proofErr w:type="spellStart"/>
-      <w:proofErr w:type="gramStart"/>
-      <w:r>
-        <w:t>tester.trace</w:t>
-      </w:r>
-      <w:proofErr w:type="spellEnd"/>
-      <w:proofErr w:type="gramEnd"/>
-      <w:r>
-        <w:t xml:space="preserve">, </w:t>
-      </w:r>
-      <w:r>
-        <w:t>se han copiado y renombrado en la carpeta correspondiente de la entidad, en este caso “</w:t>
-      </w:r>
-      <w:proofErr w:type="spellStart"/>
-      <w:r>
-        <w:t>src</w:t>
-      </w:r>
-      <w:proofErr w:type="spellEnd"/>
-      <w:r>
-        <w:t>/test/</w:t>
-      </w:r>
-      <w:proofErr w:type="spellStart"/>
-      <w:r>
-        <w:t>resources</w:t>
-      </w:r>
-      <w:proofErr w:type="spellEnd"/>
-      <w:r>
-        <w:t>”</w:t>
+        <w:t xml:space="preserve">Una vez obtenidos los archivos tester.trace, </w:t>
+      </w:r>
+      <w:r>
+        <w:t>se han copiado y renombrado en la carpeta correspondiente de la entidad, en este caso “src/test/resources”</w:t>
       </w:r>
       <w:r>
         <w:t>, dentro de</w:t>
       </w:r>
       <w:r>
-        <w:t xml:space="preserve"> la carpeta Flight </w:t>
-      </w:r>
-      <w:proofErr w:type="spellStart"/>
-      <w:r>
-        <w:t>Crew</w:t>
-      </w:r>
-      <w:proofErr w:type="spellEnd"/>
-      <w:r>
-        <w:t xml:space="preserve"> </w:t>
-      </w:r>
-      <w:proofErr w:type="spellStart"/>
-      <w:r>
-        <w:t>Member</w:t>
-      </w:r>
-      <w:proofErr w:type="spellEnd"/>
-      <w:r>
-        <w:t>.</w:t>
+        <w:t xml:space="preserve"> la carpeta Flight Crew Member.</w:t>
       </w:r>
     </w:p>
     <w:p/>
@@ -7167,8 +6939,11 @@
         <w:jc w:val="center"/>
       </w:pPr>
       <w:r>
+        <w:rPr>
+          <w:noProof/>
+        </w:rPr>
         <w:drawing>
-          <wp:anchor distT="0" distB="0" distL="114300" distR="114300" simplePos="0" relativeHeight="251669504" behindDoc="0" locked="0" layoutInCell="1" allowOverlap="1" wp14:anchorId="5DE2CB38" wp14:editId="5189793B">
+          <wp:anchor distT="0" distB="0" distL="114300" distR="114300" simplePos="0" relativeHeight="251669504" behindDoc="0" locked="0" layoutInCell="1" allowOverlap="1" wp14:anchorId="5DE2CB38" wp14:editId="390EF545">
             <wp:simplePos x="0" y="0"/>
             <wp:positionH relativeFrom="margin">
               <wp:align>center</wp:align>
@@ -7233,7 +7008,7 @@
         <w:pStyle w:val="Ttulo2"/>
       </w:pPr>
       <w:bookmarkStart w:id="9" w:name="_PRUEBAS_DE_FLIGHT"/>
-      <w:bookmarkStart w:id="10" w:name="_Toc199172529"/>
+      <w:bookmarkStart w:id="10" w:name="_Toc199173319"/>
       <w:bookmarkEnd w:id="9"/>
       <w:r>
         <w:t>PRUEBAS DE FLIGHT ASSIGNMENT</w:t>
@@ -7245,7 +7020,7 @@
         <w:pStyle w:val="Ttulo3"/>
       </w:pPr>
       <w:bookmarkStart w:id="11" w:name="_CREATE,_UPDATE_Y"/>
-      <w:bookmarkStart w:id="12" w:name="_Toc199172530"/>
+      <w:bookmarkStart w:id="12" w:name="_Toc199173320"/>
       <w:bookmarkEnd w:id="11"/>
       <w:r>
         <w:t>CREATE</w:t>
@@ -7262,85 +7037,58 @@
       <w:r>
         <w:t xml:space="preserve">Para generar el </w:t>
       </w:r>
-      <w:proofErr w:type="gramStart"/>
       <w:r>
         <w:t xml:space="preserve">archivo </w:t>
       </w:r>
       <w:r>
+        <w:t>.safe</w:t>
+      </w:r>
+      <w:r>
+        <w:t>, n</w:t>
+      </w:r>
+      <w:r>
+        <w:t>os registramos en nuestr</w:t>
+      </w:r>
+      <w:r>
+        <w:t xml:space="preserve">o rol correspondiente, Flight Crew Member [5] en nuestro caso, </w:t>
+      </w:r>
+      <w:r>
+        <w:t>y accedemos al formulario de Create</w:t>
+      </w:r>
+      <w:r>
+        <w:t xml:space="preserve"> [6]</w:t>
+      </w:r>
+      <w:r>
+        <w:t>, Update</w:t>
+      </w:r>
+      <w:r>
+        <w:t xml:space="preserve">, </w:t>
+      </w:r>
+      <w:r>
+        <w:t>Publish</w:t>
+      </w:r>
+      <w:r>
+        <w:t xml:space="preserve"> o Delete [7] de Flight Assig</w:t>
+      </w:r>
+      <w:r>
+        <w:t>n</w:t>
+      </w:r>
+      <w:r>
+        <w:t>ment</w:t>
+      </w:r>
+      <w:r>
         <w:t>.</w:t>
       </w:r>
-      <w:proofErr w:type="spellStart"/>
-      <w:r>
-        <w:t>safe</w:t>
-      </w:r>
-      <w:proofErr w:type="spellEnd"/>
-      <w:proofErr w:type="gramEnd"/>
-      <w:r>
-        <w:t>, n</w:t>
-      </w:r>
-      <w:r>
-        <w:t>os registramos en nuestr</w:t>
-      </w:r>
-      <w:r>
-        <w:t xml:space="preserve">o rol correspondiente, Flight </w:t>
-      </w:r>
-      <w:proofErr w:type="spellStart"/>
-      <w:r>
-        <w:t>Crew</w:t>
-      </w:r>
-      <w:proofErr w:type="spellEnd"/>
       <w:r>
         <w:t xml:space="preserve"> </w:t>
       </w:r>
-      <w:proofErr w:type="spellStart"/>
-      <w:r>
-        <w:t>Member</w:t>
-      </w:r>
-      <w:proofErr w:type="spellEnd"/>
-      <w:r>
-        <w:t xml:space="preserve"> [5] en nuestro caso, </w:t>
-      </w:r>
-      <w:r>
-        <w:t>y accedemos al formulario de Create</w:t>
-      </w:r>
-      <w:r>
-        <w:t xml:space="preserve"> [6]</w:t>
-      </w:r>
-      <w:r>
-        <w:t>, Update</w:t>
-      </w:r>
-      <w:r>
-        <w:t xml:space="preserve">, </w:t>
-      </w:r>
-      <w:proofErr w:type="spellStart"/>
-      <w:r>
-        <w:t>Publish</w:t>
-      </w:r>
-      <w:proofErr w:type="spellEnd"/>
-      <w:r>
-        <w:t xml:space="preserve"> o Delete [7] de Flight </w:t>
-      </w:r>
-      <w:proofErr w:type="spellStart"/>
-      <w:r>
-        <w:t>Assig</w:t>
-      </w:r>
-      <w:r>
-        <w:t>n</w:t>
-      </w:r>
-      <w:r>
-        <w:t>ment</w:t>
-      </w:r>
-      <w:proofErr w:type="spellEnd"/>
-      <w:r>
-        <w:t>.</w:t>
-      </w:r>
-      <w:r>
-        <w:t xml:space="preserve"> </w:t>
-      </w:r>
     </w:p>
     <w:p/>
     <w:p>
       <w:r>
+        <w:rPr>
+          <w:noProof/>
+        </w:rPr>
         <w:drawing>
           <wp:inline distT="0" distB="0" distL="0" distR="0" wp14:anchorId="640D0591" wp14:editId="74F7102D">
             <wp:extent cx="5400040" cy="1032510"/>
@@ -7388,6 +7136,9 @@
     </w:p>
     <w:p>
       <w:r>
+        <w:rPr>
+          <w:noProof/>
+        </w:rPr>
         <w:drawing>
           <wp:inline distT="0" distB="0" distL="0" distR="0" wp14:anchorId="7F6E5326" wp14:editId="5459E8FE">
             <wp:extent cx="5400040" cy="1360170"/>
@@ -7439,6 +7190,9 @@
     <w:p/>
     <w:p>
       <w:r>
+        <w:rPr>
+          <w:noProof/>
+        </w:rPr>
         <w:drawing>
           <wp:inline distT="0" distB="0" distL="0" distR="0" wp14:anchorId="497FEC81" wp14:editId="16A0C172">
             <wp:extent cx="5400040" cy="1887855"/>
@@ -7490,15 +7244,7 @@
         <w:jc w:val="both"/>
       </w:pPr>
       <w:r>
-        <w:t xml:space="preserve">Para comenzar entregaremos el formulario de Create, Update o </w:t>
-      </w:r>
-      <w:proofErr w:type="spellStart"/>
-      <w:r>
-        <w:t>Publish</w:t>
-      </w:r>
-      <w:proofErr w:type="spellEnd"/>
-      <w:r>
-        <w:t xml:space="preserve"> vacío, se ha seguido el mismo procedimiento para las tres.</w:t>
+        <w:t>Para comenzar entregaremos el formulario de Create, Update o Publish vacío, se ha seguido el mismo procedimiento para las tres.</w:t>
       </w:r>
       <w:r>
         <w:t xml:space="preserve"> En este caso entregamos el formulario de Create [8].</w:t>
@@ -7506,8 +7252,11 @@
     </w:p>
     <w:p>
       <w:r>
+        <w:rPr>
+          <w:noProof/>
+        </w:rPr>
         <w:drawing>
-          <wp:anchor distT="0" distB="0" distL="114300" distR="114300" simplePos="0" relativeHeight="251665408" behindDoc="0" locked="0" layoutInCell="1" allowOverlap="1" wp14:anchorId="69C995EC" wp14:editId="53A708C0">
+          <wp:anchor distT="0" distB="0" distL="114300" distR="114300" simplePos="0" relativeHeight="251665408" behindDoc="0" locked="0" layoutInCell="1" allowOverlap="1" wp14:anchorId="69C995EC" wp14:editId="16F7BCB4">
             <wp:simplePos x="0" y="0"/>
             <wp:positionH relativeFrom="margin">
               <wp:align>center</wp:align>
@@ -7579,31 +7328,7 @@
         <w:jc w:val="both"/>
       </w:pPr>
       <w:r>
-        <w:t xml:space="preserve">En concreto, para el formulario de creación (create) de Flight </w:t>
-      </w:r>
-      <w:proofErr w:type="spellStart"/>
-      <w:r>
-        <w:t>Assignment</w:t>
-      </w:r>
-      <w:proofErr w:type="spellEnd"/>
-      <w:r>
-        <w:t xml:space="preserve">, se rellenó un único atributo dejando el resto vacíos. Por ejemplo, se completó el primer campo, </w:t>
-      </w:r>
-      <w:proofErr w:type="spellStart"/>
-      <w:r>
-        <w:t>Duty</w:t>
-      </w:r>
-      <w:proofErr w:type="spellEnd"/>
-      <w:r>
-        <w:t xml:space="preserve">, con el valor PILOT, mientras que los demás campos quedaron sin rellenar. Al enviar el formulario con únicamente </w:t>
-      </w:r>
-      <w:proofErr w:type="spellStart"/>
-      <w:r>
-        <w:t>Duty</w:t>
-      </w:r>
-      <w:proofErr w:type="spellEnd"/>
-      <w:r>
-        <w:t xml:space="preserve"> = PILOT</w:t>
+        <w:t>En concreto, para el formulario de creación (create) de Flight Assignment, se rellenó un único atributo dejando el resto vacíos. Por ejemplo, se completó el primer campo, Duty, con el valor PILOT, mientras que los demás campos quedaron sin rellenar. Al enviar el formulario con únicamente Duty = PILOT</w:t>
       </w:r>
       <w:r>
         <w:t xml:space="preserve"> [9]</w:t>
@@ -7618,15 +7343,7 @@
       </w:pPr>
       <w:r>
         <w:lastRenderedPageBreak/>
-        <w:t xml:space="preserve">A continuación, se modificó el valor del campo </w:t>
-      </w:r>
-      <w:proofErr w:type="spellStart"/>
-      <w:r>
-        <w:t>Duty</w:t>
-      </w:r>
-      <w:proofErr w:type="spellEnd"/>
-      <w:r>
-        <w:t xml:space="preserve"> a COPILOT y se repitió el mismo procedimiento, asegurando que las validaciones se comportaran correctamente en cada caso.</w:t>
+        <w:t>A continuación, se modificó el valor del campo Duty a COPILOT y se repitió el mismo procedimiento, asegurando que las validaciones se comportaran correctamente en cada caso.</w:t>
       </w:r>
     </w:p>
     <w:p>
@@ -7634,8 +7351,11 @@
         <w:jc w:val="center"/>
       </w:pPr>
       <w:r>
+        <w:rPr>
+          <w:noProof/>
+        </w:rPr>
         <w:drawing>
-          <wp:anchor distT="0" distB="0" distL="114300" distR="114300" simplePos="0" relativeHeight="251668480" behindDoc="0" locked="0" layoutInCell="1" allowOverlap="1" wp14:anchorId="34BC2DFC" wp14:editId="7175DC18">
+          <wp:anchor distT="0" distB="0" distL="114300" distR="114300" simplePos="0" relativeHeight="251668480" behindDoc="0" locked="0" layoutInCell="1" allowOverlap="1" wp14:anchorId="34BC2DFC" wp14:editId="75FD717D">
             <wp:simplePos x="0" y="0"/>
             <wp:positionH relativeFrom="margin">
               <wp:align>center</wp:align>
@@ -7710,15 +7430,7 @@
         <w:t>,</w:t>
       </w:r>
       <w:r>
-        <w:t xml:space="preserve"> se ha completado con los valores de “</w:t>
-      </w:r>
-      <w:proofErr w:type="spellStart"/>
-      <w:r>
-        <w:t>Sample</w:t>
-      </w:r>
-      <w:proofErr w:type="spellEnd"/>
-      <w:r>
-        <w:t>-Data”</w:t>
+        <w:t xml:space="preserve"> se ha completado con los valores de “Sample-Data”</w:t>
       </w:r>
       <w:r>
         <w:t>,</w:t>
@@ -7732,8 +7444,11 @@
     </w:p>
     <w:p>
       <w:r>
+        <w:rPr>
+          <w:noProof/>
+        </w:rPr>
         <w:drawing>
-          <wp:anchor distT="0" distB="0" distL="114300" distR="114300" simplePos="0" relativeHeight="251666432" behindDoc="0" locked="0" layoutInCell="1" allowOverlap="1" wp14:anchorId="33CAFA06" wp14:editId="7FFC78BE">
+          <wp:anchor distT="0" distB="0" distL="114300" distR="114300" simplePos="0" relativeHeight="251666432" behindDoc="0" locked="0" layoutInCell="1" allowOverlap="1" wp14:anchorId="33CAFA06" wp14:editId="4BC23F26">
             <wp:simplePos x="0" y="0"/>
             <wp:positionH relativeFrom="margin">
               <wp:align>center</wp:align>
@@ -7799,6 +7514,9 @@
     </w:p>
     <w:p>
       <w:r>
+        <w:rPr>
+          <w:noProof/>
+        </w:rPr>
         <w:lastRenderedPageBreak/>
         <w:drawing>
           <wp:inline distT="0" distB="0" distL="0" distR="0" wp14:anchorId="34C51D37" wp14:editId="08E32D61">
@@ -7840,6 +7558,9 @@
     <w:p/>
     <w:p>
       <w:r>
+        <w:rPr>
+          <w:noProof/>
+        </w:rPr>
         <w:drawing>
           <wp:inline distT="0" distB="0" distL="0" distR="0" wp14:anchorId="208B2134" wp14:editId="39BCF86F">
             <wp:extent cx="5400040" cy="2098040"/>
@@ -7880,6 +7601,9 @@
     <w:p/>
     <w:p>
       <w:r>
+        <w:rPr>
+          <w:noProof/>
+        </w:rPr>
         <w:drawing>
           <wp:inline distT="0" distB="0" distL="0" distR="0" wp14:anchorId="5577D50F" wp14:editId="3F7F88FA">
             <wp:extent cx="5400040" cy="1975485"/>
@@ -7935,15 +7659,7 @@
         <w:t xml:space="preserve"> </w:t>
       </w:r>
       <w:r>
-        <w:t xml:space="preserve">Nos </w:t>
-      </w:r>
-      <w:proofErr w:type="spellStart"/>
-      <w:r>
-        <w:t>deslogueamos</w:t>
-      </w:r>
-      <w:proofErr w:type="spellEnd"/>
-      <w:r>
-        <w:t xml:space="preserve"> y a</w:t>
+        <w:t>Nos deslogueamos y a</w:t>
       </w:r>
       <w:r>
         <w:t>ccedemos a</w:t>
@@ -7954,48 +7670,28 @@
       <w:r>
         <w:t xml:space="preserve"> rol de </w:t>
       </w:r>
-      <w:proofErr w:type="spellStart"/>
       <w:r>
         <w:t>Administrator</w:t>
       </w:r>
-      <w:proofErr w:type="spellEnd"/>
       <w:r>
         <w:t xml:space="preserve">, en el apartado de </w:t>
       </w:r>
-      <w:proofErr w:type="spellStart"/>
-      <w:r>
-        <w:t>Shut</w:t>
-      </w:r>
-      <w:proofErr w:type="spellEnd"/>
-      <w:r>
-        <w:t xml:space="preserve"> </w:t>
-      </w:r>
-      <w:proofErr w:type="spellStart"/>
-      <w:r>
-        <w:t>System</w:t>
-      </w:r>
-      <w:proofErr w:type="spellEnd"/>
-      <w:r>
-        <w:t xml:space="preserve"> Down</w:t>
+      <w:r>
+        <w:t>Shut System Down</w:t>
       </w:r>
       <w:r>
         <w:t xml:space="preserve"> [11]</w:t>
       </w:r>
       <w:r>
-        <w:t xml:space="preserve">, para dejar de correr el </w:t>
-      </w:r>
-      <w:proofErr w:type="spellStart"/>
-      <w:r>
-        <w:t>launcher</w:t>
-      </w:r>
-      <w:proofErr w:type="spellEnd"/>
-      <w:r>
-        <w:t xml:space="preserve">. </w:t>
+        <w:t xml:space="preserve">, para dejar de correr el launcher. </w:t>
       </w:r>
     </w:p>
     <w:p/>
     <w:p>
       <w:r>
+        <w:rPr>
+          <w:noProof/>
+        </w:rPr>
         <w:lastRenderedPageBreak/>
         <w:drawing>
           <wp:inline distT="0" distB="0" distL="0" distR="0" wp14:anchorId="03215373" wp14:editId="3DADD306">
@@ -8052,28 +7748,7 @@
         <w:jc w:val="both"/>
       </w:pPr>
       <w:r>
-        <w:t xml:space="preserve">Para la generación del </w:t>
-      </w:r>
-      <w:proofErr w:type="gramStart"/>
-      <w:r>
-        <w:t>archivo .</w:t>
-      </w:r>
-      <w:proofErr w:type="spellStart"/>
-      <w:r>
-        <w:t>hack</w:t>
-      </w:r>
-      <w:proofErr w:type="spellEnd"/>
-      <w:proofErr w:type="gramEnd"/>
-      <w:r>
-        <w:t xml:space="preserve"> se ha verificado que, al modificar el identificador (id) del Flight </w:t>
-      </w:r>
-      <w:proofErr w:type="spellStart"/>
-      <w:r>
-        <w:t>Assignment</w:t>
-      </w:r>
-      <w:proofErr w:type="spellEnd"/>
-      <w:r>
-        <w:t xml:space="preserve"> que se intenta hackear, no sea posible crear, actualizar o publicar uno que corresponda a:</w:t>
+        <w:t>Para la generación del archivo .hack se ha verificado que, al modificar el identificador (id) del Flight Assignment que se intenta hackear, no sea posible crear, actualizar o publicar uno que corresponda a:</w:t>
       </w:r>
     </w:p>
     <w:p>
@@ -8091,23 +7766,7 @@
         <w:t xml:space="preserve">tros </w:t>
       </w:r>
       <w:r>
-        <w:t xml:space="preserve">Flight </w:t>
-      </w:r>
-      <w:proofErr w:type="spellStart"/>
-      <w:r>
-        <w:t>Crew</w:t>
-      </w:r>
-      <w:proofErr w:type="spellEnd"/>
-      <w:r>
-        <w:t xml:space="preserve"> </w:t>
-      </w:r>
-      <w:proofErr w:type="spellStart"/>
-      <w:r>
-        <w:t>Member</w:t>
-      </w:r>
-      <w:proofErr w:type="spellEnd"/>
-      <w:r>
-        <w:t>.</w:t>
+        <w:t>Flight Crew Member.</w:t>
       </w:r>
     </w:p>
     <w:p>
@@ -8133,13 +7792,8 @@
           <w:numId w:val="10"/>
         </w:numPr>
       </w:pPr>
-      <w:proofErr w:type="spellStart"/>
-      <w:r>
-        <w:t>ID’s</w:t>
-      </w:r>
-      <w:proofErr w:type="spellEnd"/>
-      <w:r>
-        <w:t xml:space="preserve"> </w:t>
+      <w:r>
+        <w:t xml:space="preserve">ID’s </w:t>
       </w:r>
       <w:r>
         <w:t>que no exista</w:t>
@@ -8166,23 +7820,7 @@
         <w:jc w:val="both"/>
       </w:pPr>
       <w:r>
-        <w:t xml:space="preserve">Respecto a los campos del formulario, se comprobó que en el campo </w:t>
-      </w:r>
-      <w:proofErr w:type="spellStart"/>
-      <w:r>
-        <w:t>Leg</w:t>
-      </w:r>
-      <w:proofErr w:type="spellEnd"/>
-      <w:r>
-        <w:t xml:space="preserve"> no sea posible crear, actualizar o publicar un Flight </w:t>
-      </w:r>
-      <w:proofErr w:type="spellStart"/>
-      <w:r>
-        <w:t>Assignment</w:t>
-      </w:r>
-      <w:proofErr w:type="spellEnd"/>
-      <w:r>
-        <w:t>:</w:t>
+        <w:t>Respecto a los campos del formulario, se comprobó que en el campo Leg no sea posible crear, actualizar o publicar un Flight Assignment:</w:t>
       </w:r>
     </w:p>
     <w:p>
@@ -8197,15 +7835,7 @@
         <w:t>C</w:t>
       </w:r>
       <w:r>
-        <w:t xml:space="preserve">on una </w:t>
-      </w:r>
-      <w:proofErr w:type="spellStart"/>
-      <w:r>
-        <w:t>Leg</w:t>
-      </w:r>
-      <w:proofErr w:type="spellEnd"/>
-      <w:r>
-        <w:t xml:space="preserve"> que pertenezca a otra aerolínea</w:t>
+        <w:t>on una Leg que pertenezca a otra aerolínea</w:t>
       </w:r>
       <w:r>
         <w:t>.</w:t>
@@ -8220,15 +7850,7 @@
         </w:numPr>
       </w:pPr>
       <w:r>
-        <w:t xml:space="preserve">Con una </w:t>
-      </w:r>
-      <w:proofErr w:type="spellStart"/>
-      <w:r>
-        <w:t>Leg</w:t>
-      </w:r>
-      <w:proofErr w:type="spellEnd"/>
-      <w:r>
-        <w:t xml:space="preserve"> que no exista.</w:t>
+        <w:t>Con una Leg que no exista.</w:t>
       </w:r>
       <w:r>
         <w:t xml:space="preserve"> </w:t>
@@ -8244,47 +7866,7 @@
         <w:jc w:val="both"/>
       </w:pPr>
       <w:r>
-        <w:t xml:space="preserve">Todos los intentos de hackeo descritos anteriormente resultarán en el mensaje de error </w:t>
-      </w:r>
-      <w:proofErr w:type="spellStart"/>
-      <w:r>
-        <w:t>Not</w:t>
-      </w:r>
-      <w:proofErr w:type="spellEnd"/>
-      <w:r>
-        <w:t xml:space="preserve"> </w:t>
-      </w:r>
-      <w:proofErr w:type="spellStart"/>
-      <w:r>
-        <w:t>Authorised</w:t>
-      </w:r>
-      <w:proofErr w:type="spellEnd"/>
-      <w:r>
-        <w:t xml:space="preserve"> [12], excepto aquellos que involucran la inserción de valores inválidos, los cuales generan mensajes de “</w:t>
-      </w:r>
-      <w:proofErr w:type="spellStart"/>
-      <w:r>
-        <w:t>Invalid</w:t>
-      </w:r>
-      <w:proofErr w:type="spellEnd"/>
-      <w:r>
-        <w:t xml:space="preserve"> Value” [13]. Por otro lado, los campos marcados como </w:t>
-      </w:r>
-      <w:proofErr w:type="spellStart"/>
-      <w:r>
-        <w:t>readOnly</w:t>
-      </w:r>
-      <w:proofErr w:type="spellEnd"/>
-      <w:r>
-        <w:t xml:space="preserve"> pueden ser modificados en el formulario, pero como no se procesan mediante el método </w:t>
-      </w:r>
-      <w:proofErr w:type="spellStart"/>
-      <w:r>
-        <w:t>bind</w:t>
-      </w:r>
-      <w:proofErr w:type="spellEnd"/>
-      <w:r>
-        <w:t>, dichos cambios no se aplicarán cuando se publique, cree o actualice el registro</w:t>
+        <w:t>Todos los intentos de hackeo descritos anteriormente resultarán en el mensaje de error Not Authorised [12], excepto aquellos que involucran la inserción de valores inválidos, los cuales generan mensajes de “Invalid Value” [13]. Por otro lado, los campos marcados como readOnly pueden ser modificados en el formulario, pero como no se procesan mediante el método bind, dichos cambios no se aplicarán cuando se publique, cree o actualice el registro</w:t>
       </w:r>
       <w:r>
         <w:t>.</w:t>
@@ -8295,8 +7877,11 @@
         <w:jc w:val="center"/>
       </w:pPr>
       <w:r>
+        <w:rPr>
+          <w:noProof/>
+        </w:rPr>
         <w:drawing>
-          <wp:anchor distT="0" distB="0" distL="114300" distR="114300" simplePos="0" relativeHeight="251670528" behindDoc="0" locked="0" layoutInCell="1" allowOverlap="1" wp14:anchorId="507CD2CD" wp14:editId="3BABCCF4">
+          <wp:anchor distT="0" distB="0" distL="114300" distR="114300" simplePos="0" relativeHeight="251670528" behindDoc="0" locked="0" layoutInCell="1" allowOverlap="1" wp14:anchorId="507CD2CD" wp14:editId="0E9380D6">
             <wp:simplePos x="0" y="0"/>
             <wp:positionH relativeFrom="margin">
               <wp:align>center</wp:align>
@@ -8356,6 +7941,9 @@
     </w:p>
     <w:p>
       <w:r>
+        <w:rPr>
+          <w:noProof/>
+        </w:rPr>
         <w:lastRenderedPageBreak/>
         <w:drawing>
           <wp:anchor distT="0" distB="0" distL="114300" distR="114300" simplePos="0" relativeHeight="251676672" behindDoc="0" locked="0" layoutInCell="1" allowOverlap="1" wp14:anchorId="74B81034" wp14:editId="57801830">
@@ -8410,6 +7998,9 @@
     </w:p>
     <w:p>
       <w:r>
+        <w:rPr>
+          <w:noProof/>
+        </w:rPr>
         <w:drawing>
           <wp:inline distT="0" distB="0" distL="0" distR="0" wp14:anchorId="14B6F87D" wp14:editId="67CEBFBC">
             <wp:extent cx="5400040" cy="1752600"/>
@@ -8461,51 +8052,25 @@
         <w:pStyle w:val="Ttulo3"/>
       </w:pPr>
       <w:bookmarkStart w:id="13" w:name="_LIST,_SHOW"/>
-      <w:bookmarkStart w:id="14" w:name="_Toc199172531"/>
+      <w:bookmarkStart w:id="14" w:name="_Toc199173321"/>
       <w:bookmarkEnd w:id="13"/>
       <w:r>
-        <w:t xml:space="preserve">LIST, </w:t>
-      </w:r>
-      <w:proofErr w:type="gramStart"/>
-      <w:r>
-        <w:t>SHOW</w:t>
+        <w:t>LIST, SHOW</w:t>
       </w:r>
       <w:bookmarkEnd w:id="14"/>
-      <w:proofErr w:type="gramEnd"/>
     </w:p>
     <w:p>
       <w:pPr>
         <w:jc w:val="both"/>
       </w:pPr>
       <w:r>
-        <w:t xml:space="preserve">Para la generación del </w:t>
-      </w:r>
-      <w:proofErr w:type="gramStart"/>
-      <w:r>
-        <w:t>archivo .</w:t>
-      </w:r>
-      <w:proofErr w:type="spellStart"/>
-      <w:r>
-        <w:t>saf</w:t>
-      </w:r>
-      <w:r>
-        <w:t>e</w:t>
-      </w:r>
-      <w:proofErr w:type="spellEnd"/>
-      <w:proofErr w:type="gramEnd"/>
-      <w:r>
-        <w:t>, s</w:t>
-      </w:r>
-      <w:r>
-        <w:t xml:space="preserve">e ha verificado que todos los Flight </w:t>
-      </w:r>
-      <w:proofErr w:type="spellStart"/>
-      <w:r>
-        <w:t>Assignment</w:t>
-      </w:r>
-      <w:proofErr w:type="spellEnd"/>
-      <w:r>
-        <w:t xml:space="preserve"> se muestren correctamente en pantalla</w:t>
+        <w:t>Para la generación del archivo .saf</w:t>
+      </w:r>
+      <w:r>
+        <w:t>e, s</w:t>
+      </w:r>
+      <w:r>
+        <w:t>e ha verificado que todos los Flight Assignment se muestren correctamente en pantalla</w:t>
       </w:r>
       <w:r>
         <w:t xml:space="preserve"> [14]</w:t>
@@ -8526,27 +8091,17 @@
         <w:t xml:space="preserve"> publicación</w:t>
       </w:r>
       <w:r>
-        <w:t xml:space="preserve">, borrado, o mostrar los </w:t>
-      </w:r>
-      <w:proofErr w:type="spellStart"/>
-      <w:r>
-        <w:t>Activity</w:t>
-      </w:r>
-      <w:proofErr w:type="spellEnd"/>
-      <w:r>
-        <w:t xml:space="preserve"> Log que existen dentro de ese Flight </w:t>
-      </w:r>
-      <w:proofErr w:type="spellStart"/>
-      <w:r>
-        <w:t>Assignment</w:t>
-      </w:r>
-      <w:proofErr w:type="spellEnd"/>
+        <w:t>, borrado, o mostrar los Activity Log que existen dentro de ese Flight Assignment</w:t>
+      </w:r>
       <w:r>
         <w:t>.</w:t>
       </w:r>
     </w:p>
     <w:p>
       <w:r>
+        <w:rPr>
+          <w:noProof/>
+        </w:rPr>
         <w:drawing>
           <wp:inline distT="0" distB="0" distL="0" distR="0" wp14:anchorId="03597355" wp14:editId="244C6B7F">
             <wp:extent cx="5400040" cy="2909570"/>
@@ -8595,6 +8150,9 @@
     <w:p/>
     <w:p>
       <w:r>
+        <w:rPr>
+          <w:noProof/>
+        </w:rPr>
         <w:lastRenderedPageBreak/>
         <w:drawing>
           <wp:inline distT="0" distB="0" distL="0" distR="0" wp14:anchorId="53839D99" wp14:editId="002A22F2">
@@ -8647,83 +8205,39 @@
         <w:jc w:val="both"/>
       </w:pPr>
       <w:r>
-        <w:t xml:space="preserve">Para la generación del </w:t>
-      </w:r>
-      <w:proofErr w:type="gramStart"/>
-      <w:r>
-        <w:t>archivo .</w:t>
-      </w:r>
-      <w:proofErr w:type="spellStart"/>
-      <w:r>
-        <w:t>hack</w:t>
-      </w:r>
-      <w:proofErr w:type="spellEnd"/>
-      <w:proofErr w:type="gramEnd"/>
+        <w:t>Para la generación del archivo .hack</w:t>
+      </w:r>
       <w:r>
         <w:t xml:space="preserve"> s</w:t>
       </w:r>
       <w:r>
-        <w:t xml:space="preserve">e ha comprobado que otros roles, como </w:t>
-      </w:r>
-      <w:proofErr w:type="spellStart"/>
-      <w:r>
-        <w:t>Agent</w:t>
-      </w:r>
-      <w:proofErr w:type="spellEnd"/>
-      <w:r>
-        <w:t xml:space="preserve">, </w:t>
-      </w:r>
-      <w:proofErr w:type="spellStart"/>
-      <w:r>
-        <w:t>Administrator</w:t>
-      </w:r>
-      <w:proofErr w:type="spellEnd"/>
-      <w:r>
-        <w:t xml:space="preserve"> o Anonymous,</w:t>
+        <w:t>e ha comprobado que otros roles, como Agent, Administrator o Anonymous,</w:t>
       </w:r>
       <w:r>
         <w:t xml:space="preserve"> no</w:t>
       </w:r>
       <w:r>
-        <w:t xml:space="preserve"> puedan listar los Flight </w:t>
-      </w:r>
-      <w:proofErr w:type="spellStart"/>
-      <w:r>
-        <w:t>Assignment</w:t>
-      </w:r>
-      <w:proofErr w:type="spellEnd"/>
+        <w:t xml:space="preserve"> puedan listar los Flight Assignment</w:t>
+      </w:r>
       <w:r>
         <w:t xml:space="preserve"> [16]</w:t>
       </w:r>
       <w:r>
-        <w:t>. En cuanto a la acción de mostrar (</w:t>
-      </w:r>
-      <w:proofErr w:type="gramStart"/>
-      <w:r>
-        <w:t>show</w:t>
-      </w:r>
-      <w:proofErr w:type="gramEnd"/>
-      <w:r>
-        <w:t>)</w:t>
+        <w:t>. En cuanto a la acción de mostrar (show)</w:t>
       </w:r>
       <w:r>
         <w:t xml:space="preserve"> [17]</w:t>
       </w:r>
       <w:r>
-        <w:t xml:space="preserve">, se realizó una prueba similar, añadiendo que un miembro diferente no pueda visualizar el formulario de un Flight </w:t>
-      </w:r>
-      <w:proofErr w:type="spellStart"/>
-      <w:r>
-        <w:t>Assignment</w:t>
-      </w:r>
-      <w:proofErr w:type="spellEnd"/>
-      <w:r>
-        <w:t xml:space="preserve"> que pertenece a otro miembro.</w:t>
+        <w:t>, se realizó una prueba similar, añadiendo que un miembro diferente no pueda visualizar el formulario de un Flight Assignment que pertenece a otro miembro.</w:t>
       </w:r>
     </w:p>
     <w:p/>
     <w:p>
       <w:r>
+        <w:rPr>
+          <w:noProof/>
+        </w:rPr>
         <w:drawing>
           <wp:inline distT="0" distB="0" distL="0" distR="0" wp14:anchorId="02501A4B" wp14:editId="37F521DA">
             <wp:extent cx="5400040" cy="1972310"/>
@@ -8776,6 +8290,9 @@
     </w:p>
     <w:p>
       <w:r>
+        <w:rPr>
+          <w:noProof/>
+        </w:rPr>
         <w:drawing>
           <wp:inline distT="0" distB="0" distL="0" distR="0" wp14:anchorId="0E2D4DA8" wp14:editId="705FAF14">
             <wp:extent cx="5400040" cy="1937385"/>
@@ -8826,7 +8343,7 @@
         <w:pStyle w:val="Ttulo3"/>
       </w:pPr>
       <w:bookmarkStart w:id="15" w:name="_DELETE"/>
-      <w:bookmarkStart w:id="16" w:name="_Toc199172532"/>
+      <w:bookmarkStart w:id="16" w:name="_Toc199173322"/>
       <w:bookmarkEnd w:id="15"/>
       <w:r>
         <w:lastRenderedPageBreak/>
@@ -8847,107 +8364,48 @@
       <w:r>
         <w:t xml:space="preserve"> el </w:t>
       </w:r>
-      <w:proofErr w:type="gramStart"/>
       <w:r>
         <w:t xml:space="preserve">archivo </w:t>
       </w:r>
       <w:r>
-        <w:t>.</w:t>
-      </w:r>
-      <w:proofErr w:type="spellStart"/>
-      <w:r>
-        <w:t>safe</w:t>
-      </w:r>
-      <w:proofErr w:type="spellEnd"/>
-      <w:proofErr w:type="gramEnd"/>
+        <w:t>.safe</w:t>
+      </w:r>
+      <w:r>
+        <w:t>, se ha verificado que el usuario pueda eliminar correctamente el Flight Assignment que desee. Además, se comprobó que al sustituir en la URL la opción show por delete, se pueda ejecutar correctamente el método unbind, con el objetivo de aumentar los porcentajes de cobertura (coverage) en las pruebas.</w:t>
+      </w:r>
+    </w:p>
+    <w:p/>
+    <w:p>
+      <w:pPr>
+        <w:jc w:val="both"/>
+      </w:pPr>
+      <w:r>
+        <w:t xml:space="preserve">Para </w:t>
+      </w:r>
+      <w:r>
+        <w:t xml:space="preserve">generar </w:t>
+      </w:r>
+      <w:r>
+        <w:t xml:space="preserve">el </w:t>
+      </w:r>
+      <w:r>
+        <w:t xml:space="preserve">archivo </w:t>
+      </w:r>
+      <w:r>
+        <w:t>.hack</w:t>
+      </w:r>
       <w:r>
         <w:t>, s</w:t>
       </w:r>
       <w:r>
-        <w:t xml:space="preserve">e ha verificado que el usuario pueda eliminar correctamente el Flight </w:t>
-      </w:r>
-      <w:proofErr w:type="spellStart"/>
-      <w:r>
-        <w:t>Assignment</w:t>
-      </w:r>
-      <w:proofErr w:type="spellEnd"/>
-      <w:r>
-        <w:t xml:space="preserve"> que desee. Además, se comprobó que al sustituir en la URL la opción </w:t>
-      </w:r>
-      <w:proofErr w:type="gramStart"/>
-      <w:r>
-        <w:t>show</w:t>
-      </w:r>
-      <w:proofErr w:type="gramEnd"/>
-      <w:r>
-        <w:t xml:space="preserve"> por delete, se pueda ejecutar correctamente el método </w:t>
-      </w:r>
-      <w:proofErr w:type="spellStart"/>
-      <w:r>
-        <w:t>unbind</w:t>
-      </w:r>
-      <w:proofErr w:type="spellEnd"/>
-      <w:r>
-        <w:t>, con el objetivo de aumentar los porcentajes de cobertura (</w:t>
-      </w:r>
-      <w:proofErr w:type="spellStart"/>
-      <w:r>
-        <w:t>coverage</w:t>
-      </w:r>
-      <w:proofErr w:type="spellEnd"/>
-      <w:r>
-        <w:t>) en las pruebas.</w:t>
-      </w:r>
-    </w:p>
-    <w:p/>
-    <w:p>
-      <w:pPr>
-        <w:jc w:val="both"/>
-      </w:pPr>
-      <w:r>
-        <w:t xml:space="preserve">Para </w:t>
-      </w:r>
-      <w:r>
-        <w:t xml:space="preserve">generar </w:t>
-      </w:r>
-      <w:r>
-        <w:t xml:space="preserve">el </w:t>
-      </w:r>
-      <w:proofErr w:type="gramStart"/>
-      <w:r>
-        <w:t xml:space="preserve">archivo </w:t>
-      </w:r>
-      <w:r>
-        <w:t>.</w:t>
-      </w:r>
-      <w:proofErr w:type="spellStart"/>
-      <w:r>
-        <w:t>hack</w:t>
-      </w:r>
-      <w:proofErr w:type="spellEnd"/>
-      <w:proofErr w:type="gramEnd"/>
-      <w:r>
-        <w:t>, s</w:t>
-      </w:r>
-      <w:r>
         <w:t xml:space="preserve">e ha comprobado que al igual que en create, </w:t>
       </w:r>
-      <w:proofErr w:type="spellStart"/>
       <w:r>
         <w:t>u</w:t>
       </w:r>
       <w:r>
-        <w:t>pdate</w:t>
-      </w:r>
-      <w:proofErr w:type="spellEnd"/>
-      <w:r>
-        <w:t xml:space="preserve"> y </w:t>
-      </w:r>
-      <w:proofErr w:type="spellStart"/>
-      <w:r>
-        <w:t>publish</w:t>
-      </w:r>
-      <w:proofErr w:type="spellEnd"/>
+        <w:t>pdate y publish</w:t>
+      </w:r>
       <w:r>
         <w:t>:</w:t>
       </w:r>
@@ -8964,15 +8422,7 @@
         <w:t>N</w:t>
       </w:r>
       <w:r>
-        <w:t xml:space="preserve">o se puede eliminar un Flight </w:t>
-      </w:r>
-      <w:proofErr w:type="spellStart"/>
-      <w:r>
-        <w:t>Assigment</w:t>
-      </w:r>
-      <w:proofErr w:type="spellEnd"/>
-      <w:r>
-        <w:t xml:space="preserve"> que esté publicado</w:t>
+        <w:t>o se puede eliminar un Flight Assigment que esté publicado</w:t>
       </w:r>
       <w:r>
         <w:t>.</w:t>
@@ -8990,13 +8440,8 @@
         <w:t>Q</w:t>
       </w:r>
       <w:r>
-        <w:t xml:space="preserve">ue sea de otro </w:t>
-      </w:r>
-      <w:proofErr w:type="spellStart"/>
-      <w:r>
-        <w:t>member</w:t>
-      </w:r>
-      <w:proofErr w:type="spellEnd"/>
+        <w:t>ue sea de otro member</w:t>
+      </w:r>
       <w:r>
         <w:t>.</w:t>
       </w:r>
@@ -9039,7 +8484,7 @@
       <w:pPr>
         <w:pStyle w:val="Ttulo2"/>
       </w:pPr>
-      <w:bookmarkStart w:id="17" w:name="_Toc199172533"/>
+      <w:bookmarkStart w:id="17" w:name="_Toc199173323"/>
       <w:r>
         <w:t>PRUEBAS DE ACTIVITY LOG</w:t>
       </w:r>
@@ -9049,7 +8494,7 @@
       <w:pPr>
         <w:pStyle w:val="Ttulo3"/>
       </w:pPr>
-      <w:bookmarkStart w:id="18" w:name="_Toc199172534"/>
+      <w:bookmarkStart w:id="18" w:name="_Toc199173324"/>
       <w:r>
         <w:t>CREATE, UPDATE Y PUBLISH</w:t>
       </w:r>
@@ -9057,90 +8502,32 @@
     </w:p>
     <w:p>
       <w:r>
-        <w:t xml:space="preserve">Para generar el </w:t>
-      </w:r>
-      <w:proofErr w:type="gramStart"/>
-      <w:r>
-        <w:t>archivo .</w:t>
-      </w:r>
-      <w:proofErr w:type="spellStart"/>
-      <w:r>
-        <w:t>safe</w:t>
-      </w:r>
-      <w:proofErr w:type="spellEnd"/>
-      <w:proofErr w:type="gramEnd"/>
-      <w:r>
-        <w:t xml:space="preserve">, nos registramos con nuestro rol correspondiente, Flight </w:t>
-      </w:r>
-      <w:proofErr w:type="spellStart"/>
-      <w:r>
-        <w:t>Crew</w:t>
-      </w:r>
-      <w:proofErr w:type="spellEnd"/>
-      <w:r>
-        <w:t xml:space="preserve"> </w:t>
-      </w:r>
-      <w:proofErr w:type="spellStart"/>
-      <w:r>
-        <w:t>Member</w:t>
-      </w:r>
-      <w:proofErr w:type="spellEnd"/>
-      <w:r>
-        <w:t xml:space="preserve">, y accedemos a los </w:t>
-      </w:r>
-      <w:proofErr w:type="spellStart"/>
-      <w:r>
-        <w:t>Activity</w:t>
-      </w:r>
-      <w:proofErr w:type="spellEnd"/>
-      <w:r>
-        <w:t xml:space="preserve"> Log </w:t>
+        <w:t xml:space="preserve">Para generar el archivo .safe, nos registramos con nuestro rol correspondiente, Flight Crew Member, y accedemos a los Activity Log </w:t>
       </w:r>
       <w:r>
         <w:t xml:space="preserve">[18] </w:t>
       </w:r>
       <w:r>
-        <w:t xml:space="preserve">desde Flight </w:t>
-      </w:r>
-      <w:proofErr w:type="spellStart"/>
-      <w:r>
-        <w:t>Assignment</w:t>
-      </w:r>
-      <w:proofErr w:type="spellEnd"/>
-      <w:r>
-        <w:t>. A continuación, accedemos al formulario de Create [</w:t>
+        <w:t>desde Flight Assignment. A continuación, accedemos al formulario de Create [</w:t>
       </w:r>
       <w:r>
         <w:t>19</w:t>
       </w:r>
       <w:r>
-        <w:t xml:space="preserve">], Update, </w:t>
-      </w:r>
-      <w:proofErr w:type="spellStart"/>
-      <w:r>
-        <w:t>Publish</w:t>
-      </w:r>
-      <w:proofErr w:type="spellEnd"/>
-      <w:r>
-        <w:t xml:space="preserve"> o Delete [</w:t>
+        <w:t>], Update, Publish o Delete [</w:t>
       </w:r>
       <w:r>
         <w:t>20</w:t>
       </w:r>
       <w:r>
-        <w:t xml:space="preserve">] de Flight </w:t>
-      </w:r>
-      <w:proofErr w:type="spellStart"/>
-      <w:r>
-        <w:t>Assignment</w:t>
-      </w:r>
-      <w:proofErr w:type="spellEnd"/>
-      <w:r>
-        <w:t>.</w:t>
-      </w:r>
-    </w:p>
-    <w:p>
-      <w:r>
+        <w:t>] de Flight Assignment.</w:t>
+      </w:r>
+    </w:p>
+    <w:p>
+      <w:r>
+        <w:rPr>
+          <w:noProof/>
+        </w:rPr>
         <w:drawing>
           <wp:inline distT="0" distB="0" distL="0" distR="0" wp14:anchorId="4EE1DC6B" wp14:editId="0B9E3B18">
             <wp:extent cx="5400040" cy="1883410"/>
@@ -9194,6 +8581,9 @@
     </w:p>
     <w:p>
       <w:r>
+        <w:rPr>
+          <w:noProof/>
+        </w:rPr>
         <w:drawing>
           <wp:inline distT="0" distB="0" distL="0" distR="0" wp14:anchorId="32CAC6CF" wp14:editId="0A3ED0BC">
             <wp:extent cx="5400040" cy="1304925"/>
@@ -9248,6 +8638,9 @@
     <w:p/>
     <w:p>
       <w:r>
+        <w:rPr>
+          <w:noProof/>
+        </w:rPr>
         <w:lastRenderedPageBreak/>
         <w:drawing>
           <wp:inline distT="0" distB="0" distL="0" distR="0" wp14:anchorId="2A533B76" wp14:editId="568D8DF6">
@@ -9306,15 +8699,7 @@
         <w:jc w:val="both"/>
       </w:pPr>
       <w:r>
-        <w:t xml:space="preserve">Para comenzar entregaremos el formulario de Create, Update o </w:t>
-      </w:r>
-      <w:proofErr w:type="spellStart"/>
-      <w:r>
-        <w:t>Publish</w:t>
-      </w:r>
-      <w:proofErr w:type="spellEnd"/>
-      <w:r>
-        <w:t xml:space="preserve"> vacío, se ha seguido el mismo procedimiento para las tres. En este caso entregamos el formulario de Create [</w:t>
+        <w:t>Para comenzar entregaremos el formulario de Create, Update o Publish vacío, se ha seguido el mismo procedimiento para las tres. En este caso entregamos el formulario de Create [</w:t>
       </w:r>
       <w:r>
         <w:t>21</w:t>
@@ -9325,6 +8710,9 @@
     </w:p>
     <w:p>
       <w:r>
+        <w:rPr>
+          <w:noProof/>
+        </w:rPr>
         <w:drawing>
           <wp:inline distT="0" distB="0" distL="0" distR="0" wp14:anchorId="5F5E75C5" wp14:editId="2C33952C">
             <wp:extent cx="5400040" cy="1581785"/>
@@ -9392,38 +8780,20 @@
       <w:r>
         <w:t xml:space="preserve">En concreto, para el formulario de creación (create) de </w:t>
       </w:r>
-      <w:proofErr w:type="spellStart"/>
-      <w:r>
-        <w:t>Activity</w:t>
-      </w:r>
-      <w:proofErr w:type="spellEnd"/>
-      <w:r>
-        <w:t xml:space="preserve"> Log</w:t>
+      <w:r>
+        <w:t>Activity Log</w:t>
       </w:r>
       <w:r>
         <w:t xml:space="preserve">, se rellenó un único atributo dejando el resto vacíos. Por ejemplo, se completó el primer campo, </w:t>
       </w:r>
       <w:r>
-        <w:t xml:space="preserve">Type of </w:t>
-      </w:r>
-      <w:proofErr w:type="spellStart"/>
-      <w:r>
-        <w:t>Incident</w:t>
-      </w:r>
-      <w:proofErr w:type="spellEnd"/>
+        <w:t>Type of Incident</w:t>
+      </w:r>
       <w:r>
         <w:t xml:space="preserve">, con el valor </w:t>
       </w:r>
       <w:r>
-        <w:t xml:space="preserve">base del texto de </w:t>
-      </w:r>
-      <w:proofErr w:type="spellStart"/>
-      <w:r>
-        <w:t>Sample</w:t>
-      </w:r>
-      <w:proofErr w:type="spellEnd"/>
-      <w:r>
-        <w:t>-Data</w:t>
+        <w:t>base del texto de Sample-Data</w:t>
       </w:r>
       <w:r>
         <w:t xml:space="preserve">, mientras que los demás campos quedaron sin rellenar. Al enviar el formulario con únicamente </w:t>
@@ -9443,15 +8813,7 @@
         <w:t xml:space="preserve">A continuación, se modificó el valor del campo </w:t>
       </w:r>
       <w:r>
-        <w:t xml:space="preserve">Type of </w:t>
-      </w:r>
-      <w:proofErr w:type="spellStart"/>
-      <w:r>
-        <w:t>Incident</w:t>
-      </w:r>
-      <w:proofErr w:type="spellEnd"/>
-      <w:r>
-        <w:t xml:space="preserve"> </w:t>
+        <w:t xml:space="preserve">Type of Incident </w:t>
       </w:r>
       <w:r>
         <w:t>a</w:t>
@@ -9465,82 +8827,21 @@
     </w:p>
     <w:p>
       <w:r>
-        <w:t xml:space="preserve">En el campo </w:t>
-      </w:r>
-      <w:proofErr w:type="spellStart"/>
-      <w:r>
-        <w:t>Severity</w:t>
-      </w:r>
-      <w:proofErr w:type="spellEnd"/>
-      <w:r>
-        <w:t xml:space="preserve"> </w:t>
-      </w:r>
-      <w:proofErr w:type="spellStart"/>
-      <w:r>
-        <w:t>Level</w:t>
-      </w:r>
-      <w:proofErr w:type="spellEnd"/>
-      <w:r>
-        <w:t xml:space="preserve"> se realiza el mismo procedimiento, introduciendo valores enteros negativos, nulos, demasiado </w:t>
-      </w:r>
-      <w:proofErr w:type="spellStart"/>
-      <w:r>
-        <w:t>grandres</w:t>
-      </w:r>
-      <w:proofErr w:type="spellEnd"/>
-      <w:r>
-        <w:t>, etc.</w:t>
+        <w:t>En el campo Severity Level se realiza el mismo procedimiento, introduciendo valores enteros negativos, nulos, demasiado grandres, etc.</w:t>
       </w:r>
     </w:p>
     <w:p/>
     <w:p>
       <w:r>
-        <w:t xml:space="preserve">También se ha seguido los requisitos especificados, como “Un </w:t>
-      </w:r>
-      <w:proofErr w:type="spellStart"/>
-      <w:r>
-        <w:t>Activity</w:t>
-      </w:r>
-      <w:proofErr w:type="spellEnd"/>
-      <w:r>
-        <w:t xml:space="preserve"> Log no puede ser publicado si no lo está su Flight </w:t>
-      </w:r>
-      <w:proofErr w:type="spellStart"/>
-      <w:r>
-        <w:t>Assignment</w:t>
-      </w:r>
-      <w:proofErr w:type="spellEnd"/>
-      <w:r>
-        <w:t xml:space="preserve">”, para esto se ha eliminado el botón de </w:t>
-      </w:r>
-      <w:proofErr w:type="spellStart"/>
-      <w:r>
-        <w:t>publish</w:t>
-      </w:r>
-      <w:proofErr w:type="spellEnd"/>
-      <w:r>
-        <w:t xml:space="preserve"> de aquellos </w:t>
-      </w:r>
-      <w:proofErr w:type="spellStart"/>
-      <w:r>
-        <w:t>Activity</w:t>
-      </w:r>
-      <w:proofErr w:type="spellEnd"/>
-      <w:r>
-        <w:t xml:space="preserve"> Log que su Flight </w:t>
-      </w:r>
-      <w:proofErr w:type="spellStart"/>
-      <w:r>
-        <w:t>Assignment</w:t>
-      </w:r>
-      <w:proofErr w:type="spellEnd"/>
-      <w:r>
-        <w:t xml:space="preserve"> no esté publicado.</w:t>
+        <w:t>También se ha seguido los requisitos especificados, como “Un Activity Log no puede ser publicado si no lo está su Flight Assignment”, para esto se ha eliminado el botón de publish de aquellos Activity Log que su Flight Assignment no esté publicado.</w:t>
       </w:r>
     </w:p>
     <w:p/>
     <w:p>
       <w:r>
+        <w:rPr>
+          <w:noProof/>
+        </w:rPr>
         <w:lastRenderedPageBreak/>
         <w:drawing>
           <wp:inline distT="0" distB="0" distL="0" distR="0" wp14:anchorId="31AEF20C" wp14:editId="13A342D9">
@@ -9593,50 +8894,19 @@
         <w:jc w:val="both"/>
       </w:pPr>
       <w:r>
-        <w:t xml:space="preserve">Una vez se han comprobado todos los atributos del formulario, se crea uno con datos válidos y se envía. Nos </w:t>
-      </w:r>
-      <w:proofErr w:type="spellStart"/>
-      <w:r>
-        <w:t>deslogueamos</w:t>
-      </w:r>
-      <w:proofErr w:type="spellEnd"/>
-      <w:r>
-        <w:t xml:space="preserve"> y accedemos al rol de </w:t>
-      </w:r>
-      <w:proofErr w:type="spellStart"/>
+        <w:t xml:space="preserve">Una vez se han comprobado todos los atributos del formulario, se crea uno con datos válidos y se envía. Nos deslogueamos y accedemos al rol de </w:t>
+      </w:r>
       <w:r>
         <w:t>Administrator</w:t>
       </w:r>
-      <w:proofErr w:type="spellEnd"/>
       <w:r>
         <w:t xml:space="preserve">, en el apartado de </w:t>
       </w:r>
-      <w:proofErr w:type="spellStart"/>
-      <w:r>
-        <w:t>Shut</w:t>
-      </w:r>
-      <w:proofErr w:type="spellEnd"/>
-      <w:r>
-        <w:t xml:space="preserve"> </w:t>
-      </w:r>
-      <w:proofErr w:type="spellStart"/>
-      <w:r>
-        <w:t>System</w:t>
-      </w:r>
-      <w:proofErr w:type="spellEnd"/>
-      <w:r>
-        <w:t xml:space="preserve"> Down</w:t>
-      </w:r>
-      <w:r>
-        <w:t xml:space="preserve"> [11], para dejar de correr el </w:t>
-      </w:r>
-      <w:proofErr w:type="spellStart"/>
-      <w:r>
-        <w:t>launcher</w:t>
-      </w:r>
-      <w:proofErr w:type="spellEnd"/>
-      <w:r>
-        <w:t xml:space="preserve">. </w:t>
+      <w:r>
+        <w:t>Shut System Down</w:t>
+      </w:r>
+      <w:r>
+        <w:t xml:space="preserve"> [11], para dejar de correr el launcher. </w:t>
       </w:r>
     </w:p>
     <w:p/>
@@ -9645,28 +8915,10 @@
         <w:jc w:val="both"/>
       </w:pPr>
       <w:r>
-        <w:t xml:space="preserve">Para la generación del </w:t>
-      </w:r>
-      <w:proofErr w:type="gramStart"/>
-      <w:r>
-        <w:t>archivo .</w:t>
-      </w:r>
-      <w:proofErr w:type="spellStart"/>
-      <w:r>
-        <w:t>hack</w:t>
-      </w:r>
-      <w:proofErr w:type="spellEnd"/>
-      <w:proofErr w:type="gramEnd"/>
-      <w:r>
-        <w:t xml:space="preserve"> se ha verificado que, al modificar el identificador (id) del </w:t>
-      </w:r>
-      <w:proofErr w:type="spellStart"/>
-      <w:r>
-        <w:t>Activity</w:t>
-      </w:r>
-      <w:proofErr w:type="spellEnd"/>
-      <w:r>
-        <w:t xml:space="preserve"> Log</w:t>
+        <w:t xml:space="preserve">Para la generación del archivo .hack se ha verificado que, al modificar el identificador (id) del </w:t>
+      </w:r>
+      <w:r>
+        <w:t>Activity Log</w:t>
       </w:r>
       <w:r>
         <w:t xml:space="preserve"> que se intenta hackear, no sea posible crear, actualizar o publicar uno que corresponda a:</w:t>
@@ -9681,23 +8933,7 @@
         </w:numPr>
       </w:pPr>
       <w:r>
-        <w:t xml:space="preserve">Otros Flight </w:t>
-      </w:r>
-      <w:proofErr w:type="spellStart"/>
-      <w:r>
-        <w:t>Crew</w:t>
-      </w:r>
-      <w:proofErr w:type="spellEnd"/>
-      <w:r>
-        <w:t xml:space="preserve"> </w:t>
-      </w:r>
-      <w:proofErr w:type="spellStart"/>
-      <w:r>
-        <w:t>Member</w:t>
-      </w:r>
-      <w:proofErr w:type="spellEnd"/>
-      <w:r>
-        <w:t>.</w:t>
+        <w:t>Otros Flight Crew Member.</w:t>
       </w:r>
     </w:p>
     <w:p>
@@ -9720,13 +8956,8 @@
           <w:numId w:val="10"/>
         </w:numPr>
       </w:pPr>
-      <w:proofErr w:type="spellStart"/>
-      <w:r>
-        <w:t>ID’s</w:t>
-      </w:r>
-      <w:proofErr w:type="spellEnd"/>
-      <w:r>
-        <w:t xml:space="preserve"> que no exista</w:t>
+      <w:r>
+        <w:t>ID’s que no exista</w:t>
       </w:r>
     </w:p>
     <w:p>
@@ -9754,21 +8985,8 @@
       <w:r>
         <w:t xml:space="preserve">Respecto a los campos del formulario, se comprobó que en el campo </w:t>
       </w:r>
-      <w:proofErr w:type="spellStart"/>
-      <w:r>
-        <w:t>Severity</w:t>
-      </w:r>
-      <w:proofErr w:type="spellEnd"/>
-      <w:r>
-        <w:t xml:space="preserve"> </w:t>
-      </w:r>
-      <w:proofErr w:type="spellStart"/>
-      <w:r>
-        <w:t>Level</w:t>
-      </w:r>
-      <w:proofErr w:type="spellEnd"/>
-      <w:r>
-        <w:t xml:space="preserve"> no se pudieran introducir valores negativos desde las herramientas del desarrollador.</w:t>
+      <w:r>
+        <w:t>Severity Level no se pudieran introducir valores negativos desde las herramientas del desarrollador.</w:t>
       </w:r>
     </w:p>
     <w:p>
@@ -9781,8 +8999,11 @@
         <w:jc w:val="both"/>
       </w:pPr>
       <w:r>
+        <w:rPr>
+          <w:noProof/>
+        </w:rPr>
         <w:drawing>
-          <wp:anchor distT="0" distB="0" distL="114300" distR="114300" simplePos="0" relativeHeight="251677696" behindDoc="0" locked="0" layoutInCell="1" allowOverlap="1" wp14:anchorId="3797D8CF" wp14:editId="7DB91410">
+          <wp:anchor distT="0" distB="0" distL="114300" distR="114300" simplePos="0" relativeHeight="251677696" behindDoc="0" locked="0" layoutInCell="1" allowOverlap="1" wp14:anchorId="3797D8CF" wp14:editId="45DB7139">
             <wp:simplePos x="0" y="0"/>
             <wp:positionH relativeFrom="margin">
               <wp:align>right</wp:align>
@@ -9838,53 +9059,13 @@
         </w:drawing>
       </w:r>
       <w:r>
-        <w:t xml:space="preserve">Todos los intentos de hackeo descritos anteriormente resultarán en el mensaje de error </w:t>
-      </w:r>
-      <w:proofErr w:type="spellStart"/>
-      <w:r>
-        <w:t>Not</w:t>
-      </w:r>
-      <w:proofErr w:type="spellEnd"/>
-      <w:r>
-        <w:t xml:space="preserve"> </w:t>
-      </w:r>
-      <w:proofErr w:type="spellStart"/>
-      <w:r>
-        <w:t>Authorised</w:t>
-      </w:r>
-      <w:proofErr w:type="spellEnd"/>
-      <w:r>
-        <w:t xml:space="preserve"> [12], excepto aquellos que involucran la inserción de valores inválidos, los cuales generan mensajes de “</w:t>
-      </w:r>
-      <w:proofErr w:type="spellStart"/>
-      <w:r>
-        <w:t>Invalid</w:t>
-      </w:r>
-      <w:proofErr w:type="spellEnd"/>
-      <w:r>
-        <w:t xml:space="preserve"> Value” [</w:t>
+        <w:t>Todos los intentos de hackeo descritos anteriormente resultarán en el mensaje de error Not Authorised [12], excepto aquellos que involucran la inserción de valores inválidos, los cuales generan mensajes de “Invalid Value” [</w:t>
       </w:r>
       <w:r>
         <w:t>22</w:t>
       </w:r>
       <w:r>
-        <w:t xml:space="preserve">]. Por otro lado, los campos marcados como </w:t>
-      </w:r>
-      <w:proofErr w:type="spellStart"/>
-      <w:r>
-        <w:t>readOnly</w:t>
-      </w:r>
-      <w:proofErr w:type="spellEnd"/>
-      <w:r>
-        <w:t xml:space="preserve"> pueden ser modificados en el formulario, pero como no se procesan mediante el método </w:t>
-      </w:r>
-      <w:proofErr w:type="spellStart"/>
-      <w:r>
-        <w:t>bind</w:t>
-      </w:r>
-      <w:proofErr w:type="spellEnd"/>
-      <w:r>
-        <w:t>, dichos cambios no se aplicarán cuando se publique, cree o actualice el registro</w:t>
+        <w:t>]. Por otro lado, los campos marcados como readOnly pueden ser modificados en el formulario, pero como no se procesan mediante el método bind, dichos cambios no se aplicarán cuando se publique, cree o actualice el registro</w:t>
       </w:r>
       <w:r>
         <w:t>.</w:t>
@@ -9908,75 +9089,40 @@
       <w:pPr>
         <w:pStyle w:val="Ttulo3"/>
       </w:pPr>
-      <w:bookmarkStart w:id="19" w:name="_Toc199172535"/>
+      <w:bookmarkStart w:id="19" w:name="_Toc199173325"/>
       <w:r>
         <w:lastRenderedPageBreak/>
-        <w:t xml:space="preserve">LIST, </w:t>
-      </w:r>
-      <w:proofErr w:type="gramStart"/>
-      <w:r>
-        <w:t>SHOW</w:t>
+        <w:t>LIST, SHOW</w:t>
       </w:r>
       <w:bookmarkEnd w:id="19"/>
-      <w:proofErr w:type="gramEnd"/>
     </w:p>
     <w:p>
       <w:pPr>
         <w:jc w:val="both"/>
       </w:pPr>
       <w:r>
-        <w:t xml:space="preserve">Para la generación del </w:t>
-      </w:r>
-      <w:proofErr w:type="gramStart"/>
-      <w:r>
-        <w:t>archivo .</w:t>
-      </w:r>
-      <w:proofErr w:type="spellStart"/>
-      <w:r>
-        <w:t>saf</w:t>
-      </w:r>
-      <w:r>
-        <w:t>e</w:t>
-      </w:r>
-      <w:proofErr w:type="spellEnd"/>
-      <w:proofErr w:type="gramEnd"/>
-      <w:r>
-        <w:t>, s</w:t>
+        <w:t>Para la generación del archivo .saf</w:t>
+      </w:r>
+      <w:r>
+        <w:t>e, s</w:t>
       </w:r>
       <w:r>
         <w:t xml:space="preserve">e ha verificado que todos los </w:t>
       </w:r>
-      <w:proofErr w:type="spellStart"/>
-      <w:r>
-        <w:t>Activity</w:t>
-      </w:r>
-      <w:proofErr w:type="spellEnd"/>
-      <w:r>
-        <w:t xml:space="preserve"> Log</w:t>
+      <w:r>
+        <w:t>Activity Log</w:t>
       </w:r>
       <w:r>
         <w:t xml:space="preserve"> se muestren correctamente en pantalla</w:t>
       </w:r>
       <w:r>
-        <w:t xml:space="preserve"> [1</w:t>
-      </w:r>
-      <w:r>
-        <w:t>9</w:t>
-      </w:r>
-      <w:r>
-        <w:t>]</w:t>
+        <w:t xml:space="preserve"> [19]</w:t>
       </w:r>
       <w:r>
         <w:t>, así como que sus formularios</w:t>
       </w:r>
       <w:r>
-        <w:t xml:space="preserve"> [</w:t>
-      </w:r>
-      <w:r>
-        <w:t>20</w:t>
-      </w:r>
-      <w:r>
-        <w:t>]</w:t>
+        <w:t xml:space="preserve"> [20]</w:t>
       </w:r>
       <w:r>
         <w:t xml:space="preserve"> correspondientes estén disponibles para las acciones de actualización</w:t>
@@ -9988,10 +9134,7 @@
         <w:t xml:space="preserve"> publicación</w:t>
       </w:r>
       <w:r>
-        <w:t>, borrado</w:t>
-      </w:r>
-      <w:r>
-        <w:t>.</w:t>
+        <w:t>, borrado.</w:t>
       </w:r>
     </w:p>
     <w:p/>
@@ -10000,39 +9143,13 @@
         <w:jc w:val="both"/>
       </w:pPr>
       <w:r>
-        <w:t xml:space="preserve">Para la generación del </w:t>
-      </w:r>
-      <w:proofErr w:type="gramStart"/>
-      <w:r>
-        <w:t>archivo .</w:t>
-      </w:r>
-      <w:proofErr w:type="spellStart"/>
-      <w:r>
-        <w:t>hack</w:t>
-      </w:r>
-      <w:proofErr w:type="spellEnd"/>
-      <w:proofErr w:type="gramEnd"/>
+        <w:t>Para la generación del archivo .hack</w:t>
+      </w:r>
       <w:r>
         <w:t xml:space="preserve"> s</w:t>
       </w:r>
       <w:r>
-        <w:t xml:space="preserve">e ha comprobado que otros roles, como </w:t>
-      </w:r>
-      <w:proofErr w:type="spellStart"/>
-      <w:r>
-        <w:t>Agent</w:t>
-      </w:r>
-      <w:proofErr w:type="spellEnd"/>
-      <w:r>
-        <w:t xml:space="preserve">, </w:t>
-      </w:r>
-      <w:proofErr w:type="spellStart"/>
-      <w:r>
-        <w:t>Administrator</w:t>
-      </w:r>
-      <w:proofErr w:type="spellEnd"/>
-      <w:r>
-        <w:t xml:space="preserve"> o Anonymous,</w:t>
+        <w:t>e ha comprobado que otros roles, como Agent, Administrator o Anonymous,</w:t>
       </w:r>
       <w:r>
         <w:t xml:space="preserve"> no</w:t>
@@ -10040,58 +9157,25 @@
       <w:r>
         <w:t xml:space="preserve"> puedan listar los </w:t>
       </w:r>
-      <w:proofErr w:type="spellStart"/>
-      <w:r>
-        <w:t>Activity</w:t>
-      </w:r>
-      <w:proofErr w:type="spellEnd"/>
-      <w:r>
-        <w:t xml:space="preserve"> Log</w:t>
-      </w:r>
-      <w:r>
-        <w:t xml:space="preserve"> [</w:t>
-      </w:r>
-      <w:r>
-        <w:t>23</w:t>
-      </w:r>
-      <w:r>
-        <w:t>]</w:t>
-      </w:r>
-      <w:r>
-        <w:t>. En cuanto a la acción de mostrar (</w:t>
-      </w:r>
-      <w:proofErr w:type="gramStart"/>
-      <w:r>
-        <w:t>show</w:t>
-      </w:r>
-      <w:proofErr w:type="gramEnd"/>
-      <w:r>
-        <w:t>)</w:t>
-      </w:r>
-      <w:r>
-        <w:t xml:space="preserve"> [</w:t>
-      </w:r>
-      <w:r>
-        <w:t>24</w:t>
-      </w:r>
-      <w:r>
-        <w:t>]</w:t>
-      </w:r>
-      <w:r>
-        <w:t xml:space="preserve">, se realizó una prueba similar, añadiendo que un miembro diferente no pueda visualizar el formulario de un Flight </w:t>
-      </w:r>
-      <w:proofErr w:type="spellStart"/>
-      <w:r>
-        <w:t>Assignment</w:t>
-      </w:r>
-      <w:proofErr w:type="spellEnd"/>
-      <w:r>
-        <w:t xml:space="preserve"> que pertenece a otro miembro.</w:t>
+      <w:r>
+        <w:t>Activity Log [23]</w:t>
+      </w:r>
+      <w:r>
+        <w:t>. En cuanto a la acción de mostrar (show)</w:t>
+      </w:r>
+      <w:r>
+        <w:t xml:space="preserve"> [24]</w:t>
+      </w:r>
+      <w:r>
+        <w:t>, se realizó una prueba similar, añadiendo que un miembro diferente no pueda visualizar el formulario de un Flight Assignment que pertenece a otro miembro.</w:t>
       </w:r>
     </w:p>
     <w:p/>
     <w:p>
       <w:r>
+        <w:rPr>
+          <w:noProof/>
+        </w:rPr>
         <w:drawing>
           <wp:inline distT="0" distB="0" distL="0" distR="0" wp14:anchorId="655DBF81" wp14:editId="14A8AB2D">
             <wp:extent cx="5400040" cy="1943100"/>
@@ -10134,13 +9218,7 @@
         <w:jc w:val="center"/>
       </w:pPr>
       <w:r>
-        <w:t>[</w:t>
-      </w:r>
-      <w:r>
-        <w:t>23</w:t>
-      </w:r>
-      <w:r>
-        <w:t>]</w:t>
+        <w:t>[23]</w:t>
       </w:r>
     </w:p>
     <w:p>
@@ -10153,6 +9231,9 @@
         <w:jc w:val="center"/>
       </w:pPr>
       <w:r>
+        <w:rPr>
+          <w:noProof/>
+        </w:rPr>
         <w:drawing>
           <wp:inline distT="0" distB="0" distL="0" distR="0" wp14:anchorId="72B88A1F" wp14:editId="6B39B66E">
             <wp:extent cx="5400040" cy="1976755"/>
@@ -10195,20 +9276,14 @@
         <w:jc w:val="center"/>
       </w:pPr>
       <w:r>
-        <w:t>[</w:t>
-      </w:r>
-      <w:r>
-        <w:t>24</w:t>
-      </w:r>
-      <w:r>
-        <w:t>]</w:t>
+        <w:t>[24]</w:t>
       </w:r>
     </w:p>
     <w:p>
       <w:pPr>
         <w:pStyle w:val="Ttulo3"/>
       </w:pPr>
-      <w:bookmarkStart w:id="20" w:name="_Toc199172536"/>
+      <w:bookmarkStart w:id="20" w:name="_Toc199173326"/>
       <w:r>
         <w:t>DELETE</w:t>
       </w:r>
@@ -10219,55 +9294,13 @@
         <w:jc w:val="both"/>
       </w:pPr>
       <w:r>
-        <w:t xml:space="preserve">Para generar el </w:t>
-      </w:r>
-      <w:proofErr w:type="gramStart"/>
-      <w:r>
-        <w:t>archivo .</w:t>
-      </w:r>
-      <w:proofErr w:type="spellStart"/>
-      <w:r>
-        <w:t>safe</w:t>
-      </w:r>
-      <w:proofErr w:type="spellEnd"/>
-      <w:proofErr w:type="gramEnd"/>
-      <w:r>
-        <w:t xml:space="preserve">, se ha verificado que el usuario pueda eliminar correctamente el </w:t>
-      </w:r>
-      <w:proofErr w:type="spellStart"/>
-      <w:r>
-        <w:t>Activity</w:t>
-      </w:r>
-      <w:proofErr w:type="spellEnd"/>
-      <w:r>
-        <w:t xml:space="preserve"> Log</w:t>
-      </w:r>
-      <w:r>
-        <w:t xml:space="preserve"> que desee. Además, se comprobó que al sustituir en la URL la opción </w:t>
-      </w:r>
-      <w:proofErr w:type="gramStart"/>
-      <w:r>
-        <w:t>show</w:t>
-      </w:r>
-      <w:proofErr w:type="gramEnd"/>
-      <w:r>
-        <w:t xml:space="preserve"> por delete, se pueda ejecutar correctamente el método </w:t>
-      </w:r>
-      <w:proofErr w:type="spellStart"/>
-      <w:r>
-        <w:t>unbind</w:t>
-      </w:r>
-      <w:proofErr w:type="spellEnd"/>
-      <w:r>
-        <w:t>, con el objetivo de aumentar los porcentajes de cobertura (</w:t>
-      </w:r>
-      <w:proofErr w:type="spellStart"/>
-      <w:r>
-        <w:t>coverage</w:t>
-      </w:r>
-      <w:proofErr w:type="spellEnd"/>
-      <w:r>
-        <w:t>) en las pruebas.</w:t>
+        <w:t xml:space="preserve">Para generar el archivo .safe, se ha verificado que el usuario pueda eliminar correctamente el </w:t>
+      </w:r>
+      <w:r>
+        <w:t>Activity Log</w:t>
+      </w:r>
+      <w:r>
+        <w:t xml:space="preserve"> que desee. Además, se comprobó que al sustituir en la URL la opción show por delete, se pueda ejecutar correctamente el método unbind, con el objetivo de aumentar los porcentajes de cobertura (coverage) en las pruebas.</w:t>
       </w:r>
     </w:p>
     <w:p/>
@@ -10277,36 +9310,7 @@
       </w:pPr>
       <w:r>
         <w:lastRenderedPageBreak/>
-        <w:t xml:space="preserve">Para generar el </w:t>
-      </w:r>
-      <w:proofErr w:type="gramStart"/>
-      <w:r>
-        <w:t>archivo .</w:t>
-      </w:r>
-      <w:proofErr w:type="spellStart"/>
-      <w:r>
-        <w:t>hack</w:t>
-      </w:r>
-      <w:proofErr w:type="spellEnd"/>
-      <w:proofErr w:type="gramEnd"/>
-      <w:r>
-        <w:t xml:space="preserve">, se ha comprobado que al igual que en create, </w:t>
-      </w:r>
-      <w:proofErr w:type="spellStart"/>
-      <w:r>
-        <w:t>update</w:t>
-      </w:r>
-      <w:proofErr w:type="spellEnd"/>
-      <w:r>
-        <w:t xml:space="preserve"> y </w:t>
-      </w:r>
-      <w:proofErr w:type="spellStart"/>
-      <w:r>
-        <w:t>publish</w:t>
-      </w:r>
-      <w:proofErr w:type="spellEnd"/>
-      <w:r>
-        <w:t>:</w:t>
+        <w:t>Para generar el archivo .hack, se ha comprobado que al igual que en create, update y publish:</w:t>
       </w:r>
     </w:p>
     <w:p>
@@ -10318,18 +9322,7 @@
         </w:numPr>
       </w:pPr>
       <w:r>
-        <w:t xml:space="preserve">No se puede eliminar un </w:t>
-      </w:r>
-      <w:proofErr w:type="spellStart"/>
-      <w:r>
-        <w:t>Activity</w:t>
-      </w:r>
-      <w:proofErr w:type="spellEnd"/>
-      <w:r>
-        <w:t xml:space="preserve"> Log</w:t>
-      </w:r>
-      <w:r>
-        <w:t xml:space="preserve"> que esté publicado.</w:t>
+        <w:t>No se puede eliminar un Activity Log que esté publicado.</w:t>
       </w:r>
     </w:p>
     <w:p>
@@ -10341,15 +9334,7 @@
         </w:numPr>
       </w:pPr>
       <w:r>
-        <w:t xml:space="preserve">Que sea de otro </w:t>
-      </w:r>
-      <w:proofErr w:type="spellStart"/>
-      <w:r>
-        <w:t>member</w:t>
-      </w:r>
-      <w:proofErr w:type="spellEnd"/>
-      <w:r>
-        <w:t>.</w:t>
+        <w:t>Que sea de otro member.</w:t>
       </w:r>
     </w:p>
     <w:p>
@@ -10386,7 +9371,7 @@
         <w:pStyle w:val="Ttulo1"/>
       </w:pPr>
       <w:bookmarkStart w:id="21" w:name="_CHAPTER_ON_PERFORMANCE"/>
-      <w:bookmarkStart w:id="22" w:name="_Toc199172537"/>
+      <w:bookmarkStart w:id="22" w:name="_Toc199173327"/>
       <w:bookmarkEnd w:id="21"/>
       <w:r>
         <w:t>CAPÍTULO DE PRUEBAS DE RENDIMIENTO</w:t>
@@ -10397,7 +9382,7 @@
       <w:pPr>
         <w:pStyle w:val="Ttulo2"/>
       </w:pPr>
-      <w:bookmarkStart w:id="23" w:name="_Toc199172538"/>
+      <w:bookmarkStart w:id="23" w:name="_Toc199173328"/>
       <w:r>
         <w:t>GRÁFICOS DE RENDIMIENTO</w:t>
       </w:r>
@@ -10407,7 +9392,7 @@
       <w:pPr>
         <w:pStyle w:val="Ttulo3"/>
       </w:pPr>
-      <w:bookmarkStart w:id="24" w:name="_Toc199172539"/>
+      <w:bookmarkStart w:id="24" w:name="_Toc199173329"/>
       <w:r>
         <w:t>CON ÍNDICES</w:t>
       </w:r>
@@ -10415,6 +9400,9 @@
     </w:p>
     <w:p>
       <w:r>
+        <w:rPr>
+          <w:noProof/>
+        </w:rPr>
         <w:drawing>
           <wp:inline distT="0" distB="0" distL="0" distR="0" wp14:anchorId="0D78E936" wp14:editId="6F603F3E">
             <wp:extent cx="5400040" cy="4132580"/>
@@ -10476,7 +9464,7 @@
       <w:pPr>
         <w:pStyle w:val="Ttulo3"/>
       </w:pPr>
-      <w:bookmarkStart w:id="25" w:name="_Toc199172540"/>
+      <w:bookmarkStart w:id="25" w:name="_Toc199173330"/>
       <w:r>
         <w:lastRenderedPageBreak/>
         <w:t>SIN ÍNDICES</w:t>
@@ -10496,6 +9484,7 @@
         <w:rPr>
           <w:b/>
           <w:bCs/>
+          <w:noProof/>
           <w:sz w:val="32"/>
           <w:szCs w:val="32"/>
         </w:rPr>
@@ -10564,7 +9553,7 @@
       <w:pPr>
         <w:pStyle w:val="Ttulo3"/>
       </w:pPr>
-      <w:bookmarkStart w:id="26" w:name="_Toc199172541"/>
+      <w:bookmarkStart w:id="26" w:name="_Toc199173331"/>
       <w:r>
         <w:t>COMPARATIVAS DESDE OTRO ORDENADOR</w:t>
       </w:r>
@@ -10572,6 +9561,9 @@
     </w:p>
     <w:p>
       <w:r>
+        <w:rPr>
+          <w:noProof/>
+        </w:rPr>
         <w:drawing>
           <wp:inline distT="0" distB="0" distL="0" distR="0" wp14:anchorId="2C248B25" wp14:editId="27B70CC7">
             <wp:extent cx="5400040" cy="3739515"/>
@@ -10661,31 +9653,7 @@
         <w:t>lado,</w:t>
       </w:r>
       <w:r>
-        <w:t xml:space="preserve"> podemos observar que la petición más ineficiente es “</w:t>
-      </w:r>
-      <w:proofErr w:type="spellStart"/>
-      <w:r>
-        <w:t>list-completed</w:t>
-      </w:r>
-      <w:proofErr w:type="spellEnd"/>
-      <w:r>
-        <w:t xml:space="preserve">”, ya que es donde hay más Flight </w:t>
-      </w:r>
-      <w:proofErr w:type="spellStart"/>
-      <w:r>
-        <w:t>Assignment</w:t>
-      </w:r>
-      <w:proofErr w:type="spellEnd"/>
-      <w:r>
-        <w:t xml:space="preserve"> y tiene que obtener más datos del </w:t>
-      </w:r>
-      <w:proofErr w:type="spellStart"/>
-      <w:r>
-        <w:t>csv</w:t>
-      </w:r>
-      <w:proofErr w:type="spellEnd"/>
-      <w:r>
-        <w:t>.</w:t>
+        <w:t xml:space="preserve"> podemos observar que la petición más ineficiente es “list-completed”, ya que es donde hay más Flight Assignment y tiene que obtener más datos del csv.</w:t>
       </w:r>
       <w:r>
         <w:t xml:space="preserve"> Esta se ve resaltada en la comparativa de ordenadores [27].</w:t>
@@ -10696,7 +9664,7 @@
       <w:pPr>
         <w:pStyle w:val="Ttulo2"/>
       </w:pPr>
-      <w:bookmarkStart w:id="27" w:name="_Toc199172542"/>
+      <w:bookmarkStart w:id="27" w:name="_Toc199173332"/>
       <w:r>
         <w:t>INTERVALO DE CONFIANZA</w:t>
       </w:r>
@@ -10706,7 +9674,7 @@
       <w:pPr>
         <w:pStyle w:val="Ttulo3"/>
       </w:pPr>
-      <w:bookmarkStart w:id="28" w:name="_Toc199172543"/>
+      <w:bookmarkStart w:id="28" w:name="_Toc199173333"/>
       <w:r>
         <w:t>CON ÍNDICE</w:t>
       </w:r>
@@ -10714,6 +9682,9 @@
     </w:p>
     <w:p>
       <w:r>
+        <w:rPr>
+          <w:noProof/>
+        </w:rPr>
         <w:drawing>
           <wp:inline distT="0" distB="0" distL="0" distR="0" wp14:anchorId="7F0689D7" wp14:editId="44497765">
             <wp:extent cx="4403524" cy="2282024"/>
@@ -10763,7 +9734,7 @@
       <w:pPr>
         <w:pStyle w:val="Ttulo3"/>
       </w:pPr>
-      <w:bookmarkStart w:id="29" w:name="_Toc199172544"/>
+      <w:bookmarkStart w:id="29" w:name="_Toc199173334"/>
       <w:r>
         <w:t>SIN ÍNDICE</w:t>
       </w:r>
@@ -10771,6 +9742,9 @@
     </w:p>
     <w:p>
       <w:r>
+        <w:rPr>
+          <w:noProof/>
+        </w:rPr>
         <w:drawing>
           <wp:inline distT="0" distB="0" distL="0" distR="0" wp14:anchorId="4C12C8BF" wp14:editId="59759BFB">
             <wp:extent cx="3937011" cy="2655736"/>
@@ -10822,7 +9796,7 @@
       <w:pPr>
         <w:pStyle w:val="Ttulo3"/>
       </w:pPr>
-      <w:bookmarkStart w:id="30" w:name="_Toc199172545"/>
+      <w:bookmarkStart w:id="30" w:name="_Toc199173335"/>
       <w:r>
         <w:lastRenderedPageBreak/>
         <w:t>DESDE OTRO ORDENADOR</w:t>
@@ -10831,6 +9805,9 @@
     </w:p>
     <w:p>
       <w:r>
+        <w:rPr>
+          <w:noProof/>
+        </w:rPr>
         <w:drawing>
           <wp:inline distT="0" distB="0" distL="0" distR="0" wp14:anchorId="0F19CB57" wp14:editId="5D876BFA">
             <wp:extent cx="3818093" cy="2608028"/>
@@ -10896,15 +9873,7 @@
         <w:t xml:space="preserve">[29] </w:t>
       </w:r>
       <w:r>
-        <w:t xml:space="preserve">son prácticamente iguales, entre 7,10 y 8,45 ms aproximadamente, esto se debe a que como mencionamos antes, al no tener muchos datos los </w:t>
-      </w:r>
-      <w:proofErr w:type="spellStart"/>
-      <w:r>
-        <w:t>csv</w:t>
-      </w:r>
-      <w:proofErr w:type="spellEnd"/>
-      <w:r>
-        <w:t xml:space="preserve"> no se obtiene una gran diferencia de rendimiento. </w:t>
+        <w:t xml:space="preserve">son prácticamente iguales, entre 7,10 y 8,45 ms aproximadamente, esto se debe a que como mencionamos antes, al no tener muchos datos los csv no se obtiene una gran diferencia de rendimiento. </w:t>
       </w:r>
     </w:p>
     <w:p>
@@ -10935,7 +9904,7 @@
       <w:pPr>
         <w:pStyle w:val="Ttulo2"/>
       </w:pPr>
-      <w:bookmarkStart w:id="31" w:name="_Toc199172546"/>
+      <w:bookmarkStart w:id="31" w:name="_Toc199173336"/>
       <w:r>
         <w:t>CONTRASTE DE HIPÓTESIS</w:t>
       </w:r>
@@ -10945,7 +9914,7 @@
       <w:pPr>
         <w:pStyle w:val="Ttulo3"/>
       </w:pPr>
-      <w:bookmarkStart w:id="32" w:name="_Toc199172547"/>
+      <w:bookmarkStart w:id="32" w:name="_Toc199173337"/>
       <w:r>
         <w:t>SIN ÍNDICES Y CON ÍNDICES</w:t>
       </w:r>
@@ -10953,6 +9922,9 @@
     </w:p>
     <w:p>
       <w:r>
+        <w:rPr>
+          <w:noProof/>
+        </w:rPr>
         <w:drawing>
           <wp:anchor distT="0" distB="0" distL="114300" distR="114300" simplePos="0" relativeHeight="251678720" behindDoc="0" locked="0" layoutInCell="1" allowOverlap="1" wp14:anchorId="4C5E1B03" wp14:editId="70BF4C29">
             <wp:simplePos x="0" y="0"/>
@@ -11052,15 +10024,7 @@
         <w:jc w:val="both"/>
       </w:pPr>
       <w:r>
-        <w:t>El valor obtenido de p-value obtenido tras el z-</w:t>
-      </w:r>
-      <w:proofErr w:type="spellStart"/>
-      <w:r>
-        <w:t>analysis</w:t>
-      </w:r>
-      <w:proofErr w:type="spellEnd"/>
-      <w:r>
-        <w:t xml:space="preserve"> de Excel, se encuentra en la fila 11, en mi caso 0,7271</w:t>
+        <w:t>El valor obtenido de p-value obtenido tras el z-analysis de Excel, se encuentra en la fila 11, en mi caso 0,7271</w:t>
       </w:r>
       <w:r>
         <w:t xml:space="preserve"> [31]</w:t>
@@ -11082,7 +10046,7 @@
       <w:pPr>
         <w:pStyle w:val="Ttulo3"/>
       </w:pPr>
-      <w:bookmarkStart w:id="33" w:name="_Toc199172548"/>
+      <w:bookmarkStart w:id="33" w:name="_Toc199173338"/>
       <w:r>
         <w:lastRenderedPageBreak/>
         <w:t>COMPARATIVA DESDE OTRO ORDENADOR</w:t>
@@ -11102,6 +10066,7 @@
         <w:rPr>
           <w:b/>
           <w:bCs/>
+          <w:noProof/>
           <w:sz w:val="32"/>
           <w:szCs w:val="32"/>
         </w:rPr>
@@ -11371,7 +10336,7 @@
       <w:pPr>
         <w:pStyle w:val="Ttulo1"/>
       </w:pPr>
-      <w:bookmarkStart w:id="34" w:name="_Toc199172549"/>
+      <w:bookmarkStart w:id="34" w:name="_Toc199173339"/>
       <w:r>
         <w:lastRenderedPageBreak/>
         <w:t>BIBLIOGRAFÍA</w:t>
@@ -13292,6 +12257,7 @@
   <w:style w:type="character" w:default="1" w:styleId="Fuentedeprrafopredeter">
     <w:name w:val="Default Paragraph Font"/>
     <w:uiPriority w:val="1"/>
+    <w:semiHidden/>
     <w:unhideWhenUsed/>
   </w:style>
   <w:style w:type="table" w:default="1" w:styleId="Tablanormal">

</xml_diff>

<commit_message>
feat: :sparkles: Last changes
</commit_message>
<xml_diff>
--- a/reports/Student #3/Testing report Student#3.docx
+++ b/reports/Student #3/Testing report Student#3.docx
@@ -4123,7 +4123,7 @@
       <w:pPr>
         <w:pStyle w:val="Ttulo1"/>
       </w:pPr>
-      <w:bookmarkStart w:id="0" w:name="_Toc199173314"/>
+      <w:bookmarkStart w:id="0" w:name="_Toc199178411"/>
       <w:r>
         <w:lastRenderedPageBreak/>
         <w:t>ÍNDICE</w:t>
@@ -4185,7 +4185,7 @@
           <w:r>
             <w:fldChar w:fldCharType="separate"/>
           </w:r>
-          <w:hyperlink w:anchor="_Toc199173314" w:history="1">
+          <w:hyperlink w:anchor="_Toc199178411" w:history="1">
             <w:r>
               <w:rPr>
                 <w:rStyle w:val="Hipervnculo"/>
@@ -4212,7 +4212,7 @@
                 <w:noProof/>
                 <w:webHidden/>
               </w:rPr>
-              <w:instrText xml:space="preserve"> PAGEREF _Toc199173314 \h </w:instrText>
+              <w:instrText xml:space="preserve"> PAGEREF _Toc199178411 \h </w:instrText>
             </w:r>
             <w:r>
               <w:rPr>
@@ -4257,7 +4257,7 @@
               <w:lang w:eastAsia="es-ES"/>
             </w:rPr>
           </w:pPr>
-          <w:hyperlink w:anchor="_Toc199173315" w:history="1">
+          <w:hyperlink w:anchor="_Toc199178412" w:history="1">
             <w:r>
               <w:rPr>
                 <w:rStyle w:val="Hipervnculo"/>
@@ -4284,7 +4284,7 @@
                 <w:noProof/>
                 <w:webHidden/>
               </w:rPr>
-              <w:instrText xml:space="preserve"> PAGEREF _Toc199173315 \h </w:instrText>
+              <w:instrText xml:space="preserve"> PAGEREF _Toc199178412 \h </w:instrText>
             </w:r>
             <w:r>
               <w:rPr>
@@ -4329,7 +4329,7 @@
               <w:lang w:eastAsia="es-ES"/>
             </w:rPr>
           </w:pPr>
-          <w:hyperlink w:anchor="_Toc199173316" w:history="1">
+          <w:hyperlink w:anchor="_Toc199178413" w:history="1">
             <w:r>
               <w:rPr>
                 <w:rStyle w:val="Hipervnculo"/>
@@ -4356,7 +4356,7 @@
                 <w:noProof/>
                 <w:webHidden/>
               </w:rPr>
-              <w:instrText xml:space="preserve"> PAGEREF _Toc199173316 \h </w:instrText>
+              <w:instrText xml:space="preserve"> PAGEREF _Toc199178413 \h </w:instrText>
             </w:r>
             <w:r>
               <w:rPr>
@@ -4401,7 +4401,7 @@
               <w:lang w:eastAsia="es-ES"/>
             </w:rPr>
           </w:pPr>
-          <w:hyperlink w:anchor="_Toc199173317" w:history="1">
+          <w:hyperlink w:anchor="_Toc199178414" w:history="1">
             <w:r>
               <w:rPr>
                 <w:rStyle w:val="Hipervnculo"/>
@@ -4428,7 +4428,7 @@
                 <w:noProof/>
                 <w:webHidden/>
               </w:rPr>
-              <w:instrText xml:space="preserve"> PAGEREF _Toc199173317 \h </w:instrText>
+              <w:instrText xml:space="preserve"> PAGEREF _Toc199178414 \h </w:instrText>
             </w:r>
             <w:r>
               <w:rPr>
@@ -4473,7 +4473,7 @@
               <w:lang w:eastAsia="es-ES"/>
             </w:rPr>
           </w:pPr>
-          <w:hyperlink w:anchor="_Toc199173318" w:history="1">
+          <w:hyperlink w:anchor="_Toc199178415" w:history="1">
             <w:r>
               <w:rPr>
                 <w:rStyle w:val="Hipervnculo"/>
@@ -4500,7 +4500,7 @@
                 <w:noProof/>
                 <w:webHidden/>
               </w:rPr>
-              <w:instrText xml:space="preserve"> PAGEREF _Toc199173318 \h </w:instrText>
+              <w:instrText xml:space="preserve"> PAGEREF _Toc199178415 \h </w:instrText>
             </w:r>
             <w:r>
               <w:rPr>
@@ -4545,7 +4545,7 @@
               <w:lang w:eastAsia="es-ES"/>
             </w:rPr>
           </w:pPr>
-          <w:hyperlink w:anchor="_Toc199173319" w:history="1">
+          <w:hyperlink w:anchor="_Toc199178416" w:history="1">
             <w:r>
               <w:rPr>
                 <w:rStyle w:val="Hipervnculo"/>
@@ -4572,7 +4572,7 @@
                 <w:noProof/>
                 <w:webHidden/>
               </w:rPr>
-              <w:instrText xml:space="preserve"> PAGEREF _Toc199173319 \h </w:instrText>
+              <w:instrText xml:space="preserve"> PAGEREF _Toc199178416 \h </w:instrText>
             </w:r>
             <w:r>
               <w:rPr>
@@ -4617,7 +4617,7 @@
               <w:lang w:eastAsia="es-ES"/>
             </w:rPr>
           </w:pPr>
-          <w:hyperlink w:anchor="_Toc199173320" w:history="1">
+          <w:hyperlink w:anchor="_Toc199178417" w:history="1">
             <w:r>
               <w:rPr>
                 <w:rStyle w:val="Hipervnculo"/>
@@ -4644,7 +4644,7 @@
                 <w:noProof/>
                 <w:webHidden/>
               </w:rPr>
-              <w:instrText xml:space="preserve"> PAGEREF _Toc199173320 \h </w:instrText>
+              <w:instrText xml:space="preserve"> PAGEREF _Toc199178417 \h </w:instrText>
             </w:r>
             <w:r>
               <w:rPr>
@@ -4689,7 +4689,7 @@
               <w:lang w:eastAsia="es-ES"/>
             </w:rPr>
           </w:pPr>
-          <w:hyperlink w:anchor="_Toc199173321" w:history="1">
+          <w:hyperlink w:anchor="_Toc199178418" w:history="1">
             <w:r>
               <w:rPr>
                 <w:rStyle w:val="Hipervnculo"/>
@@ -4716,7 +4716,7 @@
                 <w:noProof/>
                 <w:webHidden/>
               </w:rPr>
-              <w:instrText xml:space="preserve"> PAGEREF _Toc199173321 \h </w:instrText>
+              <w:instrText xml:space="preserve"> PAGEREF _Toc199178418 \h </w:instrText>
             </w:r>
             <w:r>
               <w:rPr>
@@ -4761,7 +4761,7 @@
               <w:lang w:eastAsia="es-ES"/>
             </w:rPr>
           </w:pPr>
-          <w:hyperlink w:anchor="_Toc199173322" w:history="1">
+          <w:hyperlink w:anchor="_Toc199178419" w:history="1">
             <w:r>
               <w:rPr>
                 <w:rStyle w:val="Hipervnculo"/>
@@ -4788,7 +4788,7 @@
                 <w:noProof/>
                 <w:webHidden/>
               </w:rPr>
-              <w:instrText xml:space="preserve"> PAGEREF _Toc199173322 \h </w:instrText>
+              <w:instrText xml:space="preserve"> PAGEREF _Toc199178419 \h </w:instrText>
             </w:r>
             <w:r>
               <w:rPr>
@@ -4833,7 +4833,7 @@
               <w:lang w:eastAsia="es-ES"/>
             </w:rPr>
           </w:pPr>
-          <w:hyperlink w:anchor="_Toc199173323" w:history="1">
+          <w:hyperlink w:anchor="_Toc199178420" w:history="1">
             <w:r>
               <w:rPr>
                 <w:rStyle w:val="Hipervnculo"/>
@@ -4860,7 +4860,7 @@
                 <w:noProof/>
                 <w:webHidden/>
               </w:rPr>
-              <w:instrText xml:space="preserve"> PAGEREF _Toc199173323 \h </w:instrText>
+              <w:instrText xml:space="preserve"> PAGEREF _Toc199178420 \h </w:instrText>
             </w:r>
             <w:r>
               <w:rPr>
@@ -4905,7 +4905,7 @@
               <w:lang w:eastAsia="es-ES"/>
             </w:rPr>
           </w:pPr>
-          <w:hyperlink w:anchor="_Toc199173324" w:history="1">
+          <w:hyperlink w:anchor="_Toc199178421" w:history="1">
             <w:r>
               <w:rPr>
                 <w:rStyle w:val="Hipervnculo"/>
@@ -4932,7 +4932,7 @@
                 <w:noProof/>
                 <w:webHidden/>
               </w:rPr>
-              <w:instrText xml:space="preserve"> PAGEREF _Toc199173324 \h </w:instrText>
+              <w:instrText xml:space="preserve"> PAGEREF _Toc199178421 \h </w:instrText>
             </w:r>
             <w:r>
               <w:rPr>
@@ -4977,7 +4977,7 @@
               <w:lang w:eastAsia="es-ES"/>
             </w:rPr>
           </w:pPr>
-          <w:hyperlink w:anchor="_Toc199173325" w:history="1">
+          <w:hyperlink w:anchor="_Toc199178422" w:history="1">
             <w:r>
               <w:rPr>
                 <w:rStyle w:val="Hipervnculo"/>
@@ -5004,7 +5004,7 @@
                 <w:noProof/>
                 <w:webHidden/>
               </w:rPr>
-              <w:instrText xml:space="preserve"> PAGEREF _Toc199173325 \h </w:instrText>
+              <w:instrText xml:space="preserve"> PAGEREF _Toc199178422 \h </w:instrText>
             </w:r>
             <w:r>
               <w:rPr>
@@ -5049,7 +5049,7 @@
               <w:lang w:eastAsia="es-ES"/>
             </w:rPr>
           </w:pPr>
-          <w:hyperlink w:anchor="_Toc199173326" w:history="1">
+          <w:hyperlink w:anchor="_Toc199178423" w:history="1">
             <w:r>
               <w:rPr>
                 <w:rStyle w:val="Hipervnculo"/>
@@ -5076,7 +5076,7 @@
                 <w:noProof/>
                 <w:webHidden/>
               </w:rPr>
-              <w:instrText xml:space="preserve"> PAGEREF _Toc199173326 \h </w:instrText>
+              <w:instrText xml:space="preserve"> PAGEREF _Toc199178423 \h </w:instrText>
             </w:r>
             <w:r>
               <w:rPr>
@@ -5121,7 +5121,7 @@
               <w:lang w:eastAsia="es-ES"/>
             </w:rPr>
           </w:pPr>
-          <w:hyperlink w:anchor="_Toc199173327" w:history="1">
+          <w:hyperlink w:anchor="_Toc199178424" w:history="1">
             <w:r>
               <w:rPr>
                 <w:rStyle w:val="Hipervnculo"/>
@@ -5148,7 +5148,7 @@
                 <w:noProof/>
                 <w:webHidden/>
               </w:rPr>
-              <w:instrText xml:space="preserve"> PAGEREF _Toc199173327 \h </w:instrText>
+              <w:instrText xml:space="preserve"> PAGEREF _Toc199178424 \h </w:instrText>
             </w:r>
             <w:r>
               <w:rPr>
@@ -5193,7 +5193,7 @@
               <w:lang w:eastAsia="es-ES"/>
             </w:rPr>
           </w:pPr>
-          <w:hyperlink w:anchor="_Toc199173328" w:history="1">
+          <w:hyperlink w:anchor="_Toc199178425" w:history="1">
             <w:r>
               <w:rPr>
                 <w:rStyle w:val="Hipervnculo"/>
@@ -5220,7 +5220,7 @@
                 <w:noProof/>
                 <w:webHidden/>
               </w:rPr>
-              <w:instrText xml:space="preserve"> PAGEREF _Toc199173328 \h </w:instrText>
+              <w:instrText xml:space="preserve"> PAGEREF _Toc199178425 \h </w:instrText>
             </w:r>
             <w:r>
               <w:rPr>
@@ -5265,7 +5265,7 @@
               <w:lang w:eastAsia="es-ES"/>
             </w:rPr>
           </w:pPr>
-          <w:hyperlink w:anchor="_Toc199173329" w:history="1">
+          <w:hyperlink w:anchor="_Toc199178426" w:history="1">
             <w:r>
               <w:rPr>
                 <w:rStyle w:val="Hipervnculo"/>
@@ -5292,7 +5292,7 @@
                 <w:noProof/>
                 <w:webHidden/>
               </w:rPr>
-              <w:instrText xml:space="preserve"> PAGEREF _Toc199173329 \h </w:instrText>
+              <w:instrText xml:space="preserve"> PAGEREF _Toc199178426 \h </w:instrText>
             </w:r>
             <w:r>
               <w:rPr>
@@ -5337,7 +5337,7 @@
               <w:lang w:eastAsia="es-ES"/>
             </w:rPr>
           </w:pPr>
-          <w:hyperlink w:anchor="_Toc199173330" w:history="1">
+          <w:hyperlink w:anchor="_Toc199178427" w:history="1">
             <w:r>
               <w:rPr>
                 <w:rStyle w:val="Hipervnculo"/>
@@ -5364,7 +5364,7 @@
                 <w:noProof/>
                 <w:webHidden/>
               </w:rPr>
-              <w:instrText xml:space="preserve"> PAGEREF _Toc199173330 \h </w:instrText>
+              <w:instrText xml:space="preserve"> PAGEREF _Toc199178427 \h </w:instrText>
             </w:r>
             <w:r>
               <w:rPr>
@@ -5409,7 +5409,7 @@
               <w:lang w:eastAsia="es-ES"/>
             </w:rPr>
           </w:pPr>
-          <w:hyperlink w:anchor="_Toc199173331" w:history="1">
+          <w:hyperlink w:anchor="_Toc199178428" w:history="1">
             <w:r>
               <w:rPr>
                 <w:rStyle w:val="Hipervnculo"/>
@@ -5436,7 +5436,7 @@
                 <w:noProof/>
                 <w:webHidden/>
               </w:rPr>
-              <w:instrText xml:space="preserve"> PAGEREF _Toc199173331 \h </w:instrText>
+              <w:instrText xml:space="preserve"> PAGEREF _Toc199178428 \h </w:instrText>
             </w:r>
             <w:r>
               <w:rPr>
@@ -5481,7 +5481,7 @@
               <w:lang w:eastAsia="es-ES"/>
             </w:rPr>
           </w:pPr>
-          <w:hyperlink w:anchor="_Toc199173332" w:history="1">
+          <w:hyperlink w:anchor="_Toc199178429" w:history="1">
             <w:r>
               <w:rPr>
                 <w:rStyle w:val="Hipervnculo"/>
@@ -5508,7 +5508,7 @@
                 <w:noProof/>
                 <w:webHidden/>
               </w:rPr>
-              <w:instrText xml:space="preserve"> PAGEREF _Toc199173332 \h </w:instrText>
+              <w:instrText xml:space="preserve"> PAGEREF _Toc199178429 \h </w:instrText>
             </w:r>
             <w:r>
               <w:rPr>
@@ -5553,7 +5553,7 @@
               <w:lang w:eastAsia="es-ES"/>
             </w:rPr>
           </w:pPr>
-          <w:hyperlink w:anchor="_Toc199173333" w:history="1">
+          <w:hyperlink w:anchor="_Toc199178430" w:history="1">
             <w:r>
               <w:rPr>
                 <w:rStyle w:val="Hipervnculo"/>
@@ -5580,7 +5580,7 @@
                 <w:noProof/>
                 <w:webHidden/>
               </w:rPr>
-              <w:instrText xml:space="preserve"> PAGEREF _Toc199173333 \h </w:instrText>
+              <w:instrText xml:space="preserve"> PAGEREF _Toc199178430 \h </w:instrText>
             </w:r>
             <w:r>
               <w:rPr>
@@ -5625,7 +5625,7 @@
               <w:lang w:eastAsia="es-ES"/>
             </w:rPr>
           </w:pPr>
-          <w:hyperlink w:anchor="_Toc199173334" w:history="1">
+          <w:hyperlink w:anchor="_Toc199178431" w:history="1">
             <w:r>
               <w:rPr>
                 <w:rStyle w:val="Hipervnculo"/>
@@ -5652,7 +5652,7 @@
                 <w:noProof/>
                 <w:webHidden/>
               </w:rPr>
-              <w:instrText xml:space="preserve"> PAGEREF _Toc199173334 \h </w:instrText>
+              <w:instrText xml:space="preserve"> PAGEREF _Toc199178431 \h </w:instrText>
             </w:r>
             <w:r>
               <w:rPr>
@@ -5697,7 +5697,7 @@
               <w:lang w:eastAsia="es-ES"/>
             </w:rPr>
           </w:pPr>
-          <w:hyperlink w:anchor="_Toc199173335" w:history="1">
+          <w:hyperlink w:anchor="_Toc199178432" w:history="1">
             <w:r>
               <w:rPr>
                 <w:rStyle w:val="Hipervnculo"/>
@@ -5724,7 +5724,7 @@
                 <w:noProof/>
                 <w:webHidden/>
               </w:rPr>
-              <w:instrText xml:space="preserve"> PAGEREF _Toc199173335 \h </w:instrText>
+              <w:instrText xml:space="preserve"> PAGEREF _Toc199178432 \h </w:instrText>
             </w:r>
             <w:r>
               <w:rPr>
@@ -5769,7 +5769,7 @@
               <w:lang w:eastAsia="es-ES"/>
             </w:rPr>
           </w:pPr>
-          <w:hyperlink w:anchor="_Toc199173336" w:history="1">
+          <w:hyperlink w:anchor="_Toc199178433" w:history="1">
             <w:r>
               <w:rPr>
                 <w:rStyle w:val="Hipervnculo"/>
@@ -5796,7 +5796,7 @@
                 <w:noProof/>
                 <w:webHidden/>
               </w:rPr>
-              <w:instrText xml:space="preserve"> PAGEREF _Toc199173336 \h </w:instrText>
+              <w:instrText xml:space="preserve"> PAGEREF _Toc199178433 \h </w:instrText>
             </w:r>
             <w:r>
               <w:rPr>
@@ -5841,7 +5841,7 @@
               <w:lang w:eastAsia="es-ES"/>
             </w:rPr>
           </w:pPr>
-          <w:hyperlink w:anchor="_Toc199173337" w:history="1">
+          <w:hyperlink w:anchor="_Toc199178434" w:history="1">
             <w:r>
               <w:rPr>
                 <w:rStyle w:val="Hipervnculo"/>
@@ -5868,7 +5868,7 @@
                 <w:noProof/>
                 <w:webHidden/>
               </w:rPr>
-              <w:instrText xml:space="preserve"> PAGEREF _Toc199173337 \h </w:instrText>
+              <w:instrText xml:space="preserve"> PAGEREF _Toc199178434 \h </w:instrText>
             </w:r>
             <w:r>
               <w:rPr>
@@ -5913,7 +5913,7 @@
               <w:lang w:eastAsia="es-ES"/>
             </w:rPr>
           </w:pPr>
-          <w:hyperlink w:anchor="_Toc199173338" w:history="1">
+          <w:hyperlink w:anchor="_Toc199178435" w:history="1">
             <w:r>
               <w:rPr>
                 <w:rStyle w:val="Hipervnculo"/>
@@ -5940,7 +5940,7 @@
                 <w:noProof/>
                 <w:webHidden/>
               </w:rPr>
-              <w:instrText xml:space="preserve"> PAGEREF _Toc199173338 \h </w:instrText>
+              <w:instrText xml:space="preserve"> PAGEREF _Toc199178435 \h </w:instrText>
             </w:r>
             <w:r>
               <w:rPr>
@@ -5985,12 +5985,84 @@
               <w:lang w:eastAsia="es-ES"/>
             </w:rPr>
           </w:pPr>
-          <w:hyperlink w:anchor="_Toc199173339" w:history="1">
+          <w:hyperlink w:anchor="_Toc199178436" w:history="1">
             <w:r>
               <w:rPr>
                 <w:rStyle w:val="Hipervnculo"/>
                 <w:noProof/>
               </w:rPr>
+              <w:t>CONCLUSIÓN</w:t>
+            </w:r>
+            <w:r>
+              <w:rPr>
+                <w:noProof/>
+                <w:webHidden/>
+              </w:rPr>
+              <w:tab/>
+            </w:r>
+            <w:r>
+              <w:rPr>
+                <w:noProof/>
+                <w:webHidden/>
+              </w:rPr>
+              <w:fldChar w:fldCharType="begin"/>
+            </w:r>
+            <w:r>
+              <w:rPr>
+                <w:noProof/>
+                <w:webHidden/>
+              </w:rPr>
+              <w:instrText xml:space="preserve"> PAGEREF _Toc199178436 \h </w:instrText>
+            </w:r>
+            <w:r>
+              <w:rPr>
+                <w:noProof/>
+                <w:webHidden/>
+              </w:rPr>
+            </w:r>
+            <w:r>
+              <w:rPr>
+                <w:noProof/>
+                <w:webHidden/>
+              </w:rPr>
+              <w:fldChar w:fldCharType="separate"/>
+            </w:r>
+            <w:r>
+              <w:rPr>
+                <w:noProof/>
+                <w:webHidden/>
+              </w:rPr>
+              <w:t>19</w:t>
+            </w:r>
+            <w:r>
+              <w:rPr>
+                <w:noProof/>
+                <w:webHidden/>
+              </w:rPr>
+              <w:fldChar w:fldCharType="end"/>
+            </w:r>
+          </w:hyperlink>
+        </w:p>
+        <w:p>
+          <w:pPr>
+            <w:pStyle w:val="TDC1"/>
+            <w:tabs>
+              <w:tab w:val="right" w:leader="dot" w:pos="8494"/>
+            </w:tabs>
+            <w:rPr>
+              <w:rFonts w:eastAsiaTheme="minorEastAsia"/>
+              <w:noProof/>
+              <w:sz w:val="24"/>
+              <w:szCs w:val="24"/>
+              <w:lang w:eastAsia="es-ES"/>
+            </w:rPr>
+          </w:pPr>
+          <w:hyperlink w:anchor="_Toc199178437" w:history="1">
+            <w:r>
+              <w:rPr>
+                <w:rStyle w:val="Hipervnculo"/>
+                <w:noProof/>
+              </w:rPr>
               <w:t>BIBLIOGRAFÍA</w:t>
             </w:r>
             <w:r>
@@ -6012,7 +6084,7 @@
                 <w:noProof/>
                 <w:webHidden/>
               </w:rPr>
-              <w:instrText xml:space="preserve"> PAGEREF _Toc199173339 \h </w:instrText>
+              <w:instrText xml:space="preserve"> PAGEREF _Toc199178437 \h </w:instrText>
             </w:r>
             <w:r>
               <w:rPr>
@@ -6254,7 +6326,23 @@
               </w:rPr>
             </w:pPr>
             <w:r>
-              <w:t>Realización del “Testing Report”</w:t>
+              <w:t>Realización del “</w:t>
+            </w:r>
+            <w:proofErr w:type="spellStart"/>
+            <w:r>
+              <w:t>Testing</w:t>
+            </w:r>
+            <w:proofErr w:type="spellEnd"/>
+            <w:r>
+              <w:t xml:space="preserve"> </w:t>
+            </w:r>
+            <w:proofErr w:type="spellStart"/>
+            <w:r>
+              <w:t>Report</w:t>
+            </w:r>
+            <w:proofErr w:type="spellEnd"/>
+            <w:r>
+              <w:t>”</w:t>
             </w:r>
           </w:p>
         </w:tc>
@@ -6285,24 +6373,39 @@
         <w:pStyle w:val="Ttulo1"/>
       </w:pPr>
       <w:bookmarkStart w:id="1" w:name="_INTRODUCCIÓN"/>
-      <w:bookmarkStart w:id="2" w:name="_Toc199173315"/>
+      <w:bookmarkStart w:id="2" w:name="_Toc199178412"/>
       <w:bookmarkEnd w:id="1"/>
       <w:r>
-        <w:lastRenderedPageBreak/>
         <w:t>RESUMEN EJECUTIVO</w:t>
       </w:r>
       <w:bookmarkEnd w:id="2"/>
     </w:p>
     <w:p>
       <w:r>
-        <w:t>Este documento describe el proceso de pruebas llevado a cabo sobre el sistema, centrado en los módulos de Flight Assignments y Activity Logs, con el objetivo de asegurar que cumple con los requisitos funcionales y no funcionales definidos. Se realizaron principalmente dos tipos de pruebas: funcionales, para verificar el correcto funcionamiento de todas las características del sistema, y de rendimiento, para evaluar su capacidad de respuesta bajo distintas condiciones de carga y estrés.</w:t>
+        <w:t xml:space="preserve">Este documento describe el proceso de pruebas llevado a cabo sobre el sistema, centrado en los módulos de Flight </w:t>
+      </w:r>
+      <w:proofErr w:type="spellStart"/>
+      <w:r>
+        <w:t>Assignments</w:t>
+      </w:r>
+      <w:proofErr w:type="spellEnd"/>
+      <w:r>
+        <w:t xml:space="preserve"> y </w:t>
+      </w:r>
+      <w:proofErr w:type="spellStart"/>
+      <w:r>
+        <w:t>Activity</w:t>
+      </w:r>
+      <w:proofErr w:type="spellEnd"/>
+      <w:r>
+        <w:t xml:space="preserve"> Logs, con el objetivo de asegurar que cumple con los requisitos funcionales y no funcionales definidos. Se realizaron principalmente dos tipos de pruebas: funcionales, para verificar el correcto funcionamiento de todas las características del sistema, y de rendimiento, para evaluar su capacidad de respuesta bajo distintas condiciones de carga y estrés.</w:t>
       </w:r>
     </w:p>
     <w:p>
       <w:pPr>
         <w:pStyle w:val="Ttulo1"/>
       </w:pPr>
-      <w:bookmarkStart w:id="3" w:name="_Toc199173316"/>
+      <w:bookmarkStart w:id="3" w:name="_Toc199178413"/>
       <w:r>
         <w:t>INTRODUCCIÓN</w:t>
       </w:r>
@@ -6319,10 +6422,23 @@
         <w:t xml:space="preserve"> específicamente pruebas realizadas sobre </w:t>
       </w:r>
       <w:r>
-        <w:t xml:space="preserve">los Flight Assignments y </w:t>
-      </w:r>
-      <w:r>
-        <w:t xml:space="preserve">Activity Logs, </w:t>
+        <w:t xml:space="preserve">los Flight </w:t>
+      </w:r>
+      <w:proofErr w:type="spellStart"/>
+      <w:r>
+        <w:t>Assignments</w:t>
+      </w:r>
+      <w:proofErr w:type="spellEnd"/>
+      <w:r>
+        <w:t xml:space="preserve"> y </w:t>
+      </w:r>
+      <w:proofErr w:type="spellStart"/>
+      <w:r>
+        <w:t>Activity</w:t>
+      </w:r>
+      <w:proofErr w:type="spellEnd"/>
+      <w:r>
+        <w:t xml:space="preserve"> Logs, </w:t>
       </w:r>
       <w:r>
         <w:t>con el fin de garantizar que cumple con los requisitos funcionales y no funcionales especificados en la fase de análisis.</w:t>
@@ -6348,7 +6464,7 @@
       </w:pPr>
       <w:bookmarkStart w:id="4" w:name="_CHAPTER_OF_FUNCTIONAL"/>
       <w:bookmarkStart w:id="5" w:name="_CAPÍTULO_DE_PRUEBAS"/>
-      <w:bookmarkStart w:id="6" w:name="_Toc199173317"/>
+      <w:bookmarkStart w:id="6" w:name="_Toc199178414"/>
       <w:bookmarkEnd w:id="4"/>
       <w:bookmarkEnd w:id="5"/>
       <w:r>
@@ -6364,7 +6480,15 @@
         <w:t xml:space="preserve">Las pruebas se han llevado a cabo con el conjunto de datos </w:t>
       </w:r>
       <w:r>
-        <w:t>“Sample-Data”,</w:t>
+        <w:t>“</w:t>
+      </w:r>
+      <w:proofErr w:type="spellStart"/>
+      <w:r>
+        <w:t>Sample</w:t>
+      </w:r>
+      <w:proofErr w:type="spellEnd"/>
+      <w:r>
+        <w:t>-Data”,</w:t>
       </w:r>
       <w:r>
         <w:t xml:space="preserve"> </w:t>
@@ -6376,7 +6500,15 @@
         <w:t xml:space="preserve">apartados </w:t>
       </w:r>
       <w:r>
-        <w:t>“Text” [1] y “Numeric” [2].</w:t>
+        <w:t>“Text” [1] y “</w:t>
+      </w:r>
+      <w:proofErr w:type="spellStart"/>
+      <w:r>
+        <w:t>Numeric</w:t>
+      </w:r>
+      <w:proofErr w:type="spellEnd"/>
+      <w:r>
+        <w:t>” [2].</w:t>
       </w:r>
     </w:p>
     <w:p>
@@ -6523,7 +6655,7 @@
         <w:pStyle w:val="Ttulo2"/>
       </w:pPr>
       <w:bookmarkStart w:id="7" w:name="_ASPECTOS_COMUNES"/>
-      <w:bookmarkStart w:id="8" w:name="_Toc199173318"/>
+      <w:bookmarkStart w:id="8" w:name="_Toc199178415"/>
       <w:bookmarkEnd w:id="7"/>
       <w:r>
         <w:t>ASPECTOS COMUNES</w:t>
@@ -6535,16 +6667,50 @@
         <w:jc w:val="both"/>
       </w:pPr>
       <w:r>
-        <w:t>Para cada acción se han generado dos tipos de archivos diferentes,</w:t>
+        <w:t>Para cada acción se han generado dos tipos de archivos diferentes</w:t>
+      </w:r>
+      <w:proofErr w:type="gramStart"/>
+      <w:r>
+        <w:t>,</w:t>
       </w:r>
       <w:r>
         <w:t xml:space="preserve"> </w:t>
       </w:r>
       <w:r>
-        <w:t>.safe y .hack, a partir de l</w:t>
-      </w:r>
-      <w:r>
-        <w:t xml:space="preserve">os launchers </w:t>
+        <w:t>.</w:t>
+      </w:r>
+      <w:proofErr w:type="spellStart"/>
+      <w:r>
+        <w:t>safe</w:t>
+      </w:r>
+      <w:proofErr w:type="spellEnd"/>
+      <w:proofErr w:type="gramEnd"/>
+      <w:r>
+        <w:t xml:space="preserve"> </w:t>
+      </w:r>
+      <w:proofErr w:type="gramStart"/>
+      <w:r>
+        <w:t>y .</w:t>
+      </w:r>
+      <w:proofErr w:type="spellStart"/>
+      <w:r>
+        <w:t>hack</w:t>
+      </w:r>
+      <w:proofErr w:type="spellEnd"/>
+      <w:proofErr w:type="gramEnd"/>
+      <w:r>
+        <w:t>, a partir de l</w:t>
+      </w:r>
+      <w:r>
+        <w:t xml:space="preserve">os </w:t>
+      </w:r>
+      <w:proofErr w:type="spellStart"/>
+      <w:r>
+        <w:t>launchers</w:t>
+      </w:r>
+      <w:proofErr w:type="spellEnd"/>
+      <w:r>
+        <w:t xml:space="preserve"> </w:t>
       </w:r>
       <w:r>
         <w:t>(</w:t>
@@ -6553,8 +6719,21 @@
         <w:t>Replay</w:t>
       </w:r>
       <w:r>
-        <w:t>, Record y Analyse</w:t>
-      </w:r>
+        <w:t xml:space="preserve">, </w:t>
+      </w:r>
+      <w:proofErr w:type="spellStart"/>
+      <w:r>
+        <w:t>Record</w:t>
+      </w:r>
+      <w:proofErr w:type="spellEnd"/>
+      <w:r>
+        <w:t xml:space="preserve"> y </w:t>
+      </w:r>
+      <w:proofErr w:type="spellStart"/>
+      <w:r>
+        <w:t>Analyse</w:t>
+      </w:r>
+      <w:proofErr w:type="spellEnd"/>
       <w:r>
         <w:t>)</w:t>
       </w:r>
@@ -6665,11 +6844,21 @@
         <w:t>ejecutado</w:t>
       </w:r>
       <w:r>
-        <w:t xml:space="preserve"> el launcher de </w:t>
-      </w:r>
+        <w:t xml:space="preserve"> el </w:t>
+      </w:r>
+      <w:proofErr w:type="spellStart"/>
+      <w:r>
+        <w:t>launcher</w:t>
+      </w:r>
+      <w:proofErr w:type="spellEnd"/>
+      <w:r>
+        <w:t xml:space="preserve"> de </w:t>
+      </w:r>
+      <w:proofErr w:type="spellStart"/>
       <w:r>
         <w:t>Record</w:t>
       </w:r>
+      <w:proofErr w:type="spellEnd"/>
       <w:r>
         <w:t xml:space="preserve"> para grabar las pruebas en el</w:t>
       </w:r>
@@ -6679,11 +6868,23 @@
       <w:r>
         <w:t xml:space="preserve"> </w:t>
       </w:r>
+      <w:proofErr w:type="spellStart"/>
+      <w:proofErr w:type="gramStart"/>
       <w:r>
         <w:t>tester.trace</w:t>
       </w:r>
-      <w:r>
-        <w:t xml:space="preserve">, y posteriormente el launcher </w:t>
+      <w:proofErr w:type="spellEnd"/>
+      <w:proofErr w:type="gramEnd"/>
+      <w:r>
+        <w:t xml:space="preserve">, y posteriormente el </w:t>
+      </w:r>
+      <w:proofErr w:type="spellStart"/>
+      <w:r>
+        <w:t>launcher</w:t>
+      </w:r>
+      <w:proofErr w:type="spellEnd"/>
+      <w:r>
+        <w:t xml:space="preserve"> </w:t>
       </w:r>
       <w:r>
         <w:t>Replay</w:t>
@@ -6714,7 +6915,20 @@
         <w:jc w:val="both"/>
       </w:pPr>
       <w:r>
-        <w:t xml:space="preserve">Para la creación de los archivos .safe correspondientes a cada acción de las entidades mencionadas, se ha </w:t>
+        <w:t xml:space="preserve">Para la creación de los </w:t>
+      </w:r>
+      <w:proofErr w:type="gramStart"/>
+      <w:r>
+        <w:t>archivos .</w:t>
+      </w:r>
+      <w:proofErr w:type="spellStart"/>
+      <w:r>
+        <w:t>safe</w:t>
+      </w:r>
+      <w:proofErr w:type="spellEnd"/>
+      <w:proofErr w:type="gramEnd"/>
+      <w:r>
+        <w:t xml:space="preserve"> correspondientes a cada acción de las entidades mencionadas, se ha </w:t>
       </w:r>
       <w:r>
         <w:t>empleado</w:t>
@@ -6749,8 +6963,13 @@
       <w:r>
         <w:t xml:space="preserve">), </w:t>
       </w:r>
-      <w:r>
-        <w:t xml:space="preserve">Publish </w:t>
+      <w:proofErr w:type="spellStart"/>
+      <w:r>
+        <w:t>Publish</w:t>
+      </w:r>
+      <w:proofErr w:type="spellEnd"/>
+      <w:r>
+        <w:t xml:space="preserve"> </w:t>
       </w:r>
       <w:r>
         <w:t>(</w:t>
@@ -6788,8 +7007,21 @@
         <w:t xml:space="preserve"> acciones que no implican el envío de formularios</w:t>
       </w:r>
       <w:r>
-        <w:t>, como Show y List</w:t>
-      </w:r>
+        <w:t xml:space="preserve">, como </w:t>
+      </w:r>
+      <w:proofErr w:type="gramStart"/>
+      <w:r>
+        <w:t>Show</w:t>
+      </w:r>
+      <w:proofErr w:type="gramEnd"/>
+      <w:r>
+        <w:t xml:space="preserve"> y </w:t>
+      </w:r>
+      <w:proofErr w:type="spellStart"/>
+      <w:r>
+        <w:t>List</w:t>
+      </w:r>
+      <w:proofErr w:type="spellEnd"/>
       <w:r>
         <w:t xml:space="preserve"> (Listar y Mostrar), la </w:t>
       </w:r>
@@ -6800,7 +7032,23 @@
         <w:t xml:space="preserve"> se limita a verificar que los </w:t>
       </w:r>
       <w:r>
-        <w:t xml:space="preserve">Flight Assignment y Activity </w:t>
+        <w:t xml:space="preserve">Flight </w:t>
+      </w:r>
+      <w:proofErr w:type="spellStart"/>
+      <w:r>
+        <w:t>Assignment</w:t>
+      </w:r>
+      <w:proofErr w:type="spellEnd"/>
+      <w:r>
+        <w:t xml:space="preserve"> y </w:t>
+      </w:r>
+      <w:proofErr w:type="spellStart"/>
+      <w:r>
+        <w:t>Activity</w:t>
+      </w:r>
+      <w:proofErr w:type="spellEnd"/>
+      <w:r>
+        <w:t xml:space="preserve"> </w:t>
       </w:r>
       <w:r>
         <w:t>se listan correctamente y que sus formularios aparecen adecuadamente</w:t>
@@ -6852,14 +7100,24 @@
         <w:t>Respecto a</w:t>
       </w:r>
       <w:r>
-        <w:t xml:space="preserve"> los archivos </w:t>
-      </w:r>
-      <w:r>
-        <w:t>.ha</w:t>
+        <w:t xml:space="preserve"> los </w:t>
+      </w:r>
+      <w:proofErr w:type="gramStart"/>
+      <w:r>
+        <w:t xml:space="preserve">archivos </w:t>
+      </w:r>
+      <w:r>
+        <w:t>.</w:t>
+      </w:r>
+      <w:proofErr w:type="spellStart"/>
+      <w:r>
+        <w:t>ha</w:t>
       </w:r>
       <w:r>
         <w:t>ck</w:t>
       </w:r>
+      <w:proofErr w:type="spellEnd"/>
+      <w:proofErr w:type="gramEnd"/>
       <w:r>
         <w:rPr>
           <w:b/>
@@ -6871,8 +7129,21 @@
         <w:t xml:space="preserve">generados, se ha utilizado la herramienta de desarrollador de </w:t>
       </w:r>
       <w:r>
-        <w:t>Firefox Developer Edition</w:t>
-      </w:r>
+        <w:t xml:space="preserve">Firefox </w:t>
+      </w:r>
+      <w:proofErr w:type="spellStart"/>
+      <w:r>
+        <w:t>Developer</w:t>
+      </w:r>
+      <w:proofErr w:type="spellEnd"/>
+      <w:r>
+        <w:t xml:space="preserve"> </w:t>
+      </w:r>
+      <w:proofErr w:type="spellStart"/>
+      <w:r>
+        <w:t>Edition</w:t>
+      </w:r>
+      <w:proofErr w:type="spellEnd"/>
       <w:r>
         <w:t xml:space="preserve"> [4], para </w:t>
       </w:r>
@@ -6921,16 +7192,58 @@
       </w:pPr>
       <w:r>
         <w:lastRenderedPageBreak/>
-        <w:t xml:space="preserve">Una vez obtenidos los archivos tester.trace, </w:t>
-      </w:r>
-      <w:r>
-        <w:t>se han copiado y renombrado en la carpeta correspondiente de la entidad, en este caso “src/test/resources”</w:t>
+        <w:t xml:space="preserve">Una vez obtenidos los archivos </w:t>
+      </w:r>
+      <w:proofErr w:type="spellStart"/>
+      <w:proofErr w:type="gramStart"/>
+      <w:r>
+        <w:t>tester.trace</w:t>
+      </w:r>
+      <w:proofErr w:type="spellEnd"/>
+      <w:proofErr w:type="gramEnd"/>
+      <w:r>
+        <w:t xml:space="preserve">, </w:t>
+      </w:r>
+      <w:r>
+        <w:t>se han copiado y renombrado en la carpeta correspondiente de la entidad, en este caso “</w:t>
+      </w:r>
+      <w:proofErr w:type="spellStart"/>
+      <w:r>
+        <w:t>src</w:t>
+      </w:r>
+      <w:proofErr w:type="spellEnd"/>
+      <w:r>
+        <w:t>/test/</w:t>
+      </w:r>
+      <w:proofErr w:type="spellStart"/>
+      <w:r>
+        <w:t>resources</w:t>
+      </w:r>
+      <w:proofErr w:type="spellEnd"/>
+      <w:r>
+        <w:t>”</w:t>
       </w:r>
       <w:r>
         <w:t>, dentro de</w:t>
       </w:r>
       <w:r>
-        <w:t xml:space="preserve"> la carpeta Flight Crew Member.</w:t>
+        <w:t xml:space="preserve"> la carpeta Flight </w:t>
+      </w:r>
+      <w:proofErr w:type="spellStart"/>
+      <w:r>
+        <w:t>Crew</w:t>
+      </w:r>
+      <w:proofErr w:type="spellEnd"/>
+      <w:r>
+        <w:t xml:space="preserve"> </w:t>
+      </w:r>
+      <w:proofErr w:type="spellStart"/>
+      <w:r>
+        <w:t>Member</w:t>
+      </w:r>
+      <w:proofErr w:type="spellEnd"/>
+      <w:r>
+        <w:t>.</w:t>
       </w:r>
     </w:p>
     <w:p/>
@@ -6943,7 +7256,7 @@
           <w:noProof/>
         </w:rPr>
         <w:drawing>
-          <wp:anchor distT="0" distB="0" distL="114300" distR="114300" simplePos="0" relativeHeight="251669504" behindDoc="0" locked="0" layoutInCell="1" allowOverlap="1" wp14:anchorId="5DE2CB38" wp14:editId="390EF545">
+          <wp:anchor distT="0" distB="0" distL="114300" distR="114300" simplePos="0" relativeHeight="251669504" behindDoc="0" locked="0" layoutInCell="1" allowOverlap="1" wp14:anchorId="5DE2CB38" wp14:editId="59F849CB">
             <wp:simplePos x="0" y="0"/>
             <wp:positionH relativeFrom="margin">
               <wp:align>center</wp:align>
@@ -7008,7 +7321,7 @@
         <w:pStyle w:val="Ttulo2"/>
       </w:pPr>
       <w:bookmarkStart w:id="9" w:name="_PRUEBAS_DE_FLIGHT"/>
-      <w:bookmarkStart w:id="10" w:name="_Toc199173319"/>
+      <w:bookmarkStart w:id="10" w:name="_Toc199178416"/>
       <w:bookmarkEnd w:id="9"/>
       <w:r>
         <w:t>PRUEBAS DE FLIGHT ASSIGNMENT</w:t>
@@ -7020,7 +7333,7 @@
         <w:pStyle w:val="Ttulo3"/>
       </w:pPr>
       <w:bookmarkStart w:id="11" w:name="_CREATE,_UPDATE_Y"/>
-      <w:bookmarkStart w:id="12" w:name="_Toc199173320"/>
+      <w:bookmarkStart w:id="12" w:name="_Toc199178417"/>
       <w:bookmarkEnd w:id="11"/>
       <w:r>
         <w:t>CREATE</w:t>
@@ -7037,12 +7350,19 @@
       <w:r>
         <w:t xml:space="preserve">Para generar el </w:t>
       </w:r>
+      <w:proofErr w:type="gramStart"/>
       <w:r>
         <w:t xml:space="preserve">archivo </w:t>
       </w:r>
       <w:r>
-        <w:t>.safe</w:t>
-      </w:r>
+        <w:t>.</w:t>
+      </w:r>
+      <w:proofErr w:type="spellStart"/>
+      <w:r>
+        <w:t>safe</w:t>
+      </w:r>
+      <w:proofErr w:type="spellEnd"/>
+      <w:proofErr w:type="gramEnd"/>
       <w:r>
         <w:t>, n</w:t>
       </w:r>
@@ -7050,7 +7370,23 @@
         <w:t>os registramos en nuestr</w:t>
       </w:r>
       <w:r>
-        <w:t xml:space="preserve">o rol correspondiente, Flight Crew Member [5] en nuestro caso, </w:t>
+        <w:t xml:space="preserve">o rol correspondiente, Flight </w:t>
+      </w:r>
+      <w:proofErr w:type="spellStart"/>
+      <w:r>
+        <w:t>Crew</w:t>
+      </w:r>
+      <w:proofErr w:type="spellEnd"/>
+      <w:r>
+        <w:t xml:space="preserve"> </w:t>
+      </w:r>
+      <w:proofErr w:type="spellStart"/>
+      <w:r>
+        <w:t>Member</w:t>
+      </w:r>
+      <w:proofErr w:type="spellEnd"/>
+      <w:r>
+        <w:t xml:space="preserve"> [5] en nuestro caso, </w:t>
       </w:r>
       <w:r>
         <w:t>y accedemos al formulario de Create</w:t>
@@ -7064,11 +7400,17 @@
       <w:r>
         <w:t xml:space="preserve">, </w:t>
       </w:r>
+      <w:proofErr w:type="spellStart"/>
       <w:r>
         <w:t>Publish</w:t>
       </w:r>
-      <w:r>
-        <w:t xml:space="preserve"> o Delete [7] de Flight Assig</w:t>
+      <w:proofErr w:type="spellEnd"/>
+      <w:r>
+        <w:t xml:space="preserve"> o Delete [7] de Flight </w:t>
+      </w:r>
+      <w:proofErr w:type="spellStart"/>
+      <w:r>
+        <w:t>Assig</w:t>
       </w:r>
       <w:r>
         <w:t>n</w:t>
@@ -7076,6 +7418,7 @@
       <w:r>
         <w:t>ment</w:t>
       </w:r>
+      <w:proofErr w:type="spellEnd"/>
       <w:r>
         <w:t>.</w:t>
       </w:r>
@@ -7244,7 +7587,15 @@
         <w:jc w:val="both"/>
       </w:pPr>
       <w:r>
-        <w:t>Para comenzar entregaremos el formulario de Create, Update o Publish vacío, se ha seguido el mismo procedimiento para las tres.</w:t>
+        <w:t xml:space="preserve">Para comenzar entregaremos el formulario de Create, Update o </w:t>
+      </w:r>
+      <w:proofErr w:type="spellStart"/>
+      <w:r>
+        <w:t>Publish</w:t>
+      </w:r>
+      <w:proofErr w:type="spellEnd"/>
+      <w:r>
+        <w:t xml:space="preserve"> vacío, se ha seguido el mismo procedimiento para las tres.</w:t>
       </w:r>
       <w:r>
         <w:t xml:space="preserve"> En este caso entregamos el formulario de Create [8].</w:t>
@@ -7256,7 +7607,7 @@
           <w:noProof/>
         </w:rPr>
         <w:drawing>
-          <wp:anchor distT="0" distB="0" distL="114300" distR="114300" simplePos="0" relativeHeight="251665408" behindDoc="0" locked="0" layoutInCell="1" allowOverlap="1" wp14:anchorId="69C995EC" wp14:editId="16F7BCB4">
+          <wp:anchor distT="0" distB="0" distL="114300" distR="114300" simplePos="0" relativeHeight="251665408" behindDoc="0" locked="0" layoutInCell="1" allowOverlap="1" wp14:anchorId="69C995EC" wp14:editId="649F9A88">
             <wp:simplePos x="0" y="0"/>
             <wp:positionH relativeFrom="margin">
               <wp:align>center</wp:align>
@@ -7328,7 +7679,31 @@
         <w:jc w:val="both"/>
       </w:pPr>
       <w:r>
-        <w:t>En concreto, para el formulario de creación (create) de Flight Assignment, se rellenó un único atributo dejando el resto vacíos. Por ejemplo, se completó el primer campo, Duty, con el valor PILOT, mientras que los demás campos quedaron sin rellenar. Al enviar el formulario con únicamente Duty = PILOT</w:t>
+        <w:t xml:space="preserve">En concreto, para el formulario de creación (create) de Flight </w:t>
+      </w:r>
+      <w:proofErr w:type="spellStart"/>
+      <w:r>
+        <w:t>Assignment</w:t>
+      </w:r>
+      <w:proofErr w:type="spellEnd"/>
+      <w:r>
+        <w:t xml:space="preserve">, se rellenó un único atributo dejando el resto vacíos. Por ejemplo, se completó el primer campo, </w:t>
+      </w:r>
+      <w:proofErr w:type="spellStart"/>
+      <w:r>
+        <w:t>Duty</w:t>
+      </w:r>
+      <w:proofErr w:type="spellEnd"/>
+      <w:r>
+        <w:t xml:space="preserve">, con el valor PILOT, mientras que los demás campos quedaron sin rellenar. Al enviar el formulario con únicamente </w:t>
+      </w:r>
+      <w:proofErr w:type="spellStart"/>
+      <w:r>
+        <w:t>Duty</w:t>
+      </w:r>
+      <w:proofErr w:type="spellEnd"/>
+      <w:r>
+        <w:t xml:space="preserve"> = PILOT</w:t>
       </w:r>
       <w:r>
         <w:t xml:space="preserve"> [9]</w:t>
@@ -7343,7 +7718,15 @@
       </w:pPr>
       <w:r>
         <w:lastRenderedPageBreak/>
-        <w:t>A continuación, se modificó el valor del campo Duty a COPILOT y se repitió el mismo procedimiento, asegurando que las validaciones se comportaran correctamente en cada caso.</w:t>
+        <w:t xml:space="preserve">A continuación, se modificó el valor del campo </w:t>
+      </w:r>
+      <w:proofErr w:type="spellStart"/>
+      <w:r>
+        <w:t>Duty</w:t>
+      </w:r>
+      <w:proofErr w:type="spellEnd"/>
+      <w:r>
+        <w:t xml:space="preserve"> a COPILOT y se repitió el mismo procedimiento, asegurando que las validaciones se comportaran correctamente en cada caso.</w:t>
       </w:r>
     </w:p>
     <w:p>
@@ -7355,7 +7738,7 @@
           <w:noProof/>
         </w:rPr>
         <w:drawing>
-          <wp:anchor distT="0" distB="0" distL="114300" distR="114300" simplePos="0" relativeHeight="251668480" behindDoc="0" locked="0" layoutInCell="1" allowOverlap="1" wp14:anchorId="34BC2DFC" wp14:editId="75FD717D">
+          <wp:anchor distT="0" distB="0" distL="114300" distR="114300" simplePos="0" relativeHeight="251668480" behindDoc="0" locked="0" layoutInCell="1" allowOverlap="1" wp14:anchorId="34BC2DFC" wp14:editId="26A35FD1">
             <wp:simplePos x="0" y="0"/>
             <wp:positionH relativeFrom="margin">
               <wp:align>center</wp:align>
@@ -7430,7 +7813,15 @@
         <w:t>,</w:t>
       </w:r>
       <w:r>
-        <w:t xml:space="preserve"> se ha completado con los valores de “Sample-Data”</w:t>
+        <w:t xml:space="preserve"> se ha completado con los valores de “</w:t>
+      </w:r>
+      <w:proofErr w:type="spellStart"/>
+      <w:r>
+        <w:t>Sample</w:t>
+      </w:r>
+      <w:proofErr w:type="spellEnd"/>
+      <w:r>
+        <w:t>-Data”</w:t>
       </w:r>
       <w:r>
         <w:t>,</w:t>
@@ -7448,7 +7839,7 @@
           <w:noProof/>
         </w:rPr>
         <w:drawing>
-          <wp:anchor distT="0" distB="0" distL="114300" distR="114300" simplePos="0" relativeHeight="251666432" behindDoc="0" locked="0" layoutInCell="1" allowOverlap="1" wp14:anchorId="33CAFA06" wp14:editId="4BC23F26">
+          <wp:anchor distT="0" distB="0" distL="114300" distR="114300" simplePos="0" relativeHeight="251666432" behindDoc="0" locked="0" layoutInCell="1" allowOverlap="1" wp14:anchorId="33CAFA06" wp14:editId="3A1083F7">
             <wp:simplePos x="0" y="0"/>
             <wp:positionH relativeFrom="margin">
               <wp:align>center</wp:align>
@@ -7659,7 +8050,15 @@
         <w:t xml:space="preserve"> </w:t>
       </w:r>
       <w:r>
-        <w:t>Nos deslogueamos y a</w:t>
+        <w:t xml:space="preserve">Nos </w:t>
+      </w:r>
+      <w:proofErr w:type="spellStart"/>
+      <w:r>
+        <w:t>deslogueamos</w:t>
+      </w:r>
+      <w:proofErr w:type="spellEnd"/>
+      <w:r>
+        <w:t xml:space="preserve"> y a</w:t>
       </w:r>
       <w:r>
         <w:t>ccedemos a</w:t>
@@ -7670,20 +8069,43 @@
       <w:r>
         <w:t xml:space="preserve"> rol de </w:t>
       </w:r>
+      <w:proofErr w:type="spellStart"/>
       <w:r>
         <w:t>Administrator</w:t>
       </w:r>
+      <w:proofErr w:type="spellEnd"/>
       <w:r>
         <w:t xml:space="preserve">, en el apartado de </w:t>
       </w:r>
-      <w:r>
-        <w:t>Shut System Down</w:t>
+      <w:proofErr w:type="spellStart"/>
+      <w:r>
+        <w:t>Shut</w:t>
+      </w:r>
+      <w:proofErr w:type="spellEnd"/>
+      <w:r>
+        <w:t xml:space="preserve"> </w:t>
+      </w:r>
+      <w:proofErr w:type="spellStart"/>
+      <w:r>
+        <w:t>System</w:t>
+      </w:r>
+      <w:proofErr w:type="spellEnd"/>
+      <w:r>
+        <w:t xml:space="preserve"> Down</w:t>
       </w:r>
       <w:r>
         <w:t xml:space="preserve"> [11]</w:t>
       </w:r>
       <w:r>
-        <w:t xml:space="preserve">, para dejar de correr el launcher. </w:t>
+        <w:t xml:space="preserve">, para dejar de correr el </w:t>
+      </w:r>
+      <w:proofErr w:type="spellStart"/>
+      <w:r>
+        <w:t>launcher</w:t>
+      </w:r>
+      <w:proofErr w:type="spellEnd"/>
+      <w:r>
+        <w:t xml:space="preserve">. </w:t>
       </w:r>
     </w:p>
     <w:p/>
@@ -7748,7 +8170,28 @@
         <w:jc w:val="both"/>
       </w:pPr>
       <w:r>
-        <w:t>Para la generación del archivo .hack se ha verificado que, al modificar el identificador (id) del Flight Assignment que se intenta hackear, no sea posible crear, actualizar o publicar uno que corresponda a:</w:t>
+        <w:t xml:space="preserve">Para la generación del </w:t>
+      </w:r>
+      <w:proofErr w:type="gramStart"/>
+      <w:r>
+        <w:t>archivo .</w:t>
+      </w:r>
+      <w:proofErr w:type="spellStart"/>
+      <w:r>
+        <w:t>hack</w:t>
+      </w:r>
+      <w:proofErr w:type="spellEnd"/>
+      <w:proofErr w:type="gramEnd"/>
+      <w:r>
+        <w:t xml:space="preserve"> se ha verificado que, al modificar el identificador (id) del Flight </w:t>
+      </w:r>
+      <w:proofErr w:type="spellStart"/>
+      <w:r>
+        <w:t>Assignment</w:t>
+      </w:r>
+      <w:proofErr w:type="spellEnd"/>
+      <w:r>
+        <w:t xml:space="preserve"> que se intenta hackear, no sea posible crear, actualizar o publicar uno que corresponda a:</w:t>
       </w:r>
     </w:p>
     <w:p>
@@ -7766,7 +8209,23 @@
         <w:t xml:space="preserve">tros </w:t>
       </w:r>
       <w:r>
-        <w:t>Flight Crew Member.</w:t>
+        <w:t xml:space="preserve">Flight </w:t>
+      </w:r>
+      <w:proofErr w:type="spellStart"/>
+      <w:r>
+        <w:t>Crew</w:t>
+      </w:r>
+      <w:proofErr w:type="spellEnd"/>
+      <w:r>
+        <w:t xml:space="preserve"> </w:t>
+      </w:r>
+      <w:proofErr w:type="spellStart"/>
+      <w:r>
+        <w:t>Member</w:t>
+      </w:r>
+      <w:proofErr w:type="spellEnd"/>
+      <w:r>
+        <w:t>.</w:t>
       </w:r>
     </w:p>
     <w:p>
@@ -7792,8 +8251,13 @@
           <w:numId w:val="10"/>
         </w:numPr>
       </w:pPr>
-      <w:r>
-        <w:t xml:space="preserve">ID’s </w:t>
+      <w:proofErr w:type="spellStart"/>
+      <w:r>
+        <w:t>ID’s</w:t>
+      </w:r>
+      <w:proofErr w:type="spellEnd"/>
+      <w:r>
+        <w:t xml:space="preserve"> </w:t>
       </w:r>
       <w:r>
         <w:t>que no exista</w:t>
@@ -7820,7 +8284,23 @@
         <w:jc w:val="both"/>
       </w:pPr>
       <w:r>
-        <w:t>Respecto a los campos del formulario, se comprobó que en el campo Leg no sea posible crear, actualizar o publicar un Flight Assignment:</w:t>
+        <w:t xml:space="preserve">Respecto a los campos del formulario, se comprobó que en el campo </w:t>
+      </w:r>
+      <w:proofErr w:type="spellStart"/>
+      <w:r>
+        <w:t>Leg</w:t>
+      </w:r>
+      <w:proofErr w:type="spellEnd"/>
+      <w:r>
+        <w:t xml:space="preserve"> no sea posible crear, actualizar o publicar un Flight </w:t>
+      </w:r>
+      <w:proofErr w:type="spellStart"/>
+      <w:r>
+        <w:t>Assignment</w:t>
+      </w:r>
+      <w:proofErr w:type="spellEnd"/>
+      <w:r>
+        <w:t>:</w:t>
       </w:r>
     </w:p>
     <w:p>
@@ -7835,7 +8315,15 @@
         <w:t>C</w:t>
       </w:r>
       <w:r>
-        <w:t>on una Leg que pertenezca a otra aerolínea</w:t>
+        <w:t xml:space="preserve">on una </w:t>
+      </w:r>
+      <w:proofErr w:type="spellStart"/>
+      <w:r>
+        <w:t>Leg</w:t>
+      </w:r>
+      <w:proofErr w:type="spellEnd"/>
+      <w:r>
+        <w:t xml:space="preserve"> que pertenezca a otra aerolínea</w:t>
       </w:r>
       <w:r>
         <w:t>.</w:t>
@@ -7850,7 +8338,15 @@
         </w:numPr>
       </w:pPr>
       <w:r>
-        <w:t>Con una Leg que no exista.</w:t>
+        <w:t xml:space="preserve">Con una </w:t>
+      </w:r>
+      <w:proofErr w:type="spellStart"/>
+      <w:r>
+        <w:t>Leg</w:t>
+      </w:r>
+      <w:proofErr w:type="spellEnd"/>
+      <w:r>
+        <w:t xml:space="preserve"> que no exista.</w:t>
       </w:r>
       <w:r>
         <w:t xml:space="preserve"> </w:t>
@@ -7866,7 +8362,47 @@
         <w:jc w:val="both"/>
       </w:pPr>
       <w:r>
-        <w:t>Todos los intentos de hackeo descritos anteriormente resultarán en el mensaje de error Not Authorised [12], excepto aquellos que involucran la inserción de valores inválidos, los cuales generan mensajes de “Invalid Value” [13]. Por otro lado, los campos marcados como readOnly pueden ser modificados en el formulario, pero como no se procesan mediante el método bind, dichos cambios no se aplicarán cuando se publique, cree o actualice el registro</w:t>
+        <w:t xml:space="preserve">Todos los intentos de hackeo descritos anteriormente resultarán en el mensaje de error </w:t>
+      </w:r>
+      <w:proofErr w:type="spellStart"/>
+      <w:r>
+        <w:t>Not</w:t>
+      </w:r>
+      <w:proofErr w:type="spellEnd"/>
+      <w:r>
+        <w:t xml:space="preserve"> </w:t>
+      </w:r>
+      <w:proofErr w:type="spellStart"/>
+      <w:r>
+        <w:t>Authorised</w:t>
+      </w:r>
+      <w:proofErr w:type="spellEnd"/>
+      <w:r>
+        <w:t xml:space="preserve"> [12], excepto aquellos que involucran la inserción de valores inválidos, los cuales generan mensajes de “</w:t>
+      </w:r>
+      <w:proofErr w:type="spellStart"/>
+      <w:r>
+        <w:t>Invalid</w:t>
+      </w:r>
+      <w:proofErr w:type="spellEnd"/>
+      <w:r>
+        <w:t xml:space="preserve"> Value” [13]. Por otro lado, los campos marcados como </w:t>
+      </w:r>
+      <w:proofErr w:type="spellStart"/>
+      <w:r>
+        <w:t>readOnly</w:t>
+      </w:r>
+      <w:proofErr w:type="spellEnd"/>
+      <w:r>
+        <w:t xml:space="preserve"> pueden ser modificados en el formulario, pero como no se procesan mediante el método </w:t>
+      </w:r>
+      <w:proofErr w:type="spellStart"/>
+      <w:r>
+        <w:t>bind</w:t>
+      </w:r>
+      <w:proofErr w:type="spellEnd"/>
+      <w:r>
+        <w:t>, dichos cambios no se aplicarán cuando se publique, cree o actualice el registro</w:t>
       </w:r>
       <w:r>
         <w:t>.</w:t>
@@ -7881,7 +8417,7 @@
           <w:noProof/>
         </w:rPr>
         <w:drawing>
-          <wp:anchor distT="0" distB="0" distL="114300" distR="114300" simplePos="0" relativeHeight="251670528" behindDoc="0" locked="0" layoutInCell="1" allowOverlap="1" wp14:anchorId="507CD2CD" wp14:editId="0E9380D6">
+          <wp:anchor distT="0" distB="0" distL="114300" distR="114300" simplePos="0" relativeHeight="251670528" behindDoc="0" locked="0" layoutInCell="1" allowOverlap="1" wp14:anchorId="507CD2CD" wp14:editId="2AF953CC">
             <wp:simplePos x="0" y="0"/>
             <wp:positionH relativeFrom="margin">
               <wp:align>center</wp:align>
@@ -8052,25 +8588,51 @@
         <w:pStyle w:val="Ttulo3"/>
       </w:pPr>
       <w:bookmarkStart w:id="13" w:name="_LIST,_SHOW"/>
-      <w:bookmarkStart w:id="14" w:name="_Toc199173321"/>
+      <w:bookmarkStart w:id="14" w:name="_Toc199178418"/>
       <w:bookmarkEnd w:id="13"/>
       <w:r>
-        <w:t>LIST, SHOW</w:t>
+        <w:t xml:space="preserve">LIST, </w:t>
+      </w:r>
+      <w:proofErr w:type="gramStart"/>
+      <w:r>
+        <w:t>SHOW</w:t>
       </w:r>
       <w:bookmarkEnd w:id="14"/>
+      <w:proofErr w:type="gramEnd"/>
     </w:p>
     <w:p>
       <w:pPr>
         <w:jc w:val="both"/>
       </w:pPr>
       <w:r>
-        <w:t>Para la generación del archivo .saf</w:t>
-      </w:r>
-      <w:r>
-        <w:t>e, s</w:t>
-      </w:r>
-      <w:r>
-        <w:t>e ha verificado que todos los Flight Assignment se muestren correctamente en pantalla</w:t>
+        <w:t xml:space="preserve">Para la generación del </w:t>
+      </w:r>
+      <w:proofErr w:type="gramStart"/>
+      <w:r>
+        <w:t>archivo .</w:t>
+      </w:r>
+      <w:proofErr w:type="spellStart"/>
+      <w:r>
+        <w:t>saf</w:t>
+      </w:r>
+      <w:r>
+        <w:t>e</w:t>
+      </w:r>
+      <w:proofErr w:type="spellEnd"/>
+      <w:proofErr w:type="gramEnd"/>
+      <w:r>
+        <w:t>, s</w:t>
+      </w:r>
+      <w:r>
+        <w:t xml:space="preserve">e ha verificado que todos los Flight </w:t>
+      </w:r>
+      <w:proofErr w:type="spellStart"/>
+      <w:r>
+        <w:t>Assignment</w:t>
+      </w:r>
+      <w:proofErr w:type="spellEnd"/>
+      <w:r>
+        <w:t xml:space="preserve"> se muestren correctamente en pantalla</w:t>
       </w:r>
       <w:r>
         <w:t xml:space="preserve"> [14]</w:t>
@@ -8091,8 +8653,21 @@
         <w:t xml:space="preserve"> publicación</w:t>
       </w:r>
       <w:r>
-        <w:t>, borrado, o mostrar los Activity Log que existen dentro de ese Flight Assignment</w:t>
-      </w:r>
+        <w:t xml:space="preserve">, borrado, o mostrar los </w:t>
+      </w:r>
+      <w:proofErr w:type="spellStart"/>
+      <w:r>
+        <w:t>Activity</w:t>
+      </w:r>
+      <w:proofErr w:type="spellEnd"/>
+      <w:r>
+        <w:t xml:space="preserve"> Log que existen dentro de ese Flight </w:t>
+      </w:r>
+      <w:proofErr w:type="spellStart"/>
+      <w:r>
+        <w:t>Assignment</w:t>
+      </w:r>
+      <w:proofErr w:type="spellEnd"/>
       <w:r>
         <w:t>.</w:t>
       </w:r>
@@ -8205,31 +8780,78 @@
         <w:jc w:val="both"/>
       </w:pPr>
       <w:r>
-        <w:t>Para la generación del archivo .hack</w:t>
-      </w:r>
+        <w:t xml:space="preserve">Para la generación del </w:t>
+      </w:r>
+      <w:proofErr w:type="gramStart"/>
+      <w:r>
+        <w:t>archivo .</w:t>
+      </w:r>
+      <w:proofErr w:type="spellStart"/>
+      <w:r>
+        <w:t>hack</w:t>
+      </w:r>
+      <w:proofErr w:type="spellEnd"/>
+      <w:proofErr w:type="gramEnd"/>
       <w:r>
         <w:t xml:space="preserve"> s</w:t>
       </w:r>
       <w:r>
-        <w:t>e ha comprobado que otros roles, como Agent, Administrator o Anonymous,</w:t>
+        <w:t xml:space="preserve">e ha comprobado que otros roles, como </w:t>
+      </w:r>
+      <w:proofErr w:type="spellStart"/>
+      <w:r>
+        <w:t>Agent</w:t>
+      </w:r>
+      <w:proofErr w:type="spellEnd"/>
+      <w:r>
+        <w:t xml:space="preserve">, </w:t>
+      </w:r>
+      <w:proofErr w:type="spellStart"/>
+      <w:r>
+        <w:t>Administrator</w:t>
+      </w:r>
+      <w:proofErr w:type="spellEnd"/>
+      <w:r>
+        <w:t xml:space="preserve"> o Anonymous,</w:t>
       </w:r>
       <w:r>
         <w:t xml:space="preserve"> no</w:t>
       </w:r>
       <w:r>
-        <w:t xml:space="preserve"> puedan listar los Flight Assignment</w:t>
-      </w:r>
+        <w:t xml:space="preserve"> puedan listar los Flight </w:t>
+      </w:r>
+      <w:proofErr w:type="spellStart"/>
+      <w:r>
+        <w:t>Assignment</w:t>
+      </w:r>
+      <w:proofErr w:type="spellEnd"/>
       <w:r>
         <w:t xml:space="preserve"> [16]</w:t>
       </w:r>
       <w:r>
-        <w:t>. En cuanto a la acción de mostrar (show)</w:t>
+        <w:t>. En cuanto a la acción de mostrar (</w:t>
+      </w:r>
+      <w:proofErr w:type="gramStart"/>
+      <w:r>
+        <w:t>show</w:t>
+      </w:r>
+      <w:proofErr w:type="gramEnd"/>
+      <w:r>
+        <w:t>)</w:t>
       </w:r>
       <w:r>
         <w:t xml:space="preserve"> [17]</w:t>
       </w:r>
       <w:r>
-        <w:t>, se realizó una prueba similar, añadiendo que un miembro diferente no pueda visualizar el formulario de un Flight Assignment que pertenece a otro miembro.</w:t>
+        <w:t xml:space="preserve">, se realizó una prueba similar, añadiendo que un miembro diferente no pueda visualizar el formulario de un Flight </w:t>
+      </w:r>
+      <w:proofErr w:type="spellStart"/>
+      <w:r>
+        <w:t>Assignment</w:t>
+      </w:r>
+      <w:proofErr w:type="spellEnd"/>
+      <w:r>
+        <w:t xml:space="preserve"> que pertenece a otro miembro.</w:t>
       </w:r>
     </w:p>
     <w:p/>
@@ -8343,7 +8965,7 @@
         <w:pStyle w:val="Ttulo3"/>
       </w:pPr>
       <w:bookmarkStart w:id="15" w:name="_DELETE"/>
-      <w:bookmarkStart w:id="16" w:name="_Toc199173322"/>
+      <w:bookmarkStart w:id="16" w:name="_Toc199178419"/>
       <w:bookmarkEnd w:id="15"/>
       <w:r>
         <w:lastRenderedPageBreak/>
@@ -8364,14 +8986,53 @@
       <w:r>
         <w:t xml:space="preserve"> el </w:t>
       </w:r>
+      <w:proofErr w:type="gramStart"/>
       <w:r>
         <w:t xml:space="preserve">archivo </w:t>
       </w:r>
       <w:r>
-        <w:t>.safe</w:t>
-      </w:r>
-      <w:r>
-        <w:t>, se ha verificado que el usuario pueda eliminar correctamente el Flight Assignment que desee. Además, se comprobó que al sustituir en la URL la opción show por delete, se pueda ejecutar correctamente el método unbind, con el objetivo de aumentar los porcentajes de cobertura (coverage) en las pruebas.</w:t>
+        <w:t>.</w:t>
+      </w:r>
+      <w:proofErr w:type="spellStart"/>
+      <w:r>
+        <w:t>safe</w:t>
+      </w:r>
+      <w:proofErr w:type="spellEnd"/>
+      <w:proofErr w:type="gramEnd"/>
+      <w:r>
+        <w:t xml:space="preserve">, se ha verificado que el usuario pueda eliminar correctamente el Flight </w:t>
+      </w:r>
+      <w:proofErr w:type="spellStart"/>
+      <w:r>
+        <w:t>Assignment</w:t>
+      </w:r>
+      <w:proofErr w:type="spellEnd"/>
+      <w:r>
+        <w:t xml:space="preserve"> que desee. Además, se comprobó que al sustituir en la URL la opción </w:t>
+      </w:r>
+      <w:proofErr w:type="gramStart"/>
+      <w:r>
+        <w:t>show</w:t>
+      </w:r>
+      <w:proofErr w:type="gramEnd"/>
+      <w:r>
+        <w:t xml:space="preserve"> por delete, se pueda ejecutar correctamente el método </w:t>
+      </w:r>
+      <w:proofErr w:type="spellStart"/>
+      <w:r>
+        <w:t>unbind</w:t>
+      </w:r>
+      <w:proofErr w:type="spellEnd"/>
+      <w:r>
+        <w:t>, con el objetivo de aumentar los porcentajes de cobertura (</w:t>
+      </w:r>
+      <w:proofErr w:type="spellStart"/>
+      <w:r>
+        <w:t>coverage</w:t>
+      </w:r>
+      <w:proofErr w:type="spellEnd"/>
+      <w:r>
+        <w:t>) en las pruebas.</w:t>
       </w:r>
     </w:p>
     <w:p/>
@@ -8388,24 +9049,41 @@
       <w:r>
         <w:t xml:space="preserve">el </w:t>
       </w:r>
+      <w:proofErr w:type="gramStart"/>
       <w:r>
         <w:t xml:space="preserve">archivo </w:t>
       </w:r>
       <w:r>
-        <w:t>.hack</w:t>
-      </w:r>
+        <w:t>.</w:t>
+      </w:r>
+      <w:proofErr w:type="spellStart"/>
+      <w:r>
+        <w:t>hack</w:t>
+      </w:r>
+      <w:proofErr w:type="spellEnd"/>
+      <w:proofErr w:type="gramEnd"/>
       <w:r>
         <w:t>, s</w:t>
       </w:r>
       <w:r>
         <w:t xml:space="preserve">e ha comprobado que al igual que en create, </w:t>
       </w:r>
+      <w:proofErr w:type="spellStart"/>
       <w:r>
         <w:t>u</w:t>
       </w:r>
       <w:r>
-        <w:t>pdate y publish</w:t>
-      </w:r>
+        <w:t>pdate</w:t>
+      </w:r>
+      <w:proofErr w:type="spellEnd"/>
+      <w:r>
+        <w:t xml:space="preserve"> y </w:t>
+      </w:r>
+      <w:proofErr w:type="spellStart"/>
+      <w:r>
+        <w:t>publish</w:t>
+      </w:r>
+      <w:proofErr w:type="spellEnd"/>
       <w:r>
         <w:t>:</w:t>
       </w:r>
@@ -8422,7 +9100,15 @@
         <w:t>N</w:t>
       </w:r>
       <w:r>
-        <w:t>o se puede eliminar un Flight Assigment que esté publicado</w:t>
+        <w:t xml:space="preserve">o se puede eliminar un Flight </w:t>
+      </w:r>
+      <w:proofErr w:type="spellStart"/>
+      <w:r>
+        <w:t>Assigment</w:t>
+      </w:r>
+      <w:proofErr w:type="spellEnd"/>
+      <w:r>
+        <w:t xml:space="preserve"> que esté publicado</w:t>
       </w:r>
       <w:r>
         <w:t>.</w:t>
@@ -8440,8 +9126,13 @@
         <w:t>Q</w:t>
       </w:r>
       <w:r>
-        <w:t>ue sea de otro member</w:t>
-      </w:r>
+        <w:t xml:space="preserve">ue sea de otro </w:t>
+      </w:r>
+      <w:proofErr w:type="spellStart"/>
+      <w:r>
+        <w:t>member</w:t>
+      </w:r>
+      <w:proofErr w:type="spellEnd"/>
       <w:r>
         <w:t>.</w:t>
       </w:r>
@@ -8484,7 +9175,7 @@
       <w:pPr>
         <w:pStyle w:val="Ttulo2"/>
       </w:pPr>
-      <w:bookmarkStart w:id="17" w:name="_Toc199173323"/>
+      <w:bookmarkStart w:id="17" w:name="_Toc199178420"/>
       <w:r>
         <w:t>PRUEBAS DE ACTIVITY LOG</w:t>
       </w:r>
@@ -8494,7 +9185,7 @@
       <w:pPr>
         <w:pStyle w:val="Ttulo3"/>
       </w:pPr>
-      <w:bookmarkStart w:id="18" w:name="_Toc199173324"/>
+      <w:bookmarkStart w:id="18" w:name="_Toc199178421"/>
       <w:r>
         <w:t>CREATE, UPDATE Y PUBLISH</w:t>
       </w:r>
@@ -8502,25 +9193,86 @@
     </w:p>
     <w:p>
       <w:r>
-        <w:t xml:space="preserve">Para generar el archivo .safe, nos registramos con nuestro rol correspondiente, Flight Crew Member, y accedemos a los Activity Log </w:t>
+        <w:t xml:space="preserve">Para generar el </w:t>
+      </w:r>
+      <w:proofErr w:type="gramStart"/>
+      <w:r>
+        <w:t>archivo .</w:t>
+      </w:r>
+      <w:proofErr w:type="spellStart"/>
+      <w:r>
+        <w:t>safe</w:t>
+      </w:r>
+      <w:proofErr w:type="spellEnd"/>
+      <w:proofErr w:type="gramEnd"/>
+      <w:r>
+        <w:t xml:space="preserve">, nos registramos con nuestro rol correspondiente, Flight </w:t>
+      </w:r>
+      <w:proofErr w:type="spellStart"/>
+      <w:r>
+        <w:t>Crew</w:t>
+      </w:r>
+      <w:proofErr w:type="spellEnd"/>
+      <w:r>
+        <w:t xml:space="preserve"> </w:t>
+      </w:r>
+      <w:proofErr w:type="spellStart"/>
+      <w:r>
+        <w:t>Member</w:t>
+      </w:r>
+      <w:proofErr w:type="spellEnd"/>
+      <w:r>
+        <w:t xml:space="preserve">, y accedemos a los </w:t>
+      </w:r>
+      <w:proofErr w:type="spellStart"/>
+      <w:r>
+        <w:t>Activity</w:t>
+      </w:r>
+      <w:proofErr w:type="spellEnd"/>
+      <w:r>
+        <w:t xml:space="preserve"> Log </w:t>
       </w:r>
       <w:r>
         <w:t xml:space="preserve">[18] </w:t>
       </w:r>
       <w:r>
-        <w:t>desde Flight Assignment. A continuación, accedemos al formulario de Create [</w:t>
+        <w:t xml:space="preserve">desde Flight </w:t>
+      </w:r>
+      <w:proofErr w:type="spellStart"/>
+      <w:r>
+        <w:t>Assignment</w:t>
+      </w:r>
+      <w:proofErr w:type="spellEnd"/>
+      <w:r>
+        <w:t>. A continuación, accedemos al formulario de Create [</w:t>
       </w:r>
       <w:r>
         <w:t>19</w:t>
       </w:r>
       <w:r>
-        <w:t>], Update, Publish o Delete [</w:t>
+        <w:t xml:space="preserve">], Update, </w:t>
+      </w:r>
+      <w:proofErr w:type="spellStart"/>
+      <w:r>
+        <w:t>Publish</w:t>
+      </w:r>
+      <w:proofErr w:type="spellEnd"/>
+      <w:r>
+        <w:t xml:space="preserve"> o Delete [</w:t>
       </w:r>
       <w:r>
         <w:t>20</w:t>
       </w:r>
       <w:r>
-        <w:t>] de Flight Assignment.</w:t>
+        <w:t xml:space="preserve">] de Flight </w:t>
+      </w:r>
+      <w:proofErr w:type="spellStart"/>
+      <w:r>
+        <w:t>Assignment</w:t>
+      </w:r>
+      <w:proofErr w:type="spellEnd"/>
+      <w:r>
+        <w:t>.</w:t>
       </w:r>
     </w:p>
     <w:p>
@@ -8699,7 +9451,15 @@
         <w:jc w:val="both"/>
       </w:pPr>
       <w:r>
-        <w:t>Para comenzar entregaremos el formulario de Create, Update o Publish vacío, se ha seguido el mismo procedimiento para las tres. En este caso entregamos el formulario de Create [</w:t>
+        <w:t xml:space="preserve">Para comenzar entregaremos el formulario de Create, Update o </w:t>
+      </w:r>
+      <w:proofErr w:type="spellStart"/>
+      <w:r>
+        <w:t>Publish</w:t>
+      </w:r>
+      <w:proofErr w:type="spellEnd"/>
+      <w:r>
+        <w:t xml:space="preserve"> vacío, se ha seguido el mismo procedimiento para las tres. En este caso entregamos el formulario de Create [</w:t>
       </w:r>
       <w:r>
         <w:t>21</w:t>
@@ -8780,20 +9540,38 @@
       <w:r>
         <w:t xml:space="preserve">En concreto, para el formulario de creación (create) de </w:t>
       </w:r>
-      <w:r>
-        <w:t>Activity Log</w:t>
+      <w:proofErr w:type="spellStart"/>
+      <w:r>
+        <w:t>Activity</w:t>
+      </w:r>
+      <w:proofErr w:type="spellEnd"/>
+      <w:r>
+        <w:t xml:space="preserve"> Log</w:t>
       </w:r>
       <w:r>
         <w:t xml:space="preserve">, se rellenó un único atributo dejando el resto vacíos. Por ejemplo, se completó el primer campo, </w:t>
       </w:r>
       <w:r>
-        <w:t>Type of Incident</w:t>
-      </w:r>
+        <w:t xml:space="preserve">Type of </w:t>
+      </w:r>
+      <w:proofErr w:type="spellStart"/>
+      <w:r>
+        <w:t>Incident</w:t>
+      </w:r>
+      <w:proofErr w:type="spellEnd"/>
       <w:r>
         <w:t xml:space="preserve">, con el valor </w:t>
       </w:r>
       <w:r>
-        <w:t>base del texto de Sample-Data</w:t>
+        <w:t xml:space="preserve">base del texto de </w:t>
+      </w:r>
+      <w:proofErr w:type="spellStart"/>
+      <w:r>
+        <w:t>Sample</w:t>
+      </w:r>
+      <w:proofErr w:type="spellEnd"/>
+      <w:r>
+        <w:t>-Data</w:t>
       </w:r>
       <w:r>
         <w:t xml:space="preserve">, mientras que los demás campos quedaron sin rellenar. Al enviar el formulario con únicamente </w:t>
@@ -8813,7 +9591,15 @@
         <w:t xml:space="preserve">A continuación, se modificó el valor del campo </w:t>
       </w:r>
       <w:r>
-        <w:t xml:space="preserve">Type of Incident </w:t>
+        <w:t xml:space="preserve">Type of </w:t>
+      </w:r>
+      <w:proofErr w:type="spellStart"/>
+      <w:r>
+        <w:t>Incident</w:t>
+      </w:r>
+      <w:proofErr w:type="spellEnd"/>
+      <w:r>
+        <w:t xml:space="preserve"> </w:t>
       </w:r>
       <w:r>
         <w:t>a</w:t>
@@ -8827,13 +9613,77 @@
     </w:p>
     <w:p>
       <w:r>
-        <w:t>En el campo Severity Level se realiza el mismo procedimiento, introduciendo valores enteros negativos, nulos, demasiado grandres, etc.</w:t>
+        <w:t xml:space="preserve">En el campo </w:t>
+      </w:r>
+      <w:proofErr w:type="spellStart"/>
+      <w:r>
+        <w:t>Severity</w:t>
+      </w:r>
+      <w:proofErr w:type="spellEnd"/>
+      <w:r>
+        <w:t xml:space="preserve"> </w:t>
+      </w:r>
+      <w:proofErr w:type="spellStart"/>
+      <w:r>
+        <w:t>Level</w:t>
+      </w:r>
+      <w:proofErr w:type="spellEnd"/>
+      <w:r>
+        <w:t xml:space="preserve"> se realiza el mismo procedimiento, introduciendo valores enteros negativos, nulos, demasiado </w:t>
+      </w:r>
+      <w:proofErr w:type="spellStart"/>
+      <w:r>
+        <w:t>grandres</w:t>
+      </w:r>
+      <w:proofErr w:type="spellEnd"/>
+      <w:r>
+        <w:t>, etc.</w:t>
       </w:r>
     </w:p>
     <w:p/>
     <w:p>
       <w:r>
-        <w:t>También se ha seguido los requisitos especificados, como “Un Activity Log no puede ser publicado si no lo está su Flight Assignment”, para esto se ha eliminado el botón de publish de aquellos Activity Log que su Flight Assignment no esté publicado.</w:t>
+        <w:t xml:space="preserve">También se ha seguido los requisitos especificados, como “Un </w:t>
+      </w:r>
+      <w:proofErr w:type="spellStart"/>
+      <w:r>
+        <w:t>Activity</w:t>
+      </w:r>
+      <w:proofErr w:type="spellEnd"/>
+      <w:r>
+        <w:t xml:space="preserve"> Log no puede ser publicado si no lo está su Flight </w:t>
+      </w:r>
+      <w:proofErr w:type="spellStart"/>
+      <w:r>
+        <w:t>Assignment</w:t>
+      </w:r>
+      <w:proofErr w:type="spellEnd"/>
+      <w:r>
+        <w:t xml:space="preserve">”, para esto se ha eliminado el botón de </w:t>
+      </w:r>
+      <w:proofErr w:type="spellStart"/>
+      <w:r>
+        <w:t>publish</w:t>
+      </w:r>
+      <w:proofErr w:type="spellEnd"/>
+      <w:r>
+        <w:t xml:space="preserve"> de aquellos </w:t>
+      </w:r>
+      <w:proofErr w:type="spellStart"/>
+      <w:r>
+        <w:t>Activity</w:t>
+      </w:r>
+      <w:proofErr w:type="spellEnd"/>
+      <w:r>
+        <w:t xml:space="preserve"> Log que su Flight </w:t>
+      </w:r>
+      <w:proofErr w:type="spellStart"/>
+      <w:r>
+        <w:t>Assignment</w:t>
+      </w:r>
+      <w:proofErr w:type="spellEnd"/>
+      <w:r>
+        <w:t xml:space="preserve"> no esté publicado.</w:t>
       </w:r>
     </w:p>
     <w:p/>
@@ -8894,19 +9744,50 @@
         <w:jc w:val="both"/>
       </w:pPr>
       <w:r>
-        <w:t xml:space="preserve">Una vez se han comprobado todos los atributos del formulario, se crea uno con datos válidos y se envía. Nos deslogueamos y accedemos al rol de </w:t>
-      </w:r>
+        <w:t xml:space="preserve">Una vez se han comprobado todos los atributos del formulario, se crea uno con datos válidos y se envía. Nos </w:t>
+      </w:r>
+      <w:proofErr w:type="spellStart"/>
+      <w:r>
+        <w:t>deslogueamos</w:t>
+      </w:r>
+      <w:proofErr w:type="spellEnd"/>
+      <w:r>
+        <w:t xml:space="preserve"> y accedemos al rol de </w:t>
+      </w:r>
+      <w:proofErr w:type="spellStart"/>
       <w:r>
         <w:t>Administrator</w:t>
       </w:r>
+      <w:proofErr w:type="spellEnd"/>
       <w:r>
         <w:t xml:space="preserve">, en el apartado de </w:t>
       </w:r>
-      <w:r>
-        <w:t>Shut System Down</w:t>
-      </w:r>
-      <w:r>
-        <w:t xml:space="preserve"> [11], para dejar de correr el launcher. </w:t>
+      <w:proofErr w:type="spellStart"/>
+      <w:r>
+        <w:t>Shut</w:t>
+      </w:r>
+      <w:proofErr w:type="spellEnd"/>
+      <w:r>
+        <w:t xml:space="preserve"> </w:t>
+      </w:r>
+      <w:proofErr w:type="spellStart"/>
+      <w:r>
+        <w:t>System</w:t>
+      </w:r>
+      <w:proofErr w:type="spellEnd"/>
+      <w:r>
+        <w:t xml:space="preserve"> Down</w:t>
+      </w:r>
+      <w:r>
+        <w:t xml:space="preserve"> [11], para dejar de correr el </w:t>
+      </w:r>
+      <w:proofErr w:type="spellStart"/>
+      <w:r>
+        <w:t>launcher</w:t>
+      </w:r>
+      <w:proofErr w:type="spellEnd"/>
+      <w:r>
+        <w:t xml:space="preserve">. </w:t>
       </w:r>
     </w:p>
     <w:p/>
@@ -8915,10 +9796,28 @@
         <w:jc w:val="both"/>
       </w:pPr>
       <w:r>
-        <w:t xml:space="preserve">Para la generación del archivo .hack se ha verificado que, al modificar el identificador (id) del </w:t>
-      </w:r>
-      <w:r>
-        <w:t>Activity Log</w:t>
+        <w:t xml:space="preserve">Para la generación del </w:t>
+      </w:r>
+      <w:proofErr w:type="gramStart"/>
+      <w:r>
+        <w:t>archivo .</w:t>
+      </w:r>
+      <w:proofErr w:type="spellStart"/>
+      <w:r>
+        <w:t>hack</w:t>
+      </w:r>
+      <w:proofErr w:type="spellEnd"/>
+      <w:proofErr w:type="gramEnd"/>
+      <w:r>
+        <w:t xml:space="preserve"> se ha verificado que, al modificar el identificador (id) del </w:t>
+      </w:r>
+      <w:proofErr w:type="spellStart"/>
+      <w:r>
+        <w:t>Activity</w:t>
+      </w:r>
+      <w:proofErr w:type="spellEnd"/>
+      <w:r>
+        <w:t xml:space="preserve"> Log</w:t>
       </w:r>
       <w:r>
         <w:t xml:space="preserve"> que se intenta hackear, no sea posible crear, actualizar o publicar uno que corresponda a:</w:t>
@@ -8933,7 +9832,23 @@
         </w:numPr>
       </w:pPr>
       <w:r>
-        <w:t>Otros Flight Crew Member.</w:t>
+        <w:t xml:space="preserve">Otros Flight </w:t>
+      </w:r>
+      <w:proofErr w:type="spellStart"/>
+      <w:r>
+        <w:t>Crew</w:t>
+      </w:r>
+      <w:proofErr w:type="spellEnd"/>
+      <w:r>
+        <w:t xml:space="preserve"> </w:t>
+      </w:r>
+      <w:proofErr w:type="spellStart"/>
+      <w:r>
+        <w:t>Member</w:t>
+      </w:r>
+      <w:proofErr w:type="spellEnd"/>
+      <w:r>
+        <w:t>.</w:t>
       </w:r>
     </w:p>
     <w:p>
@@ -8956,8 +9871,13 @@
           <w:numId w:val="10"/>
         </w:numPr>
       </w:pPr>
-      <w:r>
-        <w:t>ID’s que no exista</w:t>
+      <w:proofErr w:type="spellStart"/>
+      <w:r>
+        <w:t>ID’s</w:t>
+      </w:r>
+      <w:proofErr w:type="spellEnd"/>
+      <w:r>
+        <w:t xml:space="preserve"> que no exista</w:t>
       </w:r>
     </w:p>
     <w:p>
@@ -8985,8 +9905,21 @@
       <w:r>
         <w:t xml:space="preserve">Respecto a los campos del formulario, se comprobó que en el campo </w:t>
       </w:r>
-      <w:r>
-        <w:t>Severity Level no se pudieran introducir valores negativos desde las herramientas del desarrollador.</w:t>
+      <w:proofErr w:type="spellStart"/>
+      <w:r>
+        <w:t>Severity</w:t>
+      </w:r>
+      <w:proofErr w:type="spellEnd"/>
+      <w:r>
+        <w:t xml:space="preserve"> </w:t>
+      </w:r>
+      <w:proofErr w:type="spellStart"/>
+      <w:r>
+        <w:t>Level</w:t>
+      </w:r>
+      <w:proofErr w:type="spellEnd"/>
+      <w:r>
+        <w:t xml:space="preserve"> no se pudieran introducir valores negativos desde las herramientas del desarrollador.</w:t>
       </w:r>
     </w:p>
     <w:p>
@@ -9003,7 +9936,7 @@
           <w:noProof/>
         </w:rPr>
         <w:drawing>
-          <wp:anchor distT="0" distB="0" distL="114300" distR="114300" simplePos="0" relativeHeight="251677696" behindDoc="0" locked="0" layoutInCell="1" allowOverlap="1" wp14:anchorId="3797D8CF" wp14:editId="45DB7139">
+          <wp:anchor distT="0" distB="0" distL="114300" distR="114300" simplePos="0" relativeHeight="251677696" behindDoc="0" locked="0" layoutInCell="1" allowOverlap="1" wp14:anchorId="3797D8CF" wp14:editId="70709B0E">
             <wp:simplePos x="0" y="0"/>
             <wp:positionH relativeFrom="margin">
               <wp:align>right</wp:align>
@@ -9059,13 +9992,53 @@
         </w:drawing>
       </w:r>
       <w:r>
-        <w:t>Todos los intentos de hackeo descritos anteriormente resultarán en el mensaje de error Not Authorised [12], excepto aquellos que involucran la inserción de valores inválidos, los cuales generan mensajes de “Invalid Value” [</w:t>
+        <w:t xml:space="preserve">Todos los intentos de hackeo descritos anteriormente resultarán en el mensaje de error </w:t>
+      </w:r>
+      <w:proofErr w:type="spellStart"/>
+      <w:r>
+        <w:t>Not</w:t>
+      </w:r>
+      <w:proofErr w:type="spellEnd"/>
+      <w:r>
+        <w:t xml:space="preserve"> </w:t>
+      </w:r>
+      <w:proofErr w:type="spellStart"/>
+      <w:r>
+        <w:t>Authorised</w:t>
+      </w:r>
+      <w:proofErr w:type="spellEnd"/>
+      <w:r>
+        <w:t xml:space="preserve"> [12], excepto aquellos que involucran la inserción de valores inválidos, los cuales generan mensajes de “</w:t>
+      </w:r>
+      <w:proofErr w:type="spellStart"/>
+      <w:r>
+        <w:t>Invalid</w:t>
+      </w:r>
+      <w:proofErr w:type="spellEnd"/>
+      <w:r>
+        <w:t xml:space="preserve"> Value” [</w:t>
       </w:r>
       <w:r>
         <w:t>22</w:t>
       </w:r>
       <w:r>
-        <w:t>]. Por otro lado, los campos marcados como readOnly pueden ser modificados en el formulario, pero como no se procesan mediante el método bind, dichos cambios no se aplicarán cuando se publique, cree o actualice el registro</w:t>
+        <w:t xml:space="preserve">]. Por otro lado, los campos marcados como </w:t>
+      </w:r>
+      <w:proofErr w:type="spellStart"/>
+      <w:r>
+        <w:t>readOnly</w:t>
+      </w:r>
+      <w:proofErr w:type="spellEnd"/>
+      <w:r>
+        <w:t xml:space="preserve"> pueden ser modificados en el formulario, pero como no se procesan mediante el método </w:t>
+      </w:r>
+      <w:proofErr w:type="spellStart"/>
+      <w:r>
+        <w:t>bind</w:t>
+      </w:r>
+      <w:proofErr w:type="spellEnd"/>
+      <w:r>
+        <w:t>, dichos cambios no se aplicarán cuando se publique, cree o actualice el registro</w:t>
       </w:r>
       <w:r>
         <w:t>.</w:t>
@@ -9089,28 +10062,51 @@
       <w:pPr>
         <w:pStyle w:val="Ttulo3"/>
       </w:pPr>
-      <w:bookmarkStart w:id="19" w:name="_Toc199173325"/>
+      <w:bookmarkStart w:id="19" w:name="_Toc199178422"/>
       <w:r>
         <w:lastRenderedPageBreak/>
-        <w:t>LIST, SHOW</w:t>
+        <w:t xml:space="preserve">LIST, </w:t>
+      </w:r>
+      <w:proofErr w:type="gramStart"/>
+      <w:r>
+        <w:t>SHOW</w:t>
       </w:r>
       <w:bookmarkEnd w:id="19"/>
+      <w:proofErr w:type="gramEnd"/>
     </w:p>
     <w:p>
       <w:pPr>
         <w:jc w:val="both"/>
       </w:pPr>
       <w:r>
-        <w:t>Para la generación del archivo .saf</w:t>
-      </w:r>
-      <w:r>
-        <w:t>e, s</w:t>
+        <w:t xml:space="preserve">Para la generación del </w:t>
+      </w:r>
+      <w:proofErr w:type="gramStart"/>
+      <w:r>
+        <w:t>archivo .</w:t>
+      </w:r>
+      <w:proofErr w:type="spellStart"/>
+      <w:r>
+        <w:t>saf</w:t>
+      </w:r>
+      <w:r>
+        <w:t>e</w:t>
+      </w:r>
+      <w:proofErr w:type="spellEnd"/>
+      <w:proofErr w:type="gramEnd"/>
+      <w:r>
+        <w:t>, s</w:t>
       </w:r>
       <w:r>
         <w:t xml:space="preserve">e ha verificado que todos los </w:t>
       </w:r>
-      <w:r>
-        <w:t>Activity Log</w:t>
+      <w:proofErr w:type="spellStart"/>
+      <w:r>
+        <w:t>Activity</w:t>
+      </w:r>
+      <w:proofErr w:type="spellEnd"/>
+      <w:r>
+        <w:t xml:space="preserve"> Log</w:t>
       </w:r>
       <w:r>
         <w:t xml:space="preserve"> se muestren correctamente en pantalla</w:t>
@@ -9143,13 +10139,39 @@
         <w:jc w:val="both"/>
       </w:pPr>
       <w:r>
-        <w:t>Para la generación del archivo .hack</w:t>
-      </w:r>
+        <w:t xml:space="preserve">Para la generación del </w:t>
+      </w:r>
+      <w:proofErr w:type="gramStart"/>
+      <w:r>
+        <w:t>archivo .</w:t>
+      </w:r>
+      <w:proofErr w:type="spellStart"/>
+      <w:r>
+        <w:t>hack</w:t>
+      </w:r>
+      <w:proofErr w:type="spellEnd"/>
+      <w:proofErr w:type="gramEnd"/>
       <w:r>
         <w:t xml:space="preserve"> s</w:t>
       </w:r>
       <w:r>
-        <w:t>e ha comprobado que otros roles, como Agent, Administrator o Anonymous,</w:t>
+        <w:t xml:space="preserve">e ha comprobado que otros roles, como </w:t>
+      </w:r>
+      <w:proofErr w:type="spellStart"/>
+      <w:r>
+        <w:t>Agent</w:t>
+      </w:r>
+      <w:proofErr w:type="spellEnd"/>
+      <w:r>
+        <w:t xml:space="preserve">, </w:t>
+      </w:r>
+      <w:proofErr w:type="spellStart"/>
+      <w:r>
+        <w:t>Administrator</w:t>
+      </w:r>
+      <w:proofErr w:type="spellEnd"/>
+      <w:r>
+        <w:t xml:space="preserve"> o Anonymous,</w:t>
       </w:r>
       <w:r>
         <w:t xml:space="preserve"> no</w:t>
@@ -9157,17 +10179,38 @@
       <w:r>
         <w:t xml:space="preserve"> puedan listar los </w:t>
       </w:r>
-      <w:r>
-        <w:t>Activity Log [23]</w:t>
-      </w:r>
-      <w:r>
-        <w:t>. En cuanto a la acción de mostrar (show)</w:t>
+      <w:proofErr w:type="spellStart"/>
+      <w:r>
+        <w:t>Activity</w:t>
+      </w:r>
+      <w:proofErr w:type="spellEnd"/>
+      <w:r>
+        <w:t xml:space="preserve"> Log [23]</w:t>
+      </w:r>
+      <w:r>
+        <w:t>. En cuanto a la acción de mostrar (</w:t>
+      </w:r>
+      <w:proofErr w:type="gramStart"/>
+      <w:r>
+        <w:t>show</w:t>
+      </w:r>
+      <w:proofErr w:type="gramEnd"/>
+      <w:r>
+        <w:t>)</w:t>
       </w:r>
       <w:r>
         <w:t xml:space="preserve"> [24]</w:t>
       </w:r>
       <w:r>
-        <w:t>, se realizó una prueba similar, añadiendo que un miembro diferente no pueda visualizar el formulario de un Flight Assignment que pertenece a otro miembro.</w:t>
+        <w:t xml:space="preserve">, se realizó una prueba similar, añadiendo que un miembro diferente no pueda visualizar el formulario de un Flight </w:t>
+      </w:r>
+      <w:proofErr w:type="spellStart"/>
+      <w:r>
+        <w:t>Assignment</w:t>
+      </w:r>
+      <w:proofErr w:type="spellEnd"/>
+      <w:r>
+        <w:t xml:space="preserve"> que pertenece a otro miembro.</w:t>
       </w:r>
     </w:p>
     <w:p/>
@@ -9283,7 +10326,7 @@
       <w:pPr>
         <w:pStyle w:val="Ttulo3"/>
       </w:pPr>
-      <w:bookmarkStart w:id="20" w:name="_Toc199173326"/>
+      <w:bookmarkStart w:id="20" w:name="_Toc199178423"/>
       <w:r>
         <w:t>DELETE</w:t>
       </w:r>
@@ -9294,13 +10337,55 @@
         <w:jc w:val="both"/>
       </w:pPr>
       <w:r>
-        <w:t xml:space="preserve">Para generar el archivo .safe, se ha verificado que el usuario pueda eliminar correctamente el </w:t>
-      </w:r>
-      <w:r>
-        <w:t>Activity Log</w:t>
-      </w:r>
-      <w:r>
-        <w:t xml:space="preserve"> que desee. Además, se comprobó que al sustituir en la URL la opción show por delete, se pueda ejecutar correctamente el método unbind, con el objetivo de aumentar los porcentajes de cobertura (coverage) en las pruebas.</w:t>
+        <w:t xml:space="preserve">Para generar el </w:t>
+      </w:r>
+      <w:proofErr w:type="gramStart"/>
+      <w:r>
+        <w:t>archivo .</w:t>
+      </w:r>
+      <w:proofErr w:type="spellStart"/>
+      <w:r>
+        <w:t>safe</w:t>
+      </w:r>
+      <w:proofErr w:type="spellEnd"/>
+      <w:proofErr w:type="gramEnd"/>
+      <w:r>
+        <w:t xml:space="preserve">, se ha verificado que el usuario pueda eliminar correctamente el </w:t>
+      </w:r>
+      <w:proofErr w:type="spellStart"/>
+      <w:r>
+        <w:t>Activity</w:t>
+      </w:r>
+      <w:proofErr w:type="spellEnd"/>
+      <w:r>
+        <w:t xml:space="preserve"> Log</w:t>
+      </w:r>
+      <w:r>
+        <w:t xml:space="preserve"> que desee. Además, se comprobó que al sustituir en la URL la opción </w:t>
+      </w:r>
+      <w:proofErr w:type="gramStart"/>
+      <w:r>
+        <w:t>show</w:t>
+      </w:r>
+      <w:proofErr w:type="gramEnd"/>
+      <w:r>
+        <w:t xml:space="preserve"> por delete, se pueda ejecutar correctamente el método </w:t>
+      </w:r>
+      <w:proofErr w:type="spellStart"/>
+      <w:r>
+        <w:t>unbind</w:t>
+      </w:r>
+      <w:proofErr w:type="spellEnd"/>
+      <w:r>
+        <w:t>, con el objetivo de aumentar los porcentajes de cobertura (</w:t>
+      </w:r>
+      <w:proofErr w:type="spellStart"/>
+      <w:r>
+        <w:t>coverage</w:t>
+      </w:r>
+      <w:proofErr w:type="spellEnd"/>
+      <w:r>
+        <w:t>) en las pruebas.</w:t>
       </w:r>
     </w:p>
     <w:p/>
@@ -9310,7 +10395,36 @@
       </w:pPr>
       <w:r>
         <w:lastRenderedPageBreak/>
-        <w:t>Para generar el archivo .hack, se ha comprobado que al igual que en create, update y publish:</w:t>
+        <w:t xml:space="preserve">Para generar el </w:t>
+      </w:r>
+      <w:proofErr w:type="gramStart"/>
+      <w:r>
+        <w:t>archivo .</w:t>
+      </w:r>
+      <w:proofErr w:type="spellStart"/>
+      <w:r>
+        <w:t>hack</w:t>
+      </w:r>
+      <w:proofErr w:type="spellEnd"/>
+      <w:proofErr w:type="gramEnd"/>
+      <w:r>
+        <w:t xml:space="preserve">, se ha comprobado que al igual que en create, </w:t>
+      </w:r>
+      <w:proofErr w:type="spellStart"/>
+      <w:r>
+        <w:t>update</w:t>
+      </w:r>
+      <w:proofErr w:type="spellEnd"/>
+      <w:r>
+        <w:t xml:space="preserve"> y </w:t>
+      </w:r>
+      <w:proofErr w:type="spellStart"/>
+      <w:r>
+        <w:t>publish</w:t>
+      </w:r>
+      <w:proofErr w:type="spellEnd"/>
+      <w:r>
+        <w:t>:</w:t>
       </w:r>
     </w:p>
     <w:p>
@@ -9322,7 +10436,15 @@
         </w:numPr>
       </w:pPr>
       <w:r>
-        <w:t>No se puede eliminar un Activity Log que esté publicado.</w:t>
+        <w:t xml:space="preserve">No se puede eliminar un </w:t>
+      </w:r>
+      <w:proofErr w:type="spellStart"/>
+      <w:r>
+        <w:t>Activity</w:t>
+      </w:r>
+      <w:proofErr w:type="spellEnd"/>
+      <w:r>
+        <w:t xml:space="preserve"> Log que esté publicado.</w:t>
       </w:r>
     </w:p>
     <w:p>
@@ -9334,7 +10456,15 @@
         </w:numPr>
       </w:pPr>
       <w:r>
-        <w:t>Que sea de otro member.</w:t>
+        <w:t xml:space="preserve">Que sea de otro </w:t>
+      </w:r>
+      <w:proofErr w:type="spellStart"/>
+      <w:r>
+        <w:t>member</w:t>
+      </w:r>
+      <w:proofErr w:type="spellEnd"/>
+      <w:r>
+        <w:t>.</w:t>
       </w:r>
     </w:p>
     <w:p>
@@ -9371,7 +10501,7 @@
         <w:pStyle w:val="Ttulo1"/>
       </w:pPr>
       <w:bookmarkStart w:id="21" w:name="_CHAPTER_ON_PERFORMANCE"/>
-      <w:bookmarkStart w:id="22" w:name="_Toc199173327"/>
+      <w:bookmarkStart w:id="22" w:name="_Toc199178424"/>
       <w:bookmarkEnd w:id="21"/>
       <w:r>
         <w:t>CAPÍTULO DE PRUEBAS DE RENDIMIENTO</w:t>
@@ -9382,7 +10512,7 @@
       <w:pPr>
         <w:pStyle w:val="Ttulo2"/>
       </w:pPr>
-      <w:bookmarkStart w:id="23" w:name="_Toc199173328"/>
+      <w:bookmarkStart w:id="23" w:name="_Toc199178425"/>
       <w:r>
         <w:t>GRÁFICOS DE RENDIMIENTO</w:t>
       </w:r>
@@ -9392,7 +10522,7 @@
       <w:pPr>
         <w:pStyle w:val="Ttulo3"/>
       </w:pPr>
-      <w:bookmarkStart w:id="24" w:name="_Toc199173329"/>
+      <w:bookmarkStart w:id="24" w:name="_Toc199178426"/>
       <w:r>
         <w:t>CON ÍNDICES</w:t>
       </w:r>
@@ -9464,7 +10594,7 @@
       <w:pPr>
         <w:pStyle w:val="Ttulo3"/>
       </w:pPr>
-      <w:bookmarkStart w:id="25" w:name="_Toc199173330"/>
+      <w:bookmarkStart w:id="25" w:name="_Toc199178427"/>
       <w:r>
         <w:lastRenderedPageBreak/>
         <w:t>SIN ÍNDICES</w:t>
@@ -9553,7 +10683,7 @@
       <w:pPr>
         <w:pStyle w:val="Ttulo3"/>
       </w:pPr>
-      <w:bookmarkStart w:id="26" w:name="_Toc199173331"/>
+      <w:bookmarkStart w:id="26" w:name="_Toc199178428"/>
       <w:r>
         <w:t>COMPARATIVAS DESDE OTRO ORDENADOR</w:t>
       </w:r>
@@ -9653,7 +10783,31 @@
         <w:t>lado,</w:t>
       </w:r>
       <w:r>
-        <w:t xml:space="preserve"> podemos observar que la petición más ineficiente es “list-completed”, ya que es donde hay más Flight Assignment y tiene que obtener más datos del csv.</w:t>
+        <w:t xml:space="preserve"> podemos observar que la petición más ineficiente es “</w:t>
+      </w:r>
+      <w:proofErr w:type="spellStart"/>
+      <w:r>
+        <w:t>list-completed</w:t>
+      </w:r>
+      <w:proofErr w:type="spellEnd"/>
+      <w:r>
+        <w:t xml:space="preserve">”, ya que es donde hay más Flight </w:t>
+      </w:r>
+      <w:proofErr w:type="spellStart"/>
+      <w:r>
+        <w:t>Assignment</w:t>
+      </w:r>
+      <w:proofErr w:type="spellEnd"/>
+      <w:r>
+        <w:t xml:space="preserve"> y tiene que obtener más datos del </w:t>
+      </w:r>
+      <w:proofErr w:type="spellStart"/>
+      <w:r>
+        <w:t>csv</w:t>
+      </w:r>
+      <w:proofErr w:type="spellEnd"/>
+      <w:r>
+        <w:t>.</w:t>
       </w:r>
       <w:r>
         <w:t xml:space="preserve"> Esta se ve resaltada en la comparativa de ordenadores [27].</w:t>
@@ -9664,7 +10818,7 @@
       <w:pPr>
         <w:pStyle w:val="Ttulo2"/>
       </w:pPr>
-      <w:bookmarkStart w:id="27" w:name="_Toc199173332"/>
+      <w:bookmarkStart w:id="27" w:name="_Toc199178429"/>
       <w:r>
         <w:t>INTERVALO DE CONFIANZA</w:t>
       </w:r>
@@ -9674,7 +10828,7 @@
       <w:pPr>
         <w:pStyle w:val="Ttulo3"/>
       </w:pPr>
-      <w:bookmarkStart w:id="28" w:name="_Toc199173333"/>
+      <w:bookmarkStart w:id="28" w:name="_Toc199178430"/>
       <w:r>
         <w:t>CON ÍNDICE</w:t>
       </w:r>
@@ -9734,7 +10888,7 @@
       <w:pPr>
         <w:pStyle w:val="Ttulo3"/>
       </w:pPr>
-      <w:bookmarkStart w:id="29" w:name="_Toc199173334"/>
+      <w:bookmarkStart w:id="29" w:name="_Toc199178431"/>
       <w:r>
         <w:t>SIN ÍNDICE</w:t>
       </w:r>
@@ -9796,7 +10950,7 @@
       <w:pPr>
         <w:pStyle w:val="Ttulo3"/>
       </w:pPr>
-      <w:bookmarkStart w:id="30" w:name="_Toc199173335"/>
+      <w:bookmarkStart w:id="30" w:name="_Toc199178432"/>
       <w:r>
         <w:lastRenderedPageBreak/>
         <w:t>DESDE OTRO ORDENADOR</w:t>
@@ -9873,7 +11027,15 @@
         <w:t xml:space="preserve">[29] </w:t>
       </w:r>
       <w:r>
-        <w:t xml:space="preserve">son prácticamente iguales, entre 7,10 y 8,45 ms aproximadamente, esto se debe a que como mencionamos antes, al no tener muchos datos los csv no se obtiene una gran diferencia de rendimiento. </w:t>
+        <w:t xml:space="preserve">son prácticamente iguales, entre 7,10 y 8,45 ms aproximadamente, esto se debe a que como mencionamos antes, al no tener muchos datos los </w:t>
+      </w:r>
+      <w:proofErr w:type="spellStart"/>
+      <w:r>
+        <w:t>csv</w:t>
+      </w:r>
+      <w:proofErr w:type="spellEnd"/>
+      <w:r>
+        <w:t xml:space="preserve"> no se obtiene una gran diferencia de rendimiento. </w:t>
       </w:r>
     </w:p>
     <w:p>
@@ -9904,7 +11066,7 @@
       <w:pPr>
         <w:pStyle w:val="Ttulo2"/>
       </w:pPr>
-      <w:bookmarkStart w:id="31" w:name="_Toc199173336"/>
+      <w:bookmarkStart w:id="31" w:name="_Toc199178433"/>
       <w:r>
         <w:t>CONTRASTE DE HIPÓTESIS</w:t>
       </w:r>
@@ -9914,7 +11076,7 @@
       <w:pPr>
         <w:pStyle w:val="Ttulo3"/>
       </w:pPr>
-      <w:bookmarkStart w:id="32" w:name="_Toc199173337"/>
+      <w:bookmarkStart w:id="32" w:name="_Toc199178434"/>
       <w:r>
         <w:t>SIN ÍNDICES Y CON ÍNDICES</w:t>
       </w:r>
@@ -10024,7 +11186,15 @@
         <w:jc w:val="both"/>
       </w:pPr>
       <w:r>
-        <w:t>El valor obtenido de p-value obtenido tras el z-analysis de Excel, se encuentra en la fila 11, en mi caso 0,7271</w:t>
+        <w:t>El valor obtenido de p-value obtenido tras el z-</w:t>
+      </w:r>
+      <w:proofErr w:type="spellStart"/>
+      <w:r>
+        <w:t>analysis</w:t>
+      </w:r>
+      <w:proofErr w:type="spellEnd"/>
+      <w:r>
+        <w:t xml:space="preserve"> de Excel, se encuentra en la fila 11, en mi caso 0,7271</w:t>
       </w:r>
       <w:r>
         <w:t xml:space="preserve"> [31]</w:t>
@@ -10046,7 +11216,7 @@
       <w:pPr>
         <w:pStyle w:val="Ttulo3"/>
       </w:pPr>
-      <w:bookmarkStart w:id="33" w:name="_Toc199173338"/>
+      <w:bookmarkStart w:id="33" w:name="_Toc199178435"/>
       <w:r>
         <w:lastRenderedPageBreak/>
         <w:t>COMPARATIVA DESDE OTRO ORDENADOR</w:t>
@@ -10214,6 +11384,35 @@
     </w:p>
     <w:p>
       <w:pPr>
+        <w:pStyle w:val="Ttulo1"/>
+      </w:pPr>
+      <w:bookmarkStart w:id="34" w:name="_Toc199178436"/>
+      <w:r>
+        <w:t>CONCLUSIÓN</w:t>
+      </w:r>
+      <w:bookmarkEnd w:id="34"/>
+    </w:p>
+    <w:p>
+      <w:pPr>
+        <w:rPr>
+          <w:u w:val="single"/>
+        </w:rPr>
+      </w:pPr>
+      <w:r>
+        <w:t xml:space="preserve">La realización exhaustiva del conjunto de pruebas ha sido fundamental para detectar errores </w:t>
+      </w:r>
+      <w:r>
+        <w:t xml:space="preserve">y vulnerabilidades, no contemplados inicialmente, </w:t>
+      </w:r>
+      <w:r>
+        <w:t xml:space="preserve">en la aplicación. Este análisis ha contribuido a mejorar tanto la funcionalidad como la seguridad del sistema. En cuanto al rendimiento, las diferencias tras la implementación de índices fueron prácticamente insignificantes, lo cual era esperado debido al pequeño tamaño del conjunto de datos utilizado en las pruebas. Sin embargo, al comparar con los resultados de otros miembros del equipo, se observó que el </w:t>
+      </w:r>
+      <w:r>
+        <w:t>rendimiento en las diferentes máquinas fue bastante notorio.</w:t>
+      </w:r>
+    </w:p>
+    <w:p>
+      <w:pPr>
         <w:rPr>
           <w:b/>
           <w:bCs/>
@@ -10284,64 +11483,14 @@
     </w:p>
     <w:p>
       <w:pPr>
-        <w:rPr>
-          <w:b/>
-          <w:bCs/>
-          <w:sz w:val="32"/>
-          <w:szCs w:val="32"/>
-        </w:rPr>
-      </w:pPr>
-    </w:p>
-    <w:p>
-      <w:pPr>
-        <w:rPr>
-          <w:b/>
-          <w:bCs/>
-          <w:sz w:val="32"/>
-          <w:szCs w:val="32"/>
-        </w:rPr>
-      </w:pPr>
-    </w:p>
-    <w:p>
-      <w:pPr>
-        <w:rPr>
-          <w:b/>
-          <w:bCs/>
-          <w:sz w:val="32"/>
-          <w:szCs w:val="32"/>
-        </w:rPr>
-      </w:pPr>
-    </w:p>
-    <w:p>
-      <w:pPr>
-        <w:rPr>
-          <w:b/>
-          <w:bCs/>
-          <w:sz w:val="32"/>
-          <w:szCs w:val="32"/>
-        </w:rPr>
-      </w:pPr>
-    </w:p>
-    <w:p>
-      <w:pPr>
-        <w:rPr>
-          <w:b/>
-          <w:bCs/>
-          <w:sz w:val="32"/>
-          <w:szCs w:val="32"/>
-        </w:rPr>
-      </w:pPr>
-    </w:p>
-    <w:p>
-      <w:pPr>
         <w:pStyle w:val="Ttulo1"/>
       </w:pPr>
-      <w:bookmarkStart w:id="34" w:name="_Toc199173339"/>
+      <w:bookmarkStart w:id="35" w:name="_Toc199178437"/>
       <w:r>
         <w:lastRenderedPageBreak/>
         <w:t>BIBLIOGRAFÍA</w:t>
       </w:r>
-      <w:bookmarkEnd w:id="34"/>
+      <w:bookmarkEnd w:id="35"/>
     </w:p>
     <w:p>
       <w:pPr>
@@ -12257,7 +13406,6 @@
   <w:style w:type="character" w:default="1" w:styleId="Fuentedeprrafopredeter">
     <w:name w:val="Default Paragraph Font"/>
     <w:uiPriority w:val="1"/>
-    <w:semiHidden/>
     <w:unhideWhenUsed/>
   </w:style>
   <w:style w:type="table" w:default="1" w:styleId="Tablanormal">

</xml_diff>